<commit_message>
Complete consent form with study team, approvals and contact details
Co-Authored-By: Claude Opus 5.5 <noreply@anthropic.com>
Claude-Session: https://claude.ai/code/session_018sdeELbBUk4Vkmb2tCyW4U
</commit_message>
<xml_diff>
--- a/heat_midwives_consent/Informed_Consent_Form_Blank_EN_AR.docx
+++ b/heat_midwives_consent/Informed_Consent_Form_Blank_EN_AR.docx
@@ -59,63 +59,7 @@
           <w:szCs w:val="19"/>
           <w:rtl w:val="false"/>
         </w:rPr>
-        <w:t xml:space="preserve">Information sheet version </w:t>
-      </w:r>
-      <w:r>
-        <w:rPr>
-          <w:rFonts w:ascii="Arial" w:cs="Arial" w:eastAsia="Arial" w:hAnsi="Arial"/>
-          <w:b w:val="false"/>
-          <w:bCs w:val="false"/>
-          <w:i/>
-          <w:iCs/>
-          <w:sz w:val="19"/>
-          <w:szCs w:val="19"/>
-          <w:highlight w:val="yellow"/>
-          <w:highlightCs w:val="yellow"/>
-          <w:rtl w:val="false"/>
-        </w:rPr>
-        <w:t xml:space="preserve">[x.x]</w:t>
-      </w:r>
-      <w:r>
-        <w:rPr>
-          <w:rFonts w:ascii="Arial" w:cs="Arial" w:eastAsia="Arial" w:hAnsi="Arial"/>
-          <w:b w:val="false"/>
-          <w:bCs w:val="false"/>
-          <w:i/>
-          <w:iCs/>
-          <w:sz w:val="19"/>
-          <w:szCs w:val="19"/>
-          <w:rtl w:val="false"/>
-        </w:rPr>
-        <w:t xml:space="preserve">, dated </w:t>
-      </w:r>
-      <w:r>
-        <w:rPr>
-          <w:rFonts w:ascii="Arial" w:cs="Arial" w:eastAsia="Arial" w:hAnsi="Arial"/>
-          <w:b w:val="false"/>
-          <w:bCs w:val="false"/>
-          <w:i/>
-          <w:iCs/>
-          <w:sz w:val="19"/>
-          <w:szCs w:val="19"/>
-          <w:highlight w:val="yellow"/>
-          <w:highlightCs w:val="yellow"/>
-          <w:rtl w:val="false"/>
-        </w:rPr>
-        <w:t xml:space="preserve">[dd/mm/2025]</w:t>
-      </w:r>
-      <w:r>
-        <w:rPr>
-          <w:rFonts w:ascii="Arial" w:cs="Arial" w:eastAsia="Arial" w:hAnsi="Arial"/>
-          <w:b w:val="false"/>
-          <w:bCs w:val="false"/>
-          <w:i/>
-          <w:iCs/>
-          <w:sz w:val="19"/>
-          <w:szCs w:val="19"/>
-          <w:rtl w:val="false"/>
-        </w:rPr>
-        <w:t xml:space="preserve">   |   Language: English (an Arabic version is provided)</w:t>
+        <w:t xml:space="preserve">Language: English (an Arabic version is provided)</w:t>
       </w:r>
     </w:p>
     <w:p>
@@ -232,11 +176,9 @@
                 <w:iCs w:val="false"/>
                 <w:sz w:val="20"/>
                 <w:szCs w:val="20"/>
-                <w:highlight w:val="yellow"/>
-                <w:highlightCs w:val="yellow"/>
                 <w:rtl w:val="false"/>
               </w:rPr>
-              <w:t xml:space="preserve">[Name, title, department, institution]</w:t>
+              <w:t xml:space="preserve">Athar Odah Alshammari, Department of Maternity and Child Health, Nursing College, University of Hail, Hail, Saudi Arabia</w:t>
             </w:r>
           </w:p>
           <w:p>
@@ -256,50 +198,7 @@
                 <w:szCs w:val="20"/>
                 <w:rtl w:val="false"/>
               </w:rPr>
-              <w:t xml:space="preserve">Tel: </w:t>
-            </w:r>
-            <w:r>
-              <w:rPr>
-                <w:rFonts w:ascii="Arial" w:cs="Arial" w:eastAsia="Arial" w:hAnsi="Arial"/>
-                <w:b w:val="false"/>
-                <w:bCs w:val="false"/>
-                <w:i w:val="false"/>
-                <w:iCs w:val="false"/>
-                <w:sz w:val="20"/>
-                <w:szCs w:val="20"/>
-                <w:highlight w:val="yellow"/>
-                <w:highlightCs w:val="yellow"/>
-                <w:rtl w:val="false"/>
-              </w:rPr>
-              <w:t xml:space="preserve">[number]</w:t>
-            </w:r>
-            <w:r>
-              <w:rPr>
-                <w:rFonts w:ascii="Arial" w:cs="Arial" w:eastAsia="Arial" w:hAnsi="Arial"/>
-                <w:b w:val="false"/>
-                <w:bCs w:val="false"/>
-                <w:i w:val="false"/>
-                <w:iCs w:val="false"/>
-                <w:sz w:val="20"/>
-                <w:szCs w:val="20"/>
-                <w:rtl w:val="false"/>
-              </w:rPr>
-              <w:t xml:space="preserve">   Email: </w:t>
-            </w:r>
-            <w:r>
-              <w:rPr>
-                <w:rFonts w:ascii="Arial" w:cs="Arial" w:eastAsia="Arial" w:hAnsi="Arial"/>
-                <w:b w:val="false"/>
-                <w:bCs w:val="false"/>
-                <w:i w:val="false"/>
-                <w:iCs w:val="false"/>
-                <w:sz w:val="20"/>
-                <w:szCs w:val="20"/>
-                <w:highlight w:val="yellow"/>
-                <w:highlightCs w:val="yellow"/>
-                <w:rtl w:val="false"/>
-              </w:rPr>
-              <w:t xml:space="preserve">[email]</w:t>
+              <w:t xml:space="preserve">Email: athar.alshammari@uoh.edu.sa</w:t>
             </w:r>
           </w:p>
         </w:tc>
@@ -379,7 +278,7 @@
                 <w:szCs w:val="20"/>
                 <w:rtl w:val="false"/>
               </w:rPr>
-              <w:t xml:space="preserve">Dr. Nada Alqarawi, College of Nursing, Qassim University. Email: n.alqarawi@qu.edu.sa</w:t>
+              <w:t xml:space="preserve">Nada Alqarawi, College of Community, Psychiatric and Mental Health Nursing, Qassim University, Buraydah, Saudi Arabia. Email: n.alqarawi@qu.edu.sa</w:t>
             </w:r>
           </w:p>
         </w:tc>
@@ -422,6 +321,86 @@
                 <w:szCs w:val="20"/>
                 <w:rtl w:val="false"/>
               </w:rPr>
+              <w:t xml:space="preserve">Co-investigators</w:t>
+            </w:r>
+          </w:p>
+        </w:tc>
+        <w:tc>
+          <w:tcPr>
+            <w:tcW w:type="dxa" w:w="7038"/>
+            <w:tcBorders>
+              <w:top w:val="single" w:color="808080" w:sz="4"/>
+              <w:left w:val="single" w:color="808080" w:sz="4"/>
+              <w:bottom w:val="single" w:color="808080" w:sz="4"/>
+              <w:right w:val="single" w:color="808080" w:sz="4"/>
+            </w:tcBorders>
+            <w:tcMar>
+              <w:top w:type="dxa" w:w="30"/>
+              <w:left w:type="dxa" w:w="100"/>
+              <w:bottom w:type="dxa" w:w="30"/>
+              <w:right w:type="dxa" w:w="100"/>
+            </w:tcMar>
+          </w:tcPr>
+          <w:p>
+            <w:pPr>
+              <w:bidi w:val="false"/>
+              <w:spacing w:after="40" w:before="0" w:line="276"/>
+              <w:jc w:val="left"/>
+            </w:pPr>
+            <w:r>
+              <w:rPr>
+                <w:rFonts w:ascii="Arial" w:cs="Arial" w:eastAsia="Arial" w:hAnsi="Arial"/>
+                <w:b w:val="false"/>
+                <w:bCs w:val="false"/>
+                <w:i w:val="false"/>
+                <w:iCs w:val="false"/>
+                <w:sz w:val="20"/>
+                <w:szCs w:val="20"/>
+                <w:rtl w:val="false"/>
+              </w:rPr>
+              <w:t xml:space="preserve">Afrah Madyan Alshammari, Mutairah Alamlah Alshammari and Manar Fayez Al-ruwaili (College of Nursing, Jouf University); Areej Abunar (Faculty of Nursing, King Abdulaziz University); Osama Mohamed Elsayed Ramadan (Faculty of Nursing, Cairo University); Heba Tallah Elashmawy Mohamed Shaban (College of Nursing, Majmaah University)</w:t>
+            </w:r>
+          </w:p>
+        </w:tc>
+      </w:tr>
+      <w:tr>
+        <w:trPr>
+          <w:cantSplit/>
+          <w:tblHeader w:val="false"/>
+        </w:trPr>
+        <w:tc>
+          <w:tcPr>
+            <w:tcW w:type="dxa" w:w="2600"/>
+            <w:tcBorders>
+              <w:top w:val="single" w:color="808080" w:sz="4"/>
+              <w:left w:val="single" w:color="808080" w:sz="4"/>
+              <w:bottom w:val="single" w:color="808080" w:sz="4"/>
+              <w:right w:val="single" w:color="808080" w:sz="4"/>
+            </w:tcBorders>
+            <w:tcMar>
+              <w:top w:type="dxa" w:w="30"/>
+              <w:left w:type="dxa" w:w="100"/>
+              <w:bottom w:type="dxa" w:w="30"/>
+              <w:right w:type="dxa" w:w="100"/>
+            </w:tcMar>
+          </w:tcPr>
+          <w:p>
+            <w:pPr>
+              <w:bidi w:val="false"/>
+              <w:spacing w:after="40" w:before="0" w:line="276"/>
+              <w:jc w:val="left"/>
+            </w:pPr>
+            <w:r>
+              <w:rPr>
+                <w:rFonts w:ascii="Arial" w:cs="Arial" w:eastAsia="Arial" w:hAnsi="Arial"/>
+                <w:b w:val="false"/>
+                <w:bCs w:val="false"/>
+                <w:i w:val="false"/>
+                <w:iCs w:val="false"/>
+                <w:sz w:val="20"/>
+                <w:szCs w:val="20"/>
+                <w:rtl w:val="false"/>
+              </w:rPr>
               <w:t xml:space="preserve">Interviewer</w:t>
             </w:r>
           </w:p>
@@ -457,24 +436,9 @@
                 <w:iCs w:val="false"/>
                 <w:sz w:val="20"/>
                 <w:szCs w:val="20"/>
-                <w:highlight w:val="yellow"/>
-                <w:highlightCs w:val="yellow"/>
                 <w:rtl w:val="false"/>
               </w:rPr>
-              <w:t xml:space="preserve">[Name]</w:t>
-            </w:r>
-            <w:r>
-              <w:rPr>
-                <w:rFonts w:ascii="Arial" w:cs="Arial" w:eastAsia="Arial" w:hAnsi="Arial"/>
-                <w:b w:val="false"/>
-                <w:bCs w:val="false"/>
-                <w:i w:val="false"/>
-                <w:iCs w:val="false"/>
-                <w:sz w:val="20"/>
-                <w:szCs w:val="20"/>
-                <w:rtl w:val="false"/>
-              </w:rPr>
-              <w:t xml:space="preserve">, PhD-prepared academic nurse trained in qualitative interviewing. She does not work in your team and has no supervisory or evaluative role over you.</w:t>
+              <w:t xml:space="preserve">A female member of the research team: a PhD-prepared academic nurse trained in qualitative interviewing. She does not work in your team and has no supervisory or evaluative role over you.</w:t>
             </w:r>
           </w:p>
         </w:tc>
@@ -778,11 +742,9 @@
                 <w:iCs w:val="false"/>
                 <w:sz w:val="20"/>
                 <w:szCs w:val="20"/>
-                <w:highlight w:val="yellow"/>
-                <w:highlightCs w:val="yellow"/>
                 <w:rtl w:val="false"/>
               </w:rPr>
-              <w:t xml:space="preserve">[April 2025: insert exact date]</w:t>
+              <w:t xml:space="preserve">April 2025</w:t>
             </w:r>
           </w:p>
         </w:tc>
@@ -1281,35 +1243,7 @@
           <w:szCs w:val="21"/>
           <w:rtl w:val="false"/>
         </w:rPr>
-        <w:t xml:space="preserve">No. Taking part is entirely voluntary and is not related to your employment, appraisal, contract or licensing. Your managers will not nominate you and will not be told whether you took part. You may decline to answer any question, pause or stop the interview at any time, and withdraw from the study without giving a reason and without any penalty. If you withdraw, your recording and transcript will be destroyed. Data already de-identified and combined in the analysis by </w:t>
-      </w:r>
-      <w:r>
-        <w:rPr>
-          <w:rFonts w:ascii="Arial" w:cs="Arial" w:eastAsia="Arial" w:hAnsi="Arial"/>
-          <w:b w:val="false"/>
-          <w:bCs w:val="false"/>
-          <w:i w:val="false"/>
-          <w:iCs w:val="false"/>
-          <w:sz w:val="21"/>
-          <w:szCs w:val="21"/>
-          <w:highlight w:val="yellow"/>
-          <w:highlightCs w:val="yellow"/>
-          <w:rtl w:val="false"/>
-        </w:rPr>
-        <w:t xml:space="preserve">[insert point, e.g. two weeks after your interview]</w:t>
-      </w:r>
-      <w:r>
-        <w:rPr>
-          <w:rFonts w:ascii="Arial" w:cs="Arial" w:eastAsia="Arial" w:hAnsi="Arial"/>
-          <w:b w:val="false"/>
-          <w:bCs w:val="false"/>
-          <w:i w:val="false"/>
-          <w:iCs w:val="false"/>
-          <w:sz w:val="21"/>
-          <w:szCs w:val="21"/>
-          <w:rtl w:val="false"/>
-        </w:rPr>
-        <w:t xml:space="preserve"> may not be removable.</w:t>
+        <w:t xml:space="preserve">No. Taking part is entirely voluntary and is not related to your employment, appraisal, contract or licensing. Your managers will not nominate you and will not be told whether you took part. You may decline to answer any question, pause or stop the interview at any time, and withdraw from the study without giving a reason and without any penalty. If you withdraw, your recording and transcript will be destroyed. Once your data have been de-identified and combined with other participants’ data in the analysis, it may no longer be possible to remove them.</w:t>
       </w:r>
     </w:p>
     <w:p>
@@ -1587,22 +1521,7 @@
           <w:szCs w:val="21"/>
           <w:rtl w:val="false"/>
         </w:rPr>
-        <w:t xml:space="preserve">Risks are expected to be minimal. The interview will take some of your time. Talking about clinical decisions or working conditions may feel uncomfortable or raise concerns about how your practice may be viewed; you may skip any question or stop at any time. Because the number of participants is small, there is a small risk that someone could recognize you from contextual details. The steps described in Section 8 are designed to reduce this risk. </w:t>
-      </w:r>
-      <w:r>
-        <w:rPr>
-          <w:rFonts w:ascii="Arial" w:cs="Arial" w:eastAsia="Arial" w:hAnsi="Arial"/>
-          <w:b w:val="false"/>
-          <w:bCs w:val="false"/>
-          <w:i w:val="false"/>
-          <w:iCs w:val="false"/>
-          <w:sz w:val="21"/>
-          <w:szCs w:val="21"/>
-          <w:highlight w:val="yellow"/>
-          <w:highlightCs w:val="yellow"/>
-          <w:rtl w:val="false"/>
-        </w:rPr>
-        <w:t xml:space="preserve">[Insert any limits to confidentiality required by the approving committees, e.g. disclosure of an immediate risk to patient safety.]</w:t>
+        <w:t xml:space="preserve">Risks are expected to be minimal. The interview will take some of your time. Talking about clinical decisions or working conditions may feel uncomfortable or raise concerns about how your practice may be viewed; you may skip any question or stop at any time. Because the number of participants is small, there is a small risk that someone could recognize you from contextual details. The steps described in Section 8 are designed to reduce this risk.</w:t>
       </w:r>
     </w:p>
     <w:p>
@@ -1839,63 +1758,7 @@
           <w:szCs w:val="21"/>
           <w:rtl w:val="false"/>
         </w:rPr>
-        <w:t xml:space="preserve">Data will be kept for </w:t>
-      </w:r>
-      <w:r>
-        <w:rPr>
-          <w:rFonts w:ascii="Arial" w:cs="Arial" w:eastAsia="Arial" w:hAnsi="Arial"/>
-          <w:b w:val="false"/>
-          <w:bCs w:val="false"/>
-          <w:i w:val="false"/>
-          <w:iCs w:val="false"/>
-          <w:sz w:val="21"/>
-          <w:szCs w:val="21"/>
-          <w:highlight w:val="yellow"/>
-          <w:highlightCs w:val="yellow"/>
-          <w:rtl w:val="false"/>
-        </w:rPr>
-        <w:t xml:space="preserve">[x]</w:t>
-      </w:r>
-      <w:r>
-        <w:rPr>
-          <w:rFonts w:ascii="Arial" w:cs="Arial" w:eastAsia="Arial" w:hAnsi="Arial"/>
-          <w:b w:val="false"/>
-          <w:bCs w:val="false"/>
-          <w:i w:val="false"/>
-          <w:iCs w:val="false"/>
-          <w:sz w:val="21"/>
-          <w:szCs w:val="21"/>
-          <w:rtl w:val="false"/>
-        </w:rPr>
-        <w:t xml:space="preserve"> years after the study ends and then securely destroyed in line with </w:t>
-      </w:r>
-      <w:r>
-        <w:rPr>
-          <w:rFonts w:ascii="Arial" w:cs="Arial" w:eastAsia="Arial" w:hAnsi="Arial"/>
-          <w:b w:val="false"/>
-          <w:bCs w:val="false"/>
-          <w:i w:val="false"/>
-          <w:iCs w:val="false"/>
-          <w:sz w:val="21"/>
-          <w:szCs w:val="21"/>
-          <w:highlight w:val="yellow"/>
-          <w:highlightCs w:val="yellow"/>
-          <w:rtl w:val="false"/>
-        </w:rPr>
-        <w:t xml:space="preserve">[institution]</w:t>
-      </w:r>
-      <w:r>
-        <w:rPr>
-          <w:rFonts w:ascii="Arial" w:cs="Arial" w:eastAsia="Arial" w:hAnsi="Arial"/>
-          <w:b w:val="false"/>
-          <w:bCs w:val="false"/>
-          <w:i w:val="false"/>
-          <w:iCs w:val="false"/>
-          <w:sz w:val="21"/>
-          <w:szCs w:val="21"/>
-          <w:rtl w:val="false"/>
-        </w:rPr>
-        <w:t xml:space="preserve"> policy.</w:t>
+        <w:t xml:space="preserve">Data will be kept securely for the period required by the approving ethics committees and institutional policy, and then securely destroyed.</w:t>
       </w:r>
     </w:p>
     <w:p>
@@ -1977,23 +1840,15 @@
           <w:szCs w:val="21"/>
           <w:rtl w:val="false"/>
         </w:rPr>
-        <w:t xml:space="preserve">For questions about the study: </w:t>
-      </w:r>
-      <w:r>
-        <w:rPr>
-          <w:rFonts w:ascii="Arial" w:cs="Arial" w:eastAsia="Arial" w:hAnsi="Arial"/>
-          <w:b w:val="false"/>
-          <w:bCs w:val="false"/>
-          <w:i w:val="false"/>
-          <w:iCs w:val="false"/>
-          <w:sz w:val="21"/>
-          <w:szCs w:val="21"/>
-          <w:highlight w:val="yellow"/>
-          <w:highlightCs w:val="yellow"/>
-          <w:rtl w:val="false"/>
-        </w:rPr>
-        <w:t xml:space="preserve">[Principal investigator name]</w:t>
-      </w:r>
+        <w:t xml:space="preserve">For questions about the study: Athar Odah Alshammari (principal investigator), Email: athar.alshammari@uoh.edu.sa; or Nada Alqarawi (corresponding researcher), Email: n.alqarawi@qu.edu.sa.</w:t>
+      </w:r>
+    </w:p>
+    <w:p>
+      <w:pPr>
+        <w:bidi w:val="false"/>
+        <w:spacing w:after="100" w:before="0" w:line="276"/>
+        <w:jc w:val="both"/>
+      </w:pPr>
       <w:r>
         <w:rPr>
           <w:rFonts w:ascii="Arial" w:cs="Arial" w:eastAsia="Arial" w:hAnsi="Arial"/>
@@ -2005,167 +1860,7 @@
           <w:szCs w:val="21"/>
           <w:rtl w:val="false"/>
         </w:rPr>
-        <w:t xml:space="preserve">, Tel: </w:t>
-      </w:r>
-      <w:r>
-        <w:rPr>
-          <w:rFonts w:ascii="Arial" w:cs="Arial" w:eastAsia="Arial" w:hAnsi="Arial"/>
-          <w:b w:val="false"/>
-          <w:bCs w:val="false"/>
-          <w:i w:val="false"/>
-          <w:iCs w:val="false"/>
-          <w:sz w:val="21"/>
-          <w:szCs w:val="21"/>
-          <w:highlight w:val="yellow"/>
-          <w:highlightCs w:val="yellow"/>
-          <w:rtl w:val="false"/>
-        </w:rPr>
-        <w:t xml:space="preserve">[number]</w:t>
-      </w:r>
-      <w:r>
-        <w:rPr>
-          <w:rFonts w:ascii="Arial" w:cs="Arial" w:eastAsia="Arial" w:hAnsi="Arial"/>
-          <w:b w:val="false"/>
-          <w:bCs w:val="false"/>
-          <w:i w:val="false"/>
-          <w:iCs w:val="false"/>
-          <w:sz w:val="21"/>
-          <w:szCs w:val="21"/>
-          <w:rtl w:val="false"/>
-        </w:rPr>
-        <w:t xml:space="preserve">, Email: </w:t>
-      </w:r>
-      <w:r>
-        <w:rPr>
-          <w:rFonts w:ascii="Arial" w:cs="Arial" w:eastAsia="Arial" w:hAnsi="Arial"/>
-          <w:b w:val="false"/>
-          <w:bCs w:val="false"/>
-          <w:i w:val="false"/>
-          <w:iCs w:val="false"/>
-          <w:sz w:val="21"/>
-          <w:szCs w:val="21"/>
-          <w:highlight w:val="yellow"/>
-          <w:highlightCs w:val="yellow"/>
-          <w:rtl w:val="false"/>
-        </w:rPr>
-        <w:t xml:space="preserve">[email]</w:t>
-      </w:r>
-      <w:r>
-        <w:rPr>
-          <w:rFonts w:ascii="Arial" w:cs="Arial" w:eastAsia="Arial" w:hAnsi="Arial"/>
-          <w:b w:val="false"/>
-          <w:bCs w:val="false"/>
-          <w:i w:val="false"/>
-          <w:iCs w:val="false"/>
-          <w:sz w:val="21"/>
-          <w:szCs w:val="21"/>
-          <w:rtl w:val="false"/>
-        </w:rPr>
-        <w:t xml:space="preserve">.</w:t>
-      </w:r>
-    </w:p>
-    <w:p>
-      <w:pPr>
-        <w:bidi w:val="false"/>
-        <w:spacing w:after="100" w:before="0" w:line="276"/>
-        <w:jc w:val="both"/>
-      </w:pPr>
-      <w:r>
-        <w:rPr>
-          <w:rFonts w:ascii="Arial" w:cs="Arial" w:eastAsia="Arial" w:hAnsi="Arial"/>
-          <w:b w:val="false"/>
-          <w:bCs w:val="false"/>
-          <w:i w:val="false"/>
-          <w:iCs w:val="false"/>
-          <w:sz w:val="21"/>
-          <w:szCs w:val="21"/>
-          <w:rtl w:val="false"/>
-        </w:rPr>
-        <w:t xml:space="preserve">For questions about your rights as a participant, or to raise a concern: </w:t>
-      </w:r>
-      <w:r>
-        <w:rPr>
-          <w:rFonts w:ascii="Arial" w:cs="Arial" w:eastAsia="Arial" w:hAnsi="Arial"/>
-          <w:b w:val="false"/>
-          <w:bCs w:val="false"/>
-          <w:i w:val="false"/>
-          <w:iCs w:val="false"/>
-          <w:sz w:val="21"/>
-          <w:szCs w:val="21"/>
-          <w:highlight w:val="yellow"/>
-          <w:highlightCs w:val="yellow"/>
-          <w:rtl w:val="false"/>
-        </w:rPr>
-        <w:t xml:space="preserve">[Chair/Secretary, Institutional Review Board, Majmaah University]</w:t>
-      </w:r>
-      <w:r>
-        <w:rPr>
-          <w:rFonts w:ascii="Arial" w:cs="Arial" w:eastAsia="Arial" w:hAnsi="Arial"/>
-          <w:b w:val="false"/>
-          <w:bCs w:val="false"/>
-          <w:i w:val="false"/>
-          <w:iCs w:val="false"/>
-          <w:sz w:val="21"/>
-          <w:szCs w:val="21"/>
-          <w:rtl w:val="false"/>
-        </w:rPr>
-        <w:t xml:space="preserve">, Tel: </w:t>
-      </w:r>
-      <w:r>
-        <w:rPr>
-          <w:rFonts w:ascii="Arial" w:cs="Arial" w:eastAsia="Arial" w:hAnsi="Arial"/>
-          <w:b w:val="false"/>
-          <w:bCs w:val="false"/>
-          <w:i w:val="false"/>
-          <w:iCs w:val="false"/>
-          <w:sz w:val="21"/>
-          <w:szCs w:val="21"/>
-          <w:highlight w:val="yellow"/>
-          <w:highlightCs w:val="yellow"/>
-          <w:rtl w:val="false"/>
-        </w:rPr>
-        <w:t xml:space="preserve">[number]</w:t>
-      </w:r>
-      <w:r>
-        <w:rPr>
-          <w:rFonts w:ascii="Arial" w:cs="Arial" w:eastAsia="Arial" w:hAnsi="Arial"/>
-          <w:b w:val="false"/>
-          <w:bCs w:val="false"/>
-          <w:i w:val="false"/>
-          <w:iCs w:val="false"/>
-          <w:sz w:val="21"/>
-          <w:szCs w:val="21"/>
-          <w:rtl w:val="false"/>
-        </w:rPr>
-        <w:t xml:space="preserve">, Email: </w:t>
-      </w:r>
-      <w:r>
-        <w:rPr>
-          <w:rFonts w:ascii="Arial" w:cs="Arial" w:eastAsia="Arial" w:hAnsi="Arial"/>
-          <w:b w:val="false"/>
-          <w:bCs w:val="false"/>
-          <w:i w:val="false"/>
-          <w:iCs w:val="false"/>
-          <w:sz w:val="21"/>
-          <w:szCs w:val="21"/>
-          <w:highlight w:val="yellow"/>
-          <w:highlightCs w:val="yellow"/>
-          <w:rtl w:val="false"/>
-        </w:rPr>
-        <w:t xml:space="preserve">[email]</w:t>
-      </w:r>
-      <w:r>
-        <w:rPr>
-          <w:rFonts w:ascii="Arial" w:cs="Arial" w:eastAsia="Arial" w:hAnsi="Arial"/>
-          <w:b w:val="false"/>
-          <w:bCs w:val="false"/>
-          <w:i w:val="false"/>
-          <w:iCs w:val="false"/>
-          <w:sz w:val="21"/>
-          <w:szCs w:val="21"/>
-          <w:rtl w:val="false"/>
-        </w:rPr>
-        <w:t xml:space="preserve">; or the ethics committee of your health cluster listed above.</w:t>
+        <w:t xml:space="preserve">For questions about your rights as a participant, or to raise a concern: the Institutional Review Board of Majmaah University, or the ethics committee of your health cluster listed above.</w:t>
       </w:r>
     </w:p>
     <w:p>
@@ -2487,63 +2182,7 @@
                 <w:szCs w:val="19"/>
                 <w:rtl w:val="false"/>
               </w:rPr>
-              <w:t xml:space="preserve">I have read (or have had read to me) the Participant Information Sheet version </w:t>
-            </w:r>
-            <w:r>
-              <w:rPr>
-                <w:rFonts w:ascii="Arial" w:cs="Arial" w:eastAsia="Arial" w:hAnsi="Arial"/>
-                <w:b w:val="false"/>
-                <w:bCs w:val="false"/>
-                <w:i w:val="false"/>
-                <w:iCs w:val="false"/>
-                <w:sz w:val="19"/>
-                <w:szCs w:val="19"/>
-                <w:highlight w:val="yellow"/>
-                <w:highlightCs w:val="yellow"/>
-                <w:rtl w:val="false"/>
-              </w:rPr>
-              <w:t xml:space="preserve">[x.x]</w:t>
-            </w:r>
-            <w:r>
-              <w:rPr>
-                <w:rFonts w:ascii="Arial" w:cs="Arial" w:eastAsia="Arial" w:hAnsi="Arial"/>
-                <w:b w:val="false"/>
-                <w:bCs w:val="false"/>
-                <w:i w:val="false"/>
-                <w:iCs w:val="false"/>
-                <w:sz w:val="19"/>
-                <w:szCs w:val="19"/>
-                <w:rtl w:val="false"/>
-              </w:rPr>
-              <w:t xml:space="preserve"> dated </w:t>
-            </w:r>
-            <w:r>
-              <w:rPr>
-                <w:rFonts w:ascii="Arial" w:cs="Arial" w:eastAsia="Arial" w:hAnsi="Arial"/>
-                <w:b w:val="false"/>
-                <w:bCs w:val="false"/>
-                <w:i w:val="false"/>
-                <w:iCs w:val="false"/>
-                <w:sz w:val="19"/>
-                <w:szCs w:val="19"/>
-                <w:highlight w:val="yellow"/>
-                <w:highlightCs w:val="yellow"/>
-                <w:rtl w:val="false"/>
-              </w:rPr>
-              <w:t xml:space="preserve">[dd/mm/2025]</w:t>
-            </w:r>
-            <w:r>
-              <w:rPr>
-                <w:rFonts w:ascii="Arial" w:cs="Arial" w:eastAsia="Arial" w:hAnsi="Arial"/>
-                <w:b w:val="false"/>
-                <w:bCs w:val="false"/>
-                <w:i w:val="false"/>
-                <w:iCs w:val="false"/>
-                <w:sz w:val="19"/>
-                <w:szCs w:val="19"/>
-                <w:rtl w:val="false"/>
-              </w:rPr>
-              <w:t xml:space="preserve">. I received it at least 48 hours before the interview, I have had the opportunity to ask questions, and my questions have been answered satisfactorily.</w:t>
+              <w:t xml:space="preserve">I have read (or have had read to me) the Participant Information Sheet (Part A) of this document. I received it at least 48 hours before the interview, I have had the opportunity to ask questions, and my questions have been answered satisfactorily.</w:t>
             </w:r>
           </w:p>
         </w:tc>
@@ -4500,35 +4139,7 @@
           <w:szCs w:val="19"/>
           <w:rtl w:val="false"/>
         </w:rPr>
-        <w:t xml:space="preserve">For videoconference interviews: </w:t>
-      </w:r>
-      <w:r>
-        <w:rPr>
-          <w:rFonts w:ascii="Arial" w:cs="Arial" w:eastAsia="Arial" w:hAnsi="Arial"/>
-          <w:b w:val="false"/>
-          <w:bCs w:val="false"/>
-          <w:i/>
-          <w:iCs/>
-          <w:sz w:val="19"/>
-          <w:szCs w:val="19"/>
-          <w:highlight w:val="yellow"/>
-          <w:highlightCs w:val="yellow"/>
-          <w:rtl w:val="false"/>
-        </w:rPr>
-        <w:t xml:space="preserve">[describe how the signed form was returned before the interview, e.g. scanned copy sent by secure email to the research team]</w:t>
-      </w:r>
-      <w:r>
-        <w:rPr>
-          <w:rFonts w:ascii="Arial" w:cs="Arial" w:eastAsia="Arial" w:hAnsi="Arial"/>
-          <w:b w:val="false"/>
-          <w:bCs w:val="false"/>
-          <w:i/>
-          <w:iCs/>
-          <w:sz w:val="19"/>
-          <w:szCs w:val="19"/>
-          <w:rtl w:val="false"/>
-        </w:rPr>
-        <w:t xml:space="preserve">.</w:t>
+        <w:t xml:space="preserve">For videoconference interviews, the signed consent form is returned to the research team before the interview begins.</w:t>
       </w:r>
     </w:p>
     <w:p>
@@ -4599,63 +4210,7 @@
           <w:szCs w:val="19"/>
           <w:rtl/>
         </w:rPr>
-        <w:t xml:space="preserve">ورقة المعلومات: الإصدار </w:t>
-      </w:r>
-      <w:r>
-        <w:rPr>
-          <w:rFonts w:ascii="Arial" w:cs="Arial" w:eastAsia="Arial" w:hAnsi="Arial"/>
-          <w:b w:val="false"/>
-          <w:bCs w:val="false"/>
-          <w:i/>
-          <w:iCs/>
-          <w:sz w:val="19"/>
-          <w:szCs w:val="19"/>
-          <w:highlight w:val="yellow"/>
-          <w:highlightCs w:val="yellow"/>
-          <w:rtl/>
-        </w:rPr>
-        <w:t xml:space="preserve">[x.x]</w:t>
-      </w:r>
-      <w:r>
-        <w:rPr>
-          <w:rFonts w:ascii="Arial" w:cs="Arial" w:eastAsia="Arial" w:hAnsi="Arial"/>
-          <w:b w:val="false"/>
-          <w:bCs w:val="false"/>
-          <w:i/>
-          <w:iCs/>
-          <w:sz w:val="19"/>
-          <w:szCs w:val="19"/>
-          <w:rtl/>
-        </w:rPr>
-        <w:t xml:space="preserve"> بتاريخ </w:t>
-      </w:r>
-      <w:r>
-        <w:rPr>
-          <w:rFonts w:ascii="Arial" w:cs="Arial" w:eastAsia="Arial" w:hAnsi="Arial"/>
-          <w:b w:val="false"/>
-          <w:bCs w:val="false"/>
-          <w:i/>
-          <w:iCs/>
-          <w:sz w:val="19"/>
-          <w:szCs w:val="19"/>
-          <w:highlight w:val="yellow"/>
-          <w:highlightCs w:val="yellow"/>
-          <w:rtl/>
-        </w:rPr>
-        <w:t xml:space="preserve">[يوم/شهر/2025]</w:t>
-      </w:r>
-      <w:r>
-        <w:rPr>
-          <w:rFonts w:ascii="Arial" w:cs="Arial" w:eastAsia="Arial" w:hAnsi="Arial"/>
-          <w:b w:val="false"/>
-          <w:bCs w:val="false"/>
-          <w:i/>
-          <w:iCs/>
-          <w:sz w:val="19"/>
-          <w:szCs w:val="19"/>
-          <w:rtl/>
-        </w:rPr>
-        <w:t xml:space="preserve">   |   اللغة: العربية (تتوفر نسخة باللغة الإنجليزية)</w:t>
+        <w:t xml:space="preserve">اللغة: العربية (تتوفر نسخة باللغة الإنجليزية)</w:t>
       </w:r>
     </w:p>
     <w:p>
@@ -4772,11 +4327,9 @@
                 <w:iCs w:val="false"/>
                 <w:sz w:val="20"/>
                 <w:szCs w:val="20"/>
-                <w:highlight w:val="yellow"/>
-                <w:highlightCs w:val="yellow"/>
                 <w:rtl/>
               </w:rPr>
-              <w:t xml:space="preserve">[الاسم، اللقب، القسم، الجهة]</w:t>
+              <w:t xml:space="preserve">Athar Odah Alshammari، قسم الأمومة والطفولة، كلية التمريض، جامعة حائل، حائل، المملكة العربية السعودية</w:t>
             </w:r>
           </w:p>
           <w:p>
@@ -4796,50 +4349,7 @@
                 <w:szCs w:val="20"/>
                 <w:rtl/>
               </w:rPr>
-              <w:t xml:space="preserve">هاتف: </w:t>
-            </w:r>
-            <w:r>
-              <w:rPr>
-                <w:rFonts w:ascii="Arial" w:cs="Arial" w:eastAsia="Arial" w:hAnsi="Arial"/>
-                <w:b w:val="false"/>
-                <w:bCs w:val="false"/>
-                <w:i w:val="false"/>
-                <w:iCs w:val="false"/>
-                <w:sz w:val="20"/>
-                <w:szCs w:val="20"/>
-                <w:highlight w:val="yellow"/>
-                <w:highlightCs w:val="yellow"/>
-                <w:rtl/>
-              </w:rPr>
-              <w:t xml:space="preserve">[الرقم]</w:t>
-            </w:r>
-            <w:r>
-              <w:rPr>
-                <w:rFonts w:ascii="Arial" w:cs="Arial" w:eastAsia="Arial" w:hAnsi="Arial"/>
-                <w:b w:val="false"/>
-                <w:bCs w:val="false"/>
-                <w:i w:val="false"/>
-                <w:iCs w:val="false"/>
-                <w:sz w:val="20"/>
-                <w:szCs w:val="20"/>
-                <w:rtl/>
-              </w:rPr>
-              <w:t xml:space="preserve">   البريد الإلكتروني: </w:t>
-            </w:r>
-            <w:r>
-              <w:rPr>
-                <w:rFonts w:ascii="Arial" w:cs="Arial" w:eastAsia="Arial" w:hAnsi="Arial"/>
-                <w:b w:val="false"/>
-                <w:bCs w:val="false"/>
-                <w:i w:val="false"/>
-                <w:iCs w:val="false"/>
-                <w:sz w:val="20"/>
-                <w:szCs w:val="20"/>
-                <w:highlight w:val="yellow"/>
-                <w:highlightCs w:val="yellow"/>
-                <w:rtl/>
-              </w:rPr>
-              <w:t xml:space="preserve">[البريد]</w:t>
+              <w:t xml:space="preserve">البريد الإلكتروني: athar.alshammari@uoh.edu.sa</w:t>
             </w:r>
           </w:p>
         </w:tc>
@@ -4919,7 +4429,7 @@
                 <w:szCs w:val="20"/>
                 <w:rtl/>
               </w:rPr>
-              <w:t xml:space="preserve">د. ندى القرعاوي، كلية التمريض، جامعة القصيم. البريد الإلكتروني: n.alqarawi@qu.edu.sa</w:t>
+              <w:t xml:space="preserve">Nada Alqarawi، قسم تمريض المجتمع والتمريض النفسي والصحة النفسية، كلية التمريض، جامعة القصيم، بريدة، المملكة العربية السعودية. البريد الإلكتروني: n.alqarawi@qu.edu.sa</w:t>
             </w:r>
           </w:p>
         </w:tc>
@@ -4962,6 +4472,186 @@
                 <w:szCs w:val="20"/>
                 <w:rtl/>
               </w:rPr>
+              <w:t xml:space="preserve">الباحثون المشاركون</w:t>
+            </w:r>
+          </w:p>
+        </w:tc>
+        <w:tc>
+          <w:tcPr>
+            <w:tcW w:type="dxa" w:w="7038"/>
+            <w:tcBorders>
+              <w:top w:val="single" w:color="808080" w:sz="4"/>
+              <w:left w:val="single" w:color="808080" w:sz="4"/>
+              <w:bottom w:val="single" w:color="808080" w:sz="4"/>
+              <w:right w:val="single" w:color="808080" w:sz="4"/>
+            </w:tcBorders>
+            <w:tcMar>
+              <w:top w:type="dxa" w:w="30"/>
+              <w:left w:type="dxa" w:w="100"/>
+              <w:bottom w:type="dxa" w:w="30"/>
+              <w:right w:type="dxa" w:w="100"/>
+            </w:tcMar>
+          </w:tcPr>
+          <w:p>
+            <w:pPr>
+              <w:bidi/>
+              <w:spacing w:after="40" w:before="0" w:line="276"/>
+              <w:jc w:val="right"/>
+            </w:pPr>
+            <w:r>
+              <w:rPr>
+                <w:rFonts w:ascii="Arial" w:cs="Arial" w:eastAsia="Arial" w:hAnsi="Arial"/>
+                <w:b w:val="false"/>
+                <w:bCs w:val="false"/>
+                <w:i w:val="false"/>
+                <w:iCs w:val="false"/>
+                <w:sz w:val="20"/>
+                <w:szCs w:val="20"/>
+                <w:rtl/>
+              </w:rPr>
+              <w:t xml:space="preserve">Afrah Madyan Alshammari (كلية التمريض، جامعة الجوف)</w:t>
+            </w:r>
+          </w:p>
+          <w:p>
+            <w:pPr>
+              <w:bidi/>
+              <w:spacing w:after="40" w:before="0" w:line="276"/>
+              <w:jc w:val="right"/>
+            </w:pPr>
+            <w:r>
+              <w:rPr>
+                <w:rFonts w:ascii="Arial" w:cs="Arial" w:eastAsia="Arial" w:hAnsi="Arial"/>
+                <w:b w:val="false"/>
+                <w:bCs w:val="false"/>
+                <w:i w:val="false"/>
+                <w:iCs w:val="false"/>
+                <w:sz w:val="20"/>
+                <w:szCs w:val="20"/>
+                <w:rtl/>
+              </w:rPr>
+              <w:t xml:space="preserve">Mutairah Alamlah Alshammari (كلية التمريض، جامعة الجوف)</w:t>
+            </w:r>
+          </w:p>
+          <w:p>
+            <w:pPr>
+              <w:bidi/>
+              <w:spacing w:after="40" w:before="0" w:line="276"/>
+              <w:jc w:val="right"/>
+            </w:pPr>
+            <w:r>
+              <w:rPr>
+                <w:rFonts w:ascii="Arial" w:cs="Arial" w:eastAsia="Arial" w:hAnsi="Arial"/>
+                <w:b w:val="false"/>
+                <w:bCs w:val="false"/>
+                <w:i w:val="false"/>
+                <w:iCs w:val="false"/>
+                <w:sz w:val="20"/>
+                <w:szCs w:val="20"/>
+                <w:rtl/>
+              </w:rPr>
+              <w:t xml:space="preserve">Manar Fayez Al-ruwaili (كلية التمريض، جامعة الجوف)</w:t>
+            </w:r>
+          </w:p>
+          <w:p>
+            <w:pPr>
+              <w:bidi/>
+              <w:spacing w:after="40" w:before="0" w:line="276"/>
+              <w:jc w:val="right"/>
+            </w:pPr>
+            <w:r>
+              <w:rPr>
+                <w:rFonts w:ascii="Arial" w:cs="Arial" w:eastAsia="Arial" w:hAnsi="Arial"/>
+                <w:b w:val="false"/>
+                <w:bCs w:val="false"/>
+                <w:i w:val="false"/>
+                <w:iCs w:val="false"/>
+                <w:sz w:val="20"/>
+                <w:szCs w:val="20"/>
+                <w:rtl/>
+              </w:rPr>
+              <w:t xml:space="preserve">Areej Abunar (كلية التمريض، جامعة الملك عبدالعزيز)</w:t>
+            </w:r>
+          </w:p>
+          <w:p>
+            <w:pPr>
+              <w:bidi/>
+              <w:spacing w:after="40" w:before="0" w:line="276"/>
+              <w:jc w:val="right"/>
+            </w:pPr>
+            <w:r>
+              <w:rPr>
+                <w:rFonts w:ascii="Arial" w:cs="Arial" w:eastAsia="Arial" w:hAnsi="Arial"/>
+                <w:b w:val="false"/>
+                <w:bCs w:val="false"/>
+                <w:i w:val="false"/>
+                <w:iCs w:val="false"/>
+                <w:sz w:val="20"/>
+                <w:szCs w:val="20"/>
+                <w:rtl/>
+              </w:rPr>
+              <w:t xml:space="preserve">Osama Mohamed Elsayed Ramadan (كلية التمريض، جامعة القاهرة)</w:t>
+            </w:r>
+          </w:p>
+          <w:p>
+            <w:pPr>
+              <w:bidi/>
+              <w:spacing w:after="40" w:before="0" w:line="276"/>
+              <w:jc w:val="right"/>
+            </w:pPr>
+            <w:r>
+              <w:rPr>
+                <w:rFonts w:ascii="Arial" w:cs="Arial" w:eastAsia="Arial" w:hAnsi="Arial"/>
+                <w:b w:val="false"/>
+                <w:bCs w:val="false"/>
+                <w:i w:val="false"/>
+                <w:iCs w:val="false"/>
+                <w:sz w:val="20"/>
+                <w:szCs w:val="20"/>
+                <w:rtl/>
+              </w:rPr>
+              <w:t xml:space="preserve">Heba Tallah Elashmawy Mohamed Shaban (كلية التمريض، جامعة المجمعة)</w:t>
+            </w:r>
+          </w:p>
+        </w:tc>
+      </w:tr>
+      <w:tr>
+        <w:trPr>
+          <w:cantSplit/>
+          <w:tblHeader w:val="false"/>
+        </w:trPr>
+        <w:tc>
+          <w:tcPr>
+            <w:tcW w:type="dxa" w:w="2600"/>
+            <w:tcBorders>
+              <w:top w:val="single" w:color="808080" w:sz="4"/>
+              <w:left w:val="single" w:color="808080" w:sz="4"/>
+              <w:bottom w:val="single" w:color="808080" w:sz="4"/>
+              <w:right w:val="single" w:color="808080" w:sz="4"/>
+            </w:tcBorders>
+            <w:tcMar>
+              <w:top w:type="dxa" w:w="30"/>
+              <w:left w:type="dxa" w:w="100"/>
+              <w:bottom w:type="dxa" w:w="30"/>
+              <w:right w:type="dxa" w:w="100"/>
+            </w:tcMar>
+          </w:tcPr>
+          <w:p>
+            <w:pPr>
+              <w:bidi/>
+              <w:spacing w:after="40" w:before="0" w:line="276"/>
+              <w:jc w:val="right"/>
+            </w:pPr>
+            <w:r>
+              <w:rPr>
+                <w:rFonts w:ascii="Arial" w:cs="Arial" w:eastAsia="Arial" w:hAnsi="Arial"/>
+                <w:b w:val="false"/>
+                <w:bCs w:val="false"/>
+                <w:i w:val="false"/>
+                <w:iCs w:val="false"/>
+                <w:sz w:val="20"/>
+                <w:szCs w:val="20"/>
+                <w:rtl/>
+              </w:rPr>
               <w:t xml:space="preserve">القائمة بالمقابلة</w:t>
             </w:r>
           </w:p>
@@ -4997,24 +4687,9 @@
                 <w:iCs w:val="false"/>
                 <w:sz w:val="20"/>
                 <w:szCs w:val="20"/>
-                <w:highlight w:val="yellow"/>
-                <w:highlightCs w:val="yellow"/>
                 <w:rtl/>
               </w:rPr>
-              <w:t xml:space="preserve">[الاسم]</w:t>
-            </w:r>
-            <w:r>
-              <w:rPr>
-                <w:rFonts w:ascii="Arial" w:cs="Arial" w:eastAsia="Arial" w:hAnsi="Arial"/>
-                <w:b w:val="false"/>
-                <w:bCs w:val="false"/>
-                <w:i w:val="false"/>
-                <w:iCs w:val="false"/>
-                <w:sz w:val="20"/>
-                <w:szCs w:val="20"/>
-                <w:rtl/>
-              </w:rPr>
-              <w:t xml:space="preserve">، ممرضة أكاديمية حاصلة على الدكتوراه ومدرَّبة على إجراء المقابلات النوعية. لا تعمل ضمن فريقك وليس لها أي دور إشرافي أو تقييمي عليك.</w:t>
+              <w:t xml:space="preserve">عضوة في فريق البحث: ممرضة أكاديمية حاصلة على الدكتوراه ومدرَّبة على إجراء المقابلات النوعية. لا تعمل ضمن فريقك وليس لها أي دور إشرافي أو تقييمي عليك.</w:t>
             </w:r>
           </w:p>
         </w:tc>
@@ -5318,11 +4993,9 @@
                 <w:iCs w:val="false"/>
                 <w:sz w:val="20"/>
                 <w:szCs w:val="20"/>
-                <w:highlight w:val="yellow"/>
-                <w:highlightCs w:val="yellow"/>
                 <w:rtl/>
               </w:rPr>
-              <w:t xml:space="preserve">[أبريل 2025: أدخل التاريخ الدقيق]</w:t>
+              <w:t xml:space="preserve">أبريل 2025</w:t>
             </w:r>
           </w:p>
         </w:tc>
@@ -5821,35 +5494,7 @@
           <w:szCs w:val="21"/>
           <w:rtl/>
         </w:rPr>
-        <w:t xml:space="preserve">لا. المشاركة تطوعية بالكامل ولا علاقة لها بوظيفتكِ أو تقييم أدائكِ أو عقدكِ أو ترخيصكِ المهني. لن يرشحكِ مديروكِ ولن يُبلَّغوا بمشاركتكِ من عدمها. يمكنكِ الامتناع عن الإجابة عن أي سؤال، أو إيقاف المقابلة مؤقتًا أو إنهاؤها في أي وقت، والانسحاب من الدراسة دون إبداء أسباب ودون أي عواقب. في حال انسحابكِ سيتم إتلاف التسجيل والنص المكتوب الخاص بكِ. وقد يتعذر حذف البيانات التي أُزيلت منها المعلومات التعريفية ودُمجت في التحليل بعد </w:t>
-      </w:r>
-      <w:r>
-        <w:rPr>
-          <w:rFonts w:ascii="Arial" w:cs="Arial" w:eastAsia="Arial" w:hAnsi="Arial"/>
-          <w:b w:val="false"/>
-          <w:bCs w:val="false"/>
-          <w:i w:val="false"/>
-          <w:iCs w:val="false"/>
-          <w:sz w:val="21"/>
-          <w:szCs w:val="21"/>
-          <w:highlight w:val="yellow"/>
-          <w:highlightCs w:val="yellow"/>
-          <w:rtl/>
-        </w:rPr>
-        <w:t xml:space="preserve">[أدخل الموعد، مثل: أسبوعين من تاريخ المقابلة]</w:t>
-      </w:r>
-      <w:r>
-        <w:rPr>
-          <w:rFonts w:ascii="Arial" w:cs="Arial" w:eastAsia="Arial" w:hAnsi="Arial"/>
-          <w:b w:val="false"/>
-          <w:bCs w:val="false"/>
-          <w:i w:val="false"/>
-          <w:iCs w:val="false"/>
-          <w:sz w:val="21"/>
-          <w:szCs w:val="21"/>
-          <w:rtl/>
-        </w:rPr>
-        <w:t xml:space="preserve">.</w:t>
+        <w:t xml:space="preserve">لا. المشاركة تطوعية بالكامل ولا علاقة لها بوظيفتكِ أو تقييم أدائكِ أو عقدكِ أو ترخيصكِ المهني. لن يرشحكِ مديروكِ ولن يُبلَّغوا بمشاركتكِ من عدمها. يمكنكِ الامتناع عن الإجابة عن أي سؤال، أو إيقاف المقابلة مؤقتًا أو إنهاؤها في أي وقت، والانسحاب من الدراسة دون إبداء أسباب ودون أي عواقب. في حال انسحابكِ سيتم إتلاف التسجيل والنص المكتوب الخاص بكِ. وبعد إزالة المعلومات التعريفية من بياناتكِ ودمجها مع بيانات المشاركات الأخريات في التحليل، قد يتعذر حذفها.</w:t>
       </w:r>
     </w:p>
     <w:p>
@@ -6127,22 +5772,7 @@
           <w:szCs w:val="21"/>
           <w:rtl/>
         </w:rPr>
-        <w:t xml:space="preserve">يُتوقع أن تكون المخاطر في حدها الأدنى. ستستغرق المقابلة جزءًا من وقتكِ. وقد يسبب الحديث عن القرارات السريرية أو ظروف العمل شعورًا بعدم الارتياح أو قلقًا بشأن كيفية النظر إلى ممارستكِ؛ ويمكنكِ تخطي أي سؤال أو التوقف في أي وقت. ونظرًا لقلة عدد المشاركات، هناك احتمال ضئيل أن يتعرف أحد عليكِ من تفاصيل السياق، والإجراءات الموضحة في البند 8 مصممة لتقليل هذا الاحتمال. </w:t>
-      </w:r>
-      <w:r>
-        <w:rPr>
-          <w:rFonts w:ascii="Arial" w:cs="Arial" w:eastAsia="Arial" w:hAnsi="Arial"/>
-          <w:b w:val="false"/>
-          <w:bCs w:val="false"/>
-          <w:i w:val="false"/>
-          <w:iCs w:val="false"/>
-          <w:sz w:val="21"/>
-          <w:szCs w:val="21"/>
-          <w:highlight w:val="yellow"/>
-          <w:highlightCs w:val="yellow"/>
-          <w:rtl/>
-        </w:rPr>
-        <w:t xml:space="preserve">[أدخل أي حدود للسرية تشترطها لجان الموافقة، مثل الإفصاح عن خطر مباشر على سلامة المرضى.]</w:t>
+        <w:t xml:space="preserve">يُتوقع أن تكون المخاطر في حدها الأدنى. ستستغرق المقابلة جزءًا من وقتكِ. وقد يسبب الحديث عن القرارات السريرية أو ظروف العمل شعورًا بعدم الارتياح أو قلقًا بشأن كيفية النظر إلى ممارستكِ؛ ويمكنكِ تخطي أي سؤال أو التوقف في أي وقت. ونظرًا لقلة عدد المشاركات، هناك احتمال ضئيل أن يتعرف أحد عليكِ من تفاصيل السياق، والإجراءات الموضحة في البند 8 مصممة لتقليل هذا الاحتمال.</w:t>
       </w:r>
     </w:p>
     <w:p>
@@ -6379,63 +6009,7 @@
           <w:szCs w:val="21"/>
           <w:rtl/>
         </w:rPr>
-        <w:t xml:space="preserve">ستُحفظ البيانات لمدة </w:t>
-      </w:r>
-      <w:r>
-        <w:rPr>
-          <w:rFonts w:ascii="Arial" w:cs="Arial" w:eastAsia="Arial" w:hAnsi="Arial"/>
-          <w:b w:val="false"/>
-          <w:bCs w:val="false"/>
-          <w:i w:val="false"/>
-          <w:iCs w:val="false"/>
-          <w:sz w:val="21"/>
-          <w:szCs w:val="21"/>
-          <w:highlight w:val="yellow"/>
-          <w:highlightCs w:val="yellow"/>
-          <w:rtl/>
-        </w:rPr>
-        <w:t xml:space="preserve">[x]</w:t>
-      </w:r>
-      <w:r>
-        <w:rPr>
-          <w:rFonts w:ascii="Arial" w:cs="Arial" w:eastAsia="Arial" w:hAnsi="Arial"/>
-          <w:b w:val="false"/>
-          <w:bCs w:val="false"/>
-          <w:i w:val="false"/>
-          <w:iCs w:val="false"/>
-          <w:sz w:val="21"/>
-          <w:szCs w:val="21"/>
-          <w:rtl/>
-        </w:rPr>
-        <w:t xml:space="preserve"> سنوات بعد انتهاء الدراسة ثم تُتلف بشكل آمن وفق سياسة </w:t>
-      </w:r>
-      <w:r>
-        <w:rPr>
-          <w:rFonts w:ascii="Arial" w:cs="Arial" w:eastAsia="Arial" w:hAnsi="Arial"/>
-          <w:b w:val="false"/>
-          <w:bCs w:val="false"/>
-          <w:i w:val="false"/>
-          <w:iCs w:val="false"/>
-          <w:sz w:val="21"/>
-          <w:szCs w:val="21"/>
-          <w:highlight w:val="yellow"/>
-          <w:highlightCs w:val="yellow"/>
-          <w:rtl/>
-        </w:rPr>
-        <w:t xml:space="preserve">[الجهة]</w:t>
-      </w:r>
-      <w:r>
-        <w:rPr>
-          <w:rFonts w:ascii="Arial" w:cs="Arial" w:eastAsia="Arial" w:hAnsi="Arial"/>
-          <w:b w:val="false"/>
-          <w:bCs w:val="false"/>
-          <w:i w:val="false"/>
-          <w:iCs w:val="false"/>
-          <w:sz w:val="21"/>
-          <w:szCs w:val="21"/>
-          <w:rtl/>
-        </w:rPr>
-        <w:t xml:space="preserve">.</w:t>
+        <w:t xml:space="preserve">ستُحفظ البيانات بشكل آمن للمدة التي تحددها لجان الأخلاقيات المعتمدة والسياسات المؤسسية، ثم تُتلف بشكل آمن.</w:t>
       </w:r>
     </w:p>
     <w:p>
@@ -6517,23 +6091,15 @@
           <w:szCs w:val="21"/>
           <w:rtl/>
         </w:rPr>
-        <w:t xml:space="preserve">للاستفسار عن الدراسة: </w:t>
-      </w:r>
-      <w:r>
-        <w:rPr>
-          <w:rFonts w:ascii="Arial" w:cs="Arial" w:eastAsia="Arial" w:hAnsi="Arial"/>
-          <w:b w:val="false"/>
-          <w:bCs w:val="false"/>
-          <w:i w:val="false"/>
-          <w:iCs w:val="false"/>
-          <w:sz w:val="21"/>
-          <w:szCs w:val="21"/>
-          <w:highlight w:val="yellow"/>
-          <w:highlightCs w:val="yellow"/>
-          <w:rtl/>
-        </w:rPr>
-        <w:t xml:space="preserve">[اسم الباحث الرئيس]</w:t>
-      </w:r>
+        <w:t xml:space="preserve">للاستفسار عن الدراسة: Athar Odah Alshammari (الباحث الرئيس)، البريد الإلكتروني: athar.alshammari@uoh.edu.sa؛ أو Nada Alqarawi (الباحثة المراسلة)، البريد الإلكتروني: n.alqarawi@qu.edu.sa.</w:t>
+      </w:r>
+    </w:p>
+    <w:p>
+      <w:pPr>
+        <w:bidi/>
+        <w:spacing w:after="100" w:before="0" w:line="276"/>
+        <w:jc w:val="right"/>
+      </w:pPr>
       <w:r>
         <w:rPr>
           <w:rFonts w:ascii="Arial" w:cs="Arial" w:eastAsia="Arial" w:hAnsi="Arial"/>
@@ -6545,167 +6111,7 @@
           <w:szCs w:val="21"/>
           <w:rtl/>
         </w:rPr>
-        <w:t xml:space="preserve">، هاتف: </w:t>
-      </w:r>
-      <w:r>
-        <w:rPr>
-          <w:rFonts w:ascii="Arial" w:cs="Arial" w:eastAsia="Arial" w:hAnsi="Arial"/>
-          <w:b w:val="false"/>
-          <w:bCs w:val="false"/>
-          <w:i w:val="false"/>
-          <w:iCs w:val="false"/>
-          <w:sz w:val="21"/>
-          <w:szCs w:val="21"/>
-          <w:highlight w:val="yellow"/>
-          <w:highlightCs w:val="yellow"/>
-          <w:rtl/>
-        </w:rPr>
-        <w:t xml:space="preserve">[الرقم]</w:t>
-      </w:r>
-      <w:r>
-        <w:rPr>
-          <w:rFonts w:ascii="Arial" w:cs="Arial" w:eastAsia="Arial" w:hAnsi="Arial"/>
-          <w:b w:val="false"/>
-          <w:bCs w:val="false"/>
-          <w:i w:val="false"/>
-          <w:iCs w:val="false"/>
-          <w:sz w:val="21"/>
-          <w:szCs w:val="21"/>
-          <w:rtl/>
-        </w:rPr>
-        <w:t xml:space="preserve">، البريد الإلكتروني: </w:t>
-      </w:r>
-      <w:r>
-        <w:rPr>
-          <w:rFonts w:ascii="Arial" w:cs="Arial" w:eastAsia="Arial" w:hAnsi="Arial"/>
-          <w:b w:val="false"/>
-          <w:bCs w:val="false"/>
-          <w:i w:val="false"/>
-          <w:iCs w:val="false"/>
-          <w:sz w:val="21"/>
-          <w:szCs w:val="21"/>
-          <w:highlight w:val="yellow"/>
-          <w:highlightCs w:val="yellow"/>
-          <w:rtl/>
-        </w:rPr>
-        <w:t xml:space="preserve">[البريد]</w:t>
-      </w:r>
-      <w:r>
-        <w:rPr>
-          <w:rFonts w:ascii="Arial" w:cs="Arial" w:eastAsia="Arial" w:hAnsi="Arial"/>
-          <w:b w:val="false"/>
-          <w:bCs w:val="false"/>
-          <w:i w:val="false"/>
-          <w:iCs w:val="false"/>
-          <w:sz w:val="21"/>
-          <w:szCs w:val="21"/>
-          <w:rtl/>
-        </w:rPr>
-        <w:t xml:space="preserve">.</w:t>
-      </w:r>
-    </w:p>
-    <w:p>
-      <w:pPr>
-        <w:bidi/>
-        <w:spacing w:after="100" w:before="0" w:line="276"/>
-        <w:jc w:val="right"/>
-      </w:pPr>
-      <w:r>
-        <w:rPr>
-          <w:rFonts w:ascii="Arial" w:cs="Arial" w:eastAsia="Arial" w:hAnsi="Arial"/>
-          <w:b w:val="false"/>
-          <w:bCs w:val="false"/>
-          <w:i w:val="false"/>
-          <w:iCs w:val="false"/>
-          <w:sz w:val="21"/>
-          <w:szCs w:val="21"/>
-          <w:rtl/>
-        </w:rPr>
-        <w:t xml:space="preserve">للاستفسار عن حقوقكِ كمشاركة أو لتقديم شكوى: </w:t>
-      </w:r>
-      <w:r>
-        <w:rPr>
-          <w:rFonts w:ascii="Arial" w:cs="Arial" w:eastAsia="Arial" w:hAnsi="Arial"/>
-          <w:b w:val="false"/>
-          <w:bCs w:val="false"/>
-          <w:i w:val="false"/>
-          <w:iCs w:val="false"/>
-          <w:sz w:val="21"/>
-          <w:szCs w:val="21"/>
-          <w:highlight w:val="yellow"/>
-          <w:highlightCs w:val="yellow"/>
-          <w:rtl/>
-        </w:rPr>
-        <w:t xml:space="preserve">[رئيس/أمين مجلس المراجعة المؤسسية، جامعة المجمعة]</w:t>
-      </w:r>
-      <w:r>
-        <w:rPr>
-          <w:rFonts w:ascii="Arial" w:cs="Arial" w:eastAsia="Arial" w:hAnsi="Arial"/>
-          <w:b w:val="false"/>
-          <w:bCs w:val="false"/>
-          <w:i w:val="false"/>
-          <w:iCs w:val="false"/>
-          <w:sz w:val="21"/>
-          <w:szCs w:val="21"/>
-          <w:rtl/>
-        </w:rPr>
-        <w:t xml:space="preserve">، هاتف: </w:t>
-      </w:r>
-      <w:r>
-        <w:rPr>
-          <w:rFonts w:ascii="Arial" w:cs="Arial" w:eastAsia="Arial" w:hAnsi="Arial"/>
-          <w:b w:val="false"/>
-          <w:bCs w:val="false"/>
-          <w:i w:val="false"/>
-          <w:iCs w:val="false"/>
-          <w:sz w:val="21"/>
-          <w:szCs w:val="21"/>
-          <w:highlight w:val="yellow"/>
-          <w:highlightCs w:val="yellow"/>
-          <w:rtl/>
-        </w:rPr>
-        <w:t xml:space="preserve">[الرقم]</w:t>
-      </w:r>
-      <w:r>
-        <w:rPr>
-          <w:rFonts w:ascii="Arial" w:cs="Arial" w:eastAsia="Arial" w:hAnsi="Arial"/>
-          <w:b w:val="false"/>
-          <w:bCs w:val="false"/>
-          <w:i w:val="false"/>
-          <w:iCs w:val="false"/>
-          <w:sz w:val="21"/>
-          <w:szCs w:val="21"/>
-          <w:rtl/>
-        </w:rPr>
-        <w:t xml:space="preserve">، البريد الإلكتروني: </w:t>
-      </w:r>
-      <w:r>
-        <w:rPr>
-          <w:rFonts w:ascii="Arial" w:cs="Arial" w:eastAsia="Arial" w:hAnsi="Arial"/>
-          <w:b w:val="false"/>
-          <w:bCs w:val="false"/>
-          <w:i w:val="false"/>
-          <w:iCs w:val="false"/>
-          <w:sz w:val="21"/>
-          <w:szCs w:val="21"/>
-          <w:highlight w:val="yellow"/>
-          <w:highlightCs w:val="yellow"/>
-          <w:rtl/>
-        </w:rPr>
-        <w:t xml:space="preserve">[البريد]</w:t>
-      </w:r>
-      <w:r>
-        <w:rPr>
-          <w:rFonts w:ascii="Arial" w:cs="Arial" w:eastAsia="Arial" w:hAnsi="Arial"/>
-          <w:b w:val="false"/>
-          <w:bCs w:val="false"/>
-          <w:i w:val="false"/>
-          <w:iCs w:val="false"/>
-          <w:sz w:val="21"/>
-          <w:szCs w:val="21"/>
-          <w:rtl/>
-        </w:rPr>
-        <w:t xml:space="preserve">؛ أو لجنة الأخلاقيات في التجمع الصحي التابعة له والمذكورة أعلاه.</w:t>
+        <w:t xml:space="preserve">للاستفسار عن حقوقكِ كمشاركة أو لتقديم شكوى: مجلس المراجعة المؤسسية بجامعة المجمعة، أو لجنة الأخلاقيات في التجمع الصحي التابعة له والمذكورة أعلاه.</w:t>
       </w:r>
     </w:p>
     <w:p>
@@ -7030,63 +6436,7 @@
                 <w:szCs w:val="20"/>
                 <w:rtl/>
               </w:rPr>
-              <w:t xml:space="preserve">قرأتُ (أو قُرئت عليّ) ورقة معلومات المشاركة الإصدار </w:t>
-            </w:r>
-            <w:r>
-              <w:rPr>
-                <w:rFonts w:ascii="Arial" w:cs="Arial" w:eastAsia="Arial" w:hAnsi="Arial"/>
-                <w:b w:val="false"/>
-                <w:bCs w:val="false"/>
-                <w:i w:val="false"/>
-                <w:iCs w:val="false"/>
-                <w:sz w:val="20"/>
-                <w:szCs w:val="20"/>
-                <w:highlight w:val="yellow"/>
-                <w:highlightCs w:val="yellow"/>
-                <w:rtl/>
-              </w:rPr>
-              <w:t xml:space="preserve">[x.x]</w:t>
-            </w:r>
-            <w:r>
-              <w:rPr>
-                <w:rFonts w:ascii="Arial" w:cs="Arial" w:eastAsia="Arial" w:hAnsi="Arial"/>
-                <w:b w:val="false"/>
-                <w:bCs w:val="false"/>
-                <w:i w:val="false"/>
-                <w:iCs w:val="false"/>
-                <w:sz w:val="20"/>
-                <w:szCs w:val="20"/>
-                <w:rtl/>
-              </w:rPr>
-              <w:t xml:space="preserve"> بتاريخ </w:t>
-            </w:r>
-            <w:r>
-              <w:rPr>
-                <w:rFonts w:ascii="Arial" w:cs="Arial" w:eastAsia="Arial" w:hAnsi="Arial"/>
-                <w:b w:val="false"/>
-                <w:bCs w:val="false"/>
-                <w:i w:val="false"/>
-                <w:iCs w:val="false"/>
-                <w:sz w:val="20"/>
-                <w:szCs w:val="20"/>
-                <w:highlight w:val="yellow"/>
-                <w:highlightCs w:val="yellow"/>
-                <w:rtl/>
-              </w:rPr>
-              <w:t xml:space="preserve">[يوم/شهر/2025]</w:t>
-            </w:r>
-            <w:r>
-              <w:rPr>
-                <w:rFonts w:ascii="Arial" w:cs="Arial" w:eastAsia="Arial" w:hAnsi="Arial"/>
-                <w:b w:val="false"/>
-                <w:bCs w:val="false"/>
-                <w:i w:val="false"/>
-                <w:iCs w:val="false"/>
-                <w:sz w:val="20"/>
-                <w:szCs w:val="20"/>
-                <w:rtl/>
-              </w:rPr>
-              <w:t xml:space="preserve">. وقد استلمتُها قبل المقابلة بما لا يقل عن 48 ساعة، وأُتيحت لي فرصة طرح الأسئلة، وتمت الإجابة عنها بشكل مُرضٍ.</w:t>
+              <w:t xml:space="preserve">قرأتُ (أو قُرئت عليّ) ورقة معلومات المشاركة (الجزء أ) من هذه الوثيقة. وقد استلمتُها قبل المقابلة بما لا يقل عن 48 ساعة، وأُتيحت لي فرصة طرح الأسئلة، وتمت الإجابة عنها بشكل مُرضٍ.</w:t>
             </w:r>
           </w:p>
         </w:tc>
@@ -9043,35 +8393,7 @@
           <w:szCs w:val="19"/>
           <w:rtl/>
         </w:rPr>
-        <w:t xml:space="preserve">للمقابلات عبر الاتصال المرئي: </w:t>
-      </w:r>
-      <w:r>
-        <w:rPr>
-          <w:rFonts w:ascii="Arial" w:cs="Arial" w:eastAsia="Arial" w:hAnsi="Arial"/>
-          <w:b w:val="false"/>
-          <w:bCs w:val="false"/>
-          <w:i/>
-          <w:iCs/>
-          <w:sz w:val="19"/>
-          <w:szCs w:val="19"/>
-          <w:highlight w:val="yellow"/>
-          <w:highlightCs w:val="yellow"/>
-          <w:rtl/>
-        </w:rPr>
-        <w:t xml:space="preserve">[صِف كيفية إعادة النموذج الموقَّع قبل المقابلة، مثل إرسال نسخة ممسوحة ضوئيًا عبر بريد إلكتروني آمن إلى فريق البحث]</w:t>
-      </w:r>
-      <w:r>
-        <w:rPr>
-          <w:rFonts w:ascii="Arial" w:cs="Arial" w:eastAsia="Arial" w:hAnsi="Arial"/>
-          <w:b w:val="false"/>
-          <w:bCs w:val="false"/>
-          <w:i/>
-          <w:iCs/>
-          <w:sz w:val="19"/>
-          <w:szCs w:val="19"/>
-          <w:rtl/>
-        </w:rPr>
-        <w:t xml:space="preserve">.</w:t>
+        <w:t xml:space="preserve">للمقابلات عبر الاتصال المرئي: تُعاد نسخة نموذج الموافقة الموقَّع إلى فريق البحث قبل بدء المقابلة.</w:t>
       </w:r>
     </w:p>
     <w:sectPr>
@@ -9141,7 +8463,7 @@
         <w:szCs w:val="16"/>
         <w:rtl w:val="false"/>
       </w:rPr>
-      <w:t xml:space="preserve">Informed consent form — version [x.x] — page </w:t>
+      <w:t xml:space="preserve">Informed consent form — page </w:t>
     </w:r>
     <w:r>
       <w:rPr>
@@ -9174,7 +8496,7 @@
         <w:szCs w:val="16"/>
         <w:rtl/>
       </w:rPr>
-      <w:t xml:space="preserve">نموذج الموافقة المستنيرة — الإصدار [x.x] — صفحة </w:t>
+      <w:t xml:space="preserve">نموذج الموافقة المستنيرة — صفحة </w:t>
     </w:r>
     <w:r>
       <w:rPr>

</xml_diff>

<commit_message>
Limit consent form wording to details reported in the manuscript
Co-Authored-By: Claude Opus 5.5 <noreply@anthropic.com>
Claude-Session: https://claude.ai/code/session_018sdeELbBUk4Vkmb2tCyW4U
</commit_message>
<xml_diff>
--- a/heat_midwives_consent/Informed_Consent_Form_Blank_EN_AR.docx
+++ b/heat_midwives_consent/Informed_Consent_Form_Blank_EN_AR.docx
@@ -278,7 +278,27 @@
                 <w:szCs w:val="20"/>
                 <w:rtl w:val="false"/>
               </w:rPr>
-              <w:t xml:space="preserve">Nada Alqarawi, College of Community, Psychiatric and Mental Health Nursing, Qassim University, Buraydah, Saudi Arabia. Email: n.alqarawi@qu.edu.sa</w:t>
+              <w:t xml:space="preserve">Nada Alqarawi, Department of Community, Psychiatric, and Mental Health Nursing, College of Nursing, Qassim University, Buraydah, Saudi Arabia</w:t>
+            </w:r>
+          </w:p>
+          <w:p>
+            <w:pPr>
+              <w:bidi w:val="false"/>
+              <w:spacing w:after="40" w:before="0" w:line="276"/>
+              <w:jc w:val="left"/>
+            </w:pPr>
+            <w:r>
+              <w:rPr>
+                <w:rFonts w:ascii="Arial" w:cs="Arial" w:eastAsia="Arial" w:hAnsi="Arial"/>
+                <w:b w:val="false"/>
+                <w:bCs w:val="false"/>
+                <w:i w:val="false"/>
+                <w:iCs w:val="false"/>
+                <w:sz w:val="20"/>
+                <w:szCs w:val="20"/>
+                <w:rtl w:val="false"/>
+              </w:rPr>
+              <w:t xml:space="preserve">Email: n.alqarawi@qu.edu.sa</w:t>
             </w:r>
           </w:p>
         </w:tc>
@@ -358,7 +378,107 @@
                 <w:szCs w:val="20"/>
                 <w:rtl w:val="false"/>
               </w:rPr>
-              <w:t xml:space="preserve">Afrah Madyan Alshammari, Mutairah Alamlah Alshammari and Manar Fayez Al-ruwaili (College of Nursing, Jouf University); Areej Abunar (Faculty of Nursing, King Abdulaziz University); Osama Mohamed Elsayed Ramadan (Faculty of Nursing, Cairo University); Heba Tallah Elashmawy Mohamed Shaban (College of Nursing, Majmaah University)</w:t>
+              <w:t xml:space="preserve">Afrah Madyan Alshammari (College of Nursing, Jouf University)</w:t>
+            </w:r>
+          </w:p>
+          <w:p>
+            <w:pPr>
+              <w:bidi w:val="false"/>
+              <w:spacing w:after="40" w:before="0" w:line="276"/>
+              <w:jc w:val="left"/>
+            </w:pPr>
+            <w:r>
+              <w:rPr>
+                <w:rFonts w:ascii="Arial" w:cs="Arial" w:eastAsia="Arial" w:hAnsi="Arial"/>
+                <w:b w:val="false"/>
+                <w:bCs w:val="false"/>
+                <w:i w:val="false"/>
+                <w:iCs w:val="false"/>
+                <w:sz w:val="20"/>
+                <w:szCs w:val="20"/>
+                <w:rtl w:val="false"/>
+              </w:rPr>
+              <w:t xml:space="preserve">Mutairah Alamlah Alshammari (College of Nursing, Jouf University)</w:t>
+            </w:r>
+          </w:p>
+          <w:p>
+            <w:pPr>
+              <w:bidi w:val="false"/>
+              <w:spacing w:after="40" w:before="0" w:line="276"/>
+              <w:jc w:val="left"/>
+            </w:pPr>
+            <w:r>
+              <w:rPr>
+                <w:rFonts w:ascii="Arial" w:cs="Arial" w:eastAsia="Arial" w:hAnsi="Arial"/>
+                <w:b w:val="false"/>
+                <w:bCs w:val="false"/>
+                <w:i w:val="false"/>
+                <w:iCs w:val="false"/>
+                <w:sz w:val="20"/>
+                <w:szCs w:val="20"/>
+                <w:rtl w:val="false"/>
+              </w:rPr>
+              <w:t xml:space="preserve">Manar Fayez Al-ruwaili (College of Nursing, Jouf University)</w:t>
+            </w:r>
+          </w:p>
+          <w:p>
+            <w:pPr>
+              <w:bidi w:val="false"/>
+              <w:spacing w:after="40" w:before="0" w:line="276"/>
+              <w:jc w:val="left"/>
+            </w:pPr>
+            <w:r>
+              <w:rPr>
+                <w:rFonts w:ascii="Arial" w:cs="Arial" w:eastAsia="Arial" w:hAnsi="Arial"/>
+                <w:b w:val="false"/>
+                <w:bCs w:val="false"/>
+                <w:i w:val="false"/>
+                <w:iCs w:val="false"/>
+                <w:sz w:val="20"/>
+                <w:szCs w:val="20"/>
+                <w:rtl w:val="false"/>
+              </w:rPr>
+              <w:t xml:space="preserve">Areej Abunar (Faculty of Nursing, King Abdulaziz University)</w:t>
+            </w:r>
+          </w:p>
+          <w:p>
+            <w:pPr>
+              <w:bidi w:val="false"/>
+              <w:spacing w:after="40" w:before="0" w:line="276"/>
+              <w:jc w:val="left"/>
+            </w:pPr>
+            <w:r>
+              <w:rPr>
+                <w:rFonts w:ascii="Arial" w:cs="Arial" w:eastAsia="Arial" w:hAnsi="Arial"/>
+                <w:b w:val="false"/>
+                <w:bCs w:val="false"/>
+                <w:i w:val="false"/>
+                <w:iCs w:val="false"/>
+                <w:sz w:val="20"/>
+                <w:szCs w:val="20"/>
+                <w:rtl w:val="false"/>
+              </w:rPr>
+              <w:t xml:space="preserve">Osama Mohamed Elsayed Ramadan (Faculty of Nursing, Cairo University)</w:t>
+            </w:r>
+          </w:p>
+          <w:p>
+            <w:pPr>
+              <w:bidi w:val="false"/>
+              <w:spacing w:after="40" w:before="0" w:line="276"/>
+              <w:jc w:val="left"/>
+            </w:pPr>
+            <w:r>
+              <w:rPr>
+                <w:rFonts w:ascii="Arial" w:cs="Arial" w:eastAsia="Arial" w:hAnsi="Arial"/>
+                <w:b w:val="false"/>
+                <w:bCs w:val="false"/>
+                <w:i w:val="false"/>
+                <w:iCs w:val="false"/>
+                <w:sz w:val="20"/>
+                <w:szCs w:val="20"/>
+                <w:rtl w:val="false"/>
+              </w:rPr>
+              <w:t xml:space="preserve">Heba Tallah Elashmawy Mohamed Shaban (College of Nursing, Majmaah University)</w:t>
             </w:r>
           </w:p>
         </w:tc>
@@ -438,7 +558,7 @@
                 <w:szCs w:val="20"/>
                 <w:rtl w:val="false"/>
               </w:rPr>
-              <w:t xml:space="preserve">A female member of the research team: a PhD-prepared academic nurse trained in qualitative interviewing. She does not work in your team and has no supervisory or evaluative role over you.</w:t>
+              <w:t xml:space="preserve">A PhD-prepared academic nurse trained in qualitative interviewing. She is outside the participating teams and has no previous personal, supervisory or evaluative relationship with participants.</w:t>
             </w:r>
           </w:p>
         </w:tc>
@@ -490,7 +610,7 @@
           <w:szCs w:val="21"/>
           <w:rtl w:val="false"/>
         </w:rPr>
-        <w:t xml:space="preserve">This study has been reviewed and approved by the following committees and follows the Declaration of Helsinki. Administrative permission has been obtained from the participating maternity services.</w:t>
+        <w:t xml:space="preserve">This study was approved by the following committees and follows the Declaration of Helsinki. Administrative permission was obtained from the participating services.</w:t>
       </w:r>
     </w:p>
     <w:tbl>
@@ -508,9 +628,8 @@
         <w:tblLayout w:type="fixed"/>
       </w:tblPr>
       <w:tblGrid>
-        <w:gridCol w:w="4200"/>
-        <w:gridCol w:w="3438"/>
-        <w:gridCol w:w="2000"/>
+        <w:gridCol w:w="3800"/>
+        <w:gridCol w:w="5838"/>
       </w:tblGrid>
       <w:tr>
         <w:trPr>
@@ -519,7 +638,7 @@
         </w:trPr>
         <w:tc>
           <w:tcPr>
-            <w:tcW w:type="dxa" w:w="4200"/>
+            <w:tcW w:type="dxa" w:w="3800"/>
             <w:tcBorders>
               <w:top w:val="single" w:color="808080" w:sz="4"/>
               <w:left w:val="single" w:color="808080" w:sz="4"/>
@@ -557,7 +676,7 @@
         </w:tc>
         <w:tc>
           <w:tcPr>
-            <w:tcW w:type="dxa" w:w="3438"/>
+            <w:tcW w:type="dxa" w:w="5838"/>
             <w:tcBorders>
               <w:top w:val="single" w:color="808080" w:sz="4"/>
               <w:left w:val="single" w:color="808080" w:sz="4"/>
@@ -589,45 +708,7 @@
                 <w:szCs w:val="20"/>
                 <w:rtl w:val="false"/>
               </w:rPr>
-              <w:t xml:space="preserve">Reference</w:t>
-            </w:r>
-          </w:p>
-        </w:tc>
-        <w:tc>
-          <w:tcPr>
-            <w:tcW w:type="dxa" w:w="2000"/>
-            <w:tcBorders>
-              <w:top w:val="single" w:color="808080" w:sz="4"/>
-              <w:left w:val="single" w:color="808080" w:sz="4"/>
-              <w:bottom w:val="single" w:color="808080" w:sz="4"/>
-              <w:right w:val="single" w:color="808080" w:sz="4"/>
-            </w:tcBorders>
-            <w:shd w:fill="D9E2F3" w:color="auto" w:val="clear"/>
-            <w:tcMar>
-              <w:top w:type="dxa" w:w="30"/>
-              <w:left w:type="dxa" w:w="100"/>
-              <w:bottom w:type="dxa" w:w="30"/>
-              <w:right w:type="dxa" w:w="100"/>
-            </w:tcMar>
-          </w:tcPr>
-          <w:p>
-            <w:pPr>
-              <w:bidi w:val="false"/>
-              <w:spacing w:after="40" w:before="0" w:line="276"/>
-              <w:jc w:val="left"/>
-            </w:pPr>
-            <w:r>
-              <w:rPr>
-                <w:rFonts w:ascii="Arial" w:cs="Arial" w:eastAsia="Arial" w:hAnsi="Arial"/>
-                <w:b/>
-                <w:bCs/>
-                <w:i w:val="false"/>
-                <w:iCs w:val="false"/>
-                <w:sz w:val="20"/>
-                <w:szCs w:val="20"/>
-                <w:rtl w:val="false"/>
-              </w:rPr>
-              <w:t xml:space="preserve">Approval date</w:t>
+              <w:t xml:space="preserve">Reference and approval</w:t>
             </w:r>
           </w:p>
         </w:tc>
@@ -639,7 +720,7 @@
         </w:trPr>
         <w:tc>
           <w:tcPr>
-            <w:tcW w:type="dxa" w:w="4200"/>
+            <w:tcW w:type="dxa" w:w="3800"/>
             <w:tcBorders>
               <w:top w:val="single" w:color="808080" w:sz="4"/>
               <w:left w:val="single" w:color="808080" w:sz="4"/>
@@ -676,7 +757,7 @@
         </w:tc>
         <w:tc>
           <w:tcPr>
-            <w:tcW w:type="dxa" w:w="3438"/>
+            <w:tcW w:type="dxa" w:w="5838"/>
             <w:tcBorders>
               <w:top w:val="single" w:color="808080" w:sz="4"/>
               <w:left w:val="single" w:color="808080" w:sz="4"/>
@@ -707,44 +788,7 @@
                 <w:szCs w:val="20"/>
                 <w:rtl w:val="false"/>
               </w:rPr>
-              <w:t xml:space="preserve">MUREC/COM-4 April 2025/305</w:t>
-            </w:r>
-          </w:p>
-        </w:tc>
-        <w:tc>
-          <w:tcPr>
-            <w:tcW w:type="dxa" w:w="2000"/>
-            <w:tcBorders>
-              <w:top w:val="single" w:color="808080" w:sz="4"/>
-              <w:left w:val="single" w:color="808080" w:sz="4"/>
-              <w:bottom w:val="single" w:color="808080" w:sz="4"/>
-              <w:right w:val="single" w:color="808080" w:sz="4"/>
-            </w:tcBorders>
-            <w:tcMar>
-              <w:top w:type="dxa" w:w="30"/>
-              <w:left w:type="dxa" w:w="100"/>
-              <w:bottom w:type="dxa" w:w="30"/>
-              <w:right w:type="dxa" w:w="100"/>
-            </w:tcMar>
-          </w:tcPr>
-          <w:p>
-            <w:pPr>
-              <w:bidi w:val="false"/>
-              <w:spacing w:after="40" w:before="0" w:line="276"/>
-              <w:jc w:val="left"/>
-            </w:pPr>
-            <w:r>
-              <w:rPr>
-                <w:rFonts w:ascii="Arial" w:cs="Arial" w:eastAsia="Arial" w:hAnsi="Arial"/>
-                <w:b w:val="false"/>
-                <w:bCs w:val="false"/>
-                <w:i w:val="false"/>
-                <w:iCs w:val="false"/>
-                <w:sz w:val="20"/>
-                <w:szCs w:val="20"/>
-                <w:rtl w:val="false"/>
-              </w:rPr>
-              <w:t xml:space="preserve">April 2025</w:t>
+              <w:t xml:space="preserve">Protocol code MUREC/COM-4 April 2025/305</w:t>
             </w:r>
           </w:p>
         </w:tc>
@@ -756,7 +800,7 @@
         </w:trPr>
         <w:tc>
           <w:tcPr>
-            <w:tcW w:type="dxa" w:w="4200"/>
+            <w:tcW w:type="dxa" w:w="3800"/>
             <w:tcBorders>
               <w:top w:val="single" w:color="808080" w:sz="4"/>
               <w:left w:val="single" w:color="808080" w:sz="4"/>
@@ -793,7 +837,7 @@
         </w:tc>
         <w:tc>
           <w:tcPr>
-            <w:tcW w:type="dxa" w:w="3438"/>
+            <w:tcW w:type="dxa" w:w="5838"/>
             <w:tcBorders>
               <w:top w:val="single" w:color="808080" w:sz="4"/>
               <w:left w:val="single" w:color="808080" w:sz="4"/>
@@ -824,44 +868,7 @@
                 <w:szCs w:val="20"/>
                 <w:rtl w:val="false"/>
               </w:rPr>
-              <w:t xml:space="preserve">Committee registration H-13-S-161; approval no. 5670</w:t>
-            </w:r>
-          </w:p>
-        </w:tc>
-        <w:tc>
-          <w:tcPr>
-            <w:tcW w:type="dxa" w:w="2000"/>
-            <w:tcBorders>
-              <w:top w:val="single" w:color="808080" w:sz="4"/>
-              <w:left w:val="single" w:color="808080" w:sz="4"/>
-              <w:bottom w:val="single" w:color="808080" w:sz="4"/>
-              <w:right w:val="single" w:color="808080" w:sz="4"/>
-            </w:tcBorders>
-            <w:tcMar>
-              <w:top w:type="dxa" w:w="30"/>
-              <w:left w:type="dxa" w:w="100"/>
-              <w:bottom w:type="dxa" w:w="30"/>
-              <w:right w:type="dxa" w:w="100"/>
-            </w:tcMar>
-          </w:tcPr>
-          <w:p>
-            <w:pPr>
-              <w:bidi w:val="false"/>
-              <w:spacing w:after="40" w:before="0" w:line="276"/>
-              <w:jc w:val="left"/>
-            </w:pPr>
-            <w:r>
-              <w:rPr>
-                <w:rFonts w:ascii="Arial" w:cs="Arial" w:eastAsia="Arial" w:hAnsi="Arial"/>
-                <w:b w:val="false"/>
-                <w:bCs w:val="false"/>
-                <w:i w:val="false"/>
-                <w:iCs w:val="false"/>
-                <w:sz w:val="20"/>
-                <w:szCs w:val="20"/>
-                <w:rtl w:val="false"/>
-              </w:rPr>
-              <w:t xml:space="preserve">9 May 2025</w:t>
+              <w:t xml:space="preserve">Committee registration H-13-S-161; approval no. 5670; approved 9 May 2025</w:t>
             </w:r>
           </w:p>
         </w:tc>
@@ -873,7 +880,7 @@
         </w:trPr>
         <w:tc>
           <w:tcPr>
-            <w:tcW w:type="dxa" w:w="4200"/>
+            <w:tcW w:type="dxa" w:w="3800"/>
             <w:tcBorders>
               <w:top w:val="single" w:color="808080" w:sz="4"/>
               <w:left w:val="single" w:color="808080" w:sz="4"/>
@@ -910,7 +917,7 @@
         </w:tc>
         <w:tc>
           <w:tcPr>
-            <w:tcW w:type="dxa" w:w="3438"/>
+            <w:tcW w:type="dxa" w:w="5838"/>
             <w:tcBorders>
               <w:top w:val="single" w:color="808080" w:sz="4"/>
               <w:left w:val="single" w:color="808080" w:sz="4"/>
@@ -941,44 +948,7 @@
                 <w:szCs w:val="20"/>
                 <w:rtl w:val="false"/>
               </w:rPr>
-              <w:t xml:space="preserve">KACST IRB registration H-11-08L-074; IRB log no. 2025-66</w:t>
-            </w:r>
-          </w:p>
-        </w:tc>
-        <w:tc>
-          <w:tcPr>
-            <w:tcW w:type="dxa" w:w="2000"/>
-            <w:tcBorders>
-              <w:top w:val="single" w:color="808080" w:sz="4"/>
-              <w:left w:val="single" w:color="808080" w:sz="4"/>
-              <w:bottom w:val="single" w:color="808080" w:sz="4"/>
-              <w:right w:val="single" w:color="808080" w:sz="4"/>
-            </w:tcBorders>
-            <w:tcMar>
-              <w:top w:type="dxa" w:w="30"/>
-              <w:left w:type="dxa" w:w="100"/>
-              <w:bottom w:type="dxa" w:w="30"/>
-              <w:right w:type="dxa" w:w="100"/>
-            </w:tcMar>
-          </w:tcPr>
-          <w:p>
-            <w:pPr>
-              <w:bidi w:val="false"/>
-              <w:spacing w:after="40" w:before="0" w:line="276"/>
-              <w:jc w:val="left"/>
-            </w:pPr>
-            <w:r>
-              <w:rPr>
-                <w:rFonts w:ascii="Arial" w:cs="Arial" w:eastAsia="Arial" w:hAnsi="Arial"/>
-                <w:b w:val="false"/>
-                <w:bCs w:val="false"/>
-                <w:i w:val="false"/>
-                <w:iCs w:val="false"/>
-                <w:sz w:val="20"/>
-                <w:szCs w:val="20"/>
-                <w:rtl w:val="false"/>
-              </w:rPr>
-              <w:t xml:space="preserve">1 June 2025</w:t>
+              <w:t xml:space="preserve">KACST IRB registration H-11-08L-074; IRB log no. 2025-66; approved 1 June 2025</w:t>
             </w:r>
           </w:p>
         </w:tc>
@@ -1025,7 +995,7 @@
           <w:szCs w:val="21"/>
           <w:rtl w:val="false"/>
         </w:rPr>
-        <w:t xml:space="preserve">You are invited to take part in a research study. Please read this information carefully. You will have at least 48 hours to consider it, and you may discuss it with anyone you wish before deciding. Please ask the research team about anything that is unclear.</w:t>
+        <w:t xml:space="preserve">You are invited to take part in a research study. This information is provided in Arabic and English at least 48 hours before the interview.</w:t>
       </w:r>
     </w:p>
     <w:p>
@@ -1046,7 +1016,7 @@
           <w:szCs w:val="23"/>
           <w:rtl w:val="false"/>
         </w:rPr>
-        <w:t xml:space="preserve">1. Why is this study being done?</w:t>
+        <w:t xml:space="preserve">1. What is the study about?</w:t>
       </w:r>
     </w:p>
     <w:p>
@@ -1066,7 +1036,7 @@
           <w:szCs w:val="21"/>
           <w:rtl w:val="false"/>
         </w:rPr>
-        <w:t xml:space="preserve">Hot weather may affect the health of pregnant and postnatal women. Little is known about how midwives working in air-conditioned maternity units think about the conditions women experience outside the facility, such as travel, waiting, work or home conditions, during periods that feel unusually hot. This study aims to understand how midwives recognize and respond to these circumstances before a woman arrives, while she is in the unit, and after she leaves, and what helps or hinders that work. The results may inform future guidance and staff support.</w:t>
+        <w:t xml:space="preserve">Heat is associated with adverse pregnancy outcomes, yet how midwives make circumstances outside cooled clinical settings relevant to maternity care is not well understood. This study aims to understand how registered midwives recognize and respond to heat-related context during periods they perceive as unusually hot in inland Saudi Arabia: before a woman arrives, within cooled services, and after she leaves, and how clinical uncertainty, women’s circumstances and service organization shape their responses.</w:t>
       </w:r>
     </w:p>
     <w:p>
@@ -1087,7 +1057,7 @@
           <w:szCs w:val="23"/>
           <w:rtl w:val="false"/>
         </w:rPr>
-        <w:t xml:space="preserve">2. Why have I been invited?</w:t>
+        <w:t xml:space="preserve">2. Who can take part?</w:t>
       </w:r>
     </w:p>
     <w:p>
@@ -1107,7 +1077,7 @@
           <w:szCs w:val="21"/>
           <w:rtl w:val="false"/>
         </w:rPr>
-        <w:t xml:space="preserve">You have been invited because you may meet all of the following criteria:</w:t>
+        <w:t xml:space="preserve">Public maternity services in three regions of northern and central Saudi Arabia are taking part. You can take part if you have:</w:t>
       </w:r>
     </w:p>
     <w:p>
@@ -1132,7 +1102,7 @@
           <w:szCs w:val="21"/>
           <w:rtl w:val="false"/>
         </w:rPr>
-        <w:t xml:space="preserve">You hold current Saudi Commission for Health Specialties classification and registration in midwifery (Midwife Specialist or Midwife Technician).</w:t>
+        <w:t xml:space="preserve">current Saudi Commission for Health Specialties classification and registration in midwifery (Midwife Specialist or Midwife Technician);</w:t>
       </w:r>
     </w:p>
     <w:p>
@@ -1157,7 +1127,7 @@
           <w:szCs w:val="21"/>
           <w:rtl w:val="false"/>
         </w:rPr>
-        <w:t xml:space="preserve">You have at least 12 months of direct maternity care experience in a participating public maternity service.</w:t>
+        <w:t xml:space="preserve">at least 12 months of direct maternity care in a participating service; and</w:t>
       </w:r>
     </w:p>
     <w:p>
@@ -1182,7 +1152,7 @@
           <w:szCs w:val="21"/>
           <w:rtl w:val="false"/>
         </w:rPr>
-        <w:t xml:space="preserve">You have worked through at least one complete hot season in this region.</w:t>
+        <w:t xml:space="preserve">at least one completed hot season in the region.</w:t>
       </w:r>
     </w:p>
     <w:p>
@@ -1202,7 +1172,7 @@
           <w:szCs w:val="21"/>
           <w:rtl w:val="false"/>
         </w:rPr>
-        <w:t xml:space="preserve">Maternity nurses without midwifery classification, and midwives who line-manage potential participants, cannot take part. About 20–25 midwives from three regions of northern and central Saudi Arabia will be interviewed.</w:t>
+        <w:t xml:space="preserve">Maternity nurses without this classification, and midwives with line-management responsibility for potential participants, cannot take part.</w:t>
       </w:r>
     </w:p>
     <w:p>
@@ -1223,7 +1193,7 @@
           <w:szCs w:val="23"/>
           <w:rtl w:val="false"/>
         </w:rPr>
-        <w:t xml:space="preserve">3. Do I have to take part?</w:t>
+        <w:t xml:space="preserve">3. Is taking part voluntary?</w:t>
       </w:r>
     </w:p>
     <w:p>
@@ -1243,7 +1213,7 @@
           <w:szCs w:val="21"/>
           <w:rtl w:val="false"/>
         </w:rPr>
-        <w:t xml:space="preserve">No. Taking part is entirely voluntary and is not related to your employment, appraisal, contract or licensing. Your managers will not nominate you and will not be told whether you took part. You may decline to answer any question, pause or stop the interview at any time, and withdraw from the study without giving a reason and without any penalty. If you withdraw, your recording and transcript will be destroyed. Once your data have been de-identified and combined with other participants’ data in the analysis, it may no longer be possible to remove them.</w:t>
+        <w:t xml:space="preserve">Yes. Participation is voluntary and unrelated to your employment. Managers do not nominate participants and will not learn who took part.</w:t>
       </w:r>
     </w:p>
     <w:p>
@@ -1289,7 +1259,7 @@
           <w:szCs w:val="21"/>
           <w:rtl w:val="false"/>
         </w:rPr>
-        <w:t xml:space="preserve">You will take part in one individual interview with the interviewer named above, lasting about 60 minutes (it may be shorter or longer depending on what you wish to share).</w:t>
+        <w:t xml:space="preserve">You will take part in an individual interview, in Arabic or English.</w:t>
       </w:r>
     </w:p>
     <w:p>
@@ -1314,7 +1284,7 @@
           <w:szCs w:val="21"/>
           <w:rtl w:val="false"/>
         </w:rPr>
-        <w:t xml:space="preserve">You may choose to be interviewed in Arabic or English.</w:t>
+        <w:t xml:space="preserve">The interview takes place outside clinical duty, at an available appointment you select, in a private room or by encrypted videoconference, with no other person present.</w:t>
       </w:r>
     </w:p>
     <w:p>
@@ -1339,7 +1309,7 @@
           <w:szCs w:val="21"/>
           <w:rtl w:val="false"/>
         </w:rPr>
-        <w:t xml:space="preserve">The interview will take place outside your clinical duty, at a time you choose, either in a private room or by encrypted videoconference. No other person will be present.</w:t>
+        <w:t xml:space="preserve">You will be asked to talk about a recent encounter or work period: recognition, uncertainty, assessment, advice, documentation, transfer, cooling and workload, including instances where heat was unimportant.</w:t>
       </w:r>
     </w:p>
     <w:p>
@@ -1364,7 +1334,7 @@
           <w:szCs w:val="21"/>
           <w:rtl w:val="false"/>
         </w:rPr>
-        <w:t xml:space="preserve">You will be asked to talk about a recent shift or encounter during a hot period: what you noticed, what you were unsure about, and how you approached assessment, advice, documentation, transfer, cooling and workload. Times when heat did not seem important are equally useful.</w:t>
+        <w:t xml:space="preserve">You may be invited to one follow-up interview in the same language to clarify or elaborate on your account.</w:t>
       </w:r>
     </w:p>
     <w:p>
@@ -1389,7 +1359,7 @@
           <w:szCs w:val="21"/>
           <w:rtl w:val="false"/>
         </w:rPr>
-        <w:t xml:space="preserve">Please do not mention the names or other identifying details of women, babies or colleagues. If any are mentioned, they will be removed from the transcript.</w:t>
+        <w:t xml:space="preserve">You will receive a summary of the developing interpretation and may comment on it.</w:t>
       </w:r>
     </w:p>
     <w:p>
@@ -1414,7 +1384,69 @@
           <w:szCs w:val="21"/>
           <w:rtl w:val="false"/>
         </w:rPr>
-        <w:t xml:space="preserve">Optional: you may be invited to one shorter follow-up interview, in the same language, to clarify or expand on your account.</w:t>
+        <w:t xml:space="preserve">There is no reimbursement for taking part.</w:t>
+      </w:r>
+    </w:p>
+    <w:p>
+      <w:pPr>
+        <w:keepNext/>
+        <w:bidi w:val="false"/>
+        <w:spacing w:after="80" w:before="200"/>
+        <w:jc w:val="left"/>
+      </w:pPr>
+      <w:r>
+        <w:rPr>
+          <w:rFonts w:ascii="Arial" w:cs="Arial" w:eastAsia="Arial" w:hAnsi="Arial"/>
+          <w:b/>
+          <w:bCs/>
+          <w:i w:val="false"/>
+          <w:iCs w:val="false"/>
+          <w:sz w:val="23"/>
+          <w:szCs w:val="23"/>
+          <w:rtl w:val="false"/>
+        </w:rPr>
+        <w:t xml:space="preserve">5. Audio recording, transcription and translation</w:t>
+      </w:r>
+    </w:p>
+    <w:p>
+      <w:pPr>
+        <w:bidi w:val="false"/>
+        <w:spacing w:after="100" w:before="0" w:line="276"/>
+        <w:jc w:val="both"/>
+      </w:pPr>
+      <w:r>
+        <w:rPr>
+          <w:rFonts w:ascii="Arial" w:cs="Arial" w:eastAsia="Arial" w:hAnsi="Arial"/>
+          <w:b w:val="false"/>
+          <w:bCs w:val="false"/>
+          <w:i w:val="false"/>
+          <w:iCs w:val="false"/>
+          <w:sz w:val="21"/>
+          <w:szCs w:val="21"/>
+          <w:rtl w:val="false"/>
+        </w:rPr>
+        <w:t xml:space="preserve">The interview will be audio-recorded. One team member will transcribe the recording word-for-word in its original language, and another will check it against the audio. Arabic extracts considered for publication will be translated and independently checked by a second bilingual researcher. Field notes may be written after the interview. Transcripts will not be returned to participants.</w:t>
+      </w:r>
+    </w:p>
+    <w:p>
+      <w:pPr>
+        <w:keepNext/>
+        <w:bidi w:val="false"/>
+        <w:spacing w:after="80" w:before="200"/>
+        <w:jc w:val="left"/>
+      </w:pPr>
+      <w:r>
+        <w:rPr>
+          <w:rFonts w:ascii="Arial" w:cs="Arial" w:eastAsia="Arial" w:hAnsi="Arial"/>
+          <w:b/>
+          <w:bCs/>
+          <w:i w:val="false"/>
+          <w:iCs w:val="false"/>
+          <w:sz w:val="23"/>
+          <w:szCs w:val="23"/>
+          <w:rtl w:val="false"/>
+        </w:rPr>
+        <w:t xml:space="preserve">6. How will my information be protected?</w:t>
       </w:r>
     </w:p>
     <w:p>
@@ -1439,151 +1471,7 @@
           <w:szCs w:val="21"/>
           <w:rtl w:val="false"/>
         </w:rPr>
-        <w:t xml:space="preserve">Optional: you may receive a short written summary of the developing findings and be invited to comment on it.</w:t>
-      </w:r>
-    </w:p>
-    <w:p>
-      <w:pPr>
-        <w:keepNext/>
-        <w:bidi w:val="false"/>
-        <w:spacing w:after="80" w:before="200"/>
-        <w:jc w:val="left"/>
-      </w:pPr>
-      <w:r>
-        <w:rPr>
-          <w:rFonts w:ascii="Arial" w:cs="Arial" w:eastAsia="Arial" w:hAnsi="Arial"/>
-          <w:b/>
-          <w:bCs/>
-          <w:i w:val="false"/>
-          <w:iCs w:val="false"/>
-          <w:sz w:val="23"/>
-          <w:szCs w:val="23"/>
-          <w:rtl w:val="false"/>
-        </w:rPr>
-        <w:t xml:space="preserve">5. Audio recording, transcription and translation</w:t>
-      </w:r>
-    </w:p>
-    <w:p>
-      <w:pPr>
-        <w:bidi w:val="false"/>
-        <w:spacing w:after="100" w:before="0" w:line="276"/>
-        <w:jc w:val="both"/>
-      </w:pPr>
-      <w:r>
-        <w:rPr>
-          <w:rFonts w:ascii="Arial" w:cs="Arial" w:eastAsia="Arial" w:hAnsi="Arial"/>
-          <w:b w:val="false"/>
-          <w:bCs w:val="false"/>
-          <w:i w:val="false"/>
-          <w:iCs w:val="false"/>
-          <w:sz w:val="21"/>
-          <w:szCs w:val="21"/>
-          <w:rtl w:val="false"/>
-        </w:rPr>
-        <w:t xml:space="preserve">The interview will be audio-recorded. Audio recording is needed to take part. One team member will transcribe the recording word-for-word in the language spoken, and another will check the transcript against the audio. Short extracts from Arabic interviews may be translated into English and checked by a second bilingual researcher. The interviewer may also write brief field notes. Transcripts will not be returned to you.</w:t>
-      </w:r>
-    </w:p>
-    <w:p>
-      <w:pPr>
-        <w:keepNext/>
-        <w:bidi w:val="false"/>
-        <w:spacing w:after="80" w:before="200"/>
-        <w:jc w:val="left"/>
-      </w:pPr>
-      <w:r>
-        <w:rPr>
-          <w:rFonts w:ascii="Arial" w:cs="Arial" w:eastAsia="Arial" w:hAnsi="Arial"/>
-          <w:b/>
-          <w:bCs/>
-          <w:i w:val="false"/>
-          <w:iCs w:val="false"/>
-          <w:sz w:val="23"/>
-          <w:szCs w:val="23"/>
-          <w:rtl w:val="false"/>
-        </w:rPr>
-        <w:t xml:space="preserve">6. Are there any risks or disadvantages?</w:t>
-      </w:r>
-    </w:p>
-    <w:p>
-      <w:pPr>
-        <w:bidi w:val="false"/>
-        <w:spacing w:after="100" w:before="0" w:line="276"/>
-        <w:jc w:val="both"/>
-      </w:pPr>
-      <w:r>
-        <w:rPr>
-          <w:rFonts w:ascii="Arial" w:cs="Arial" w:eastAsia="Arial" w:hAnsi="Arial"/>
-          <w:b w:val="false"/>
-          <w:bCs w:val="false"/>
-          <w:i w:val="false"/>
-          <w:iCs w:val="false"/>
-          <w:sz w:val="21"/>
-          <w:szCs w:val="21"/>
-          <w:rtl w:val="false"/>
-        </w:rPr>
-        <w:t xml:space="preserve">Risks are expected to be minimal. The interview will take some of your time. Talking about clinical decisions or working conditions may feel uncomfortable or raise concerns about how your practice may be viewed; you may skip any question or stop at any time. Because the number of participants is small, there is a small risk that someone could recognize you from contextual details. The steps described in Section 8 are designed to reduce this risk.</w:t>
-      </w:r>
-    </w:p>
-    <w:p>
-      <w:pPr>
-        <w:keepNext/>
-        <w:bidi w:val="false"/>
-        <w:spacing w:after="80" w:before="200"/>
-        <w:jc w:val="left"/>
-      </w:pPr>
-      <w:r>
-        <w:rPr>
-          <w:rFonts w:ascii="Arial" w:cs="Arial" w:eastAsia="Arial" w:hAnsi="Arial"/>
-          <w:b/>
-          <w:bCs/>
-          <w:i w:val="false"/>
-          <w:iCs w:val="false"/>
-          <w:sz w:val="23"/>
-          <w:szCs w:val="23"/>
-          <w:rtl w:val="false"/>
-        </w:rPr>
-        <w:t xml:space="preserve">7. Are there any benefits? Will I be paid?</w:t>
-      </w:r>
-    </w:p>
-    <w:p>
-      <w:pPr>
-        <w:bidi w:val="false"/>
-        <w:spacing w:after="100" w:before="0" w:line="276"/>
-        <w:jc w:val="both"/>
-      </w:pPr>
-      <w:r>
-        <w:rPr>
-          <w:rFonts w:ascii="Arial" w:cs="Arial" w:eastAsia="Arial" w:hAnsi="Arial"/>
-          <w:b w:val="false"/>
-          <w:bCs w:val="false"/>
-          <w:i w:val="false"/>
-          <w:iCs w:val="false"/>
-          <w:sz w:val="21"/>
-          <w:szCs w:val="21"/>
-          <w:rtl w:val="false"/>
-        </w:rPr>
-        <w:t xml:space="preserve">There is no direct benefit to you. Your experience may help improve guidance, documentation and staff support in maternity services during hot periods. You will not receive payment or reimbursement, and taking part will not cost you anything.</w:t>
-      </w:r>
-    </w:p>
-    <w:p>
-      <w:pPr>
-        <w:keepNext/>
-        <w:bidi w:val="false"/>
-        <w:spacing w:after="80" w:before="200"/>
-        <w:jc w:val="left"/>
-      </w:pPr>
-      <w:r>
-        <w:rPr>
-          <w:rFonts w:ascii="Arial" w:cs="Arial" w:eastAsia="Arial" w:hAnsi="Arial"/>
-          <w:b/>
-          <w:bCs/>
-          <w:i w:val="false"/>
-          <w:iCs w:val="false"/>
-          <w:sz w:val="23"/>
-          <w:szCs w:val="23"/>
-          <w:rtl w:val="false"/>
-        </w:rPr>
-        <w:t xml:space="preserve">8. How will my information be kept confidential?</w:t>
+        <w:t xml:space="preserve">You will be identified by a code number (P01, P02, …). Codes carry no regional marker.</w:t>
       </w:r>
     </w:p>
     <w:p>
@@ -1608,7 +1496,7 @@
           <w:szCs w:val="21"/>
           <w:rtl w:val="false"/>
         </w:rPr>
-        <w:t xml:space="preserve">You will be given a code number (for example, P07). Your name will not appear on recordings, transcripts or reports.</w:t>
+        <w:t xml:space="preserve">The file linking codes to regions is restricted.</w:t>
       </w:r>
     </w:p>
     <w:p>
@@ -1633,7 +1521,7 @@
           <w:szCs w:val="21"/>
           <w:rtl w:val="false"/>
         </w:rPr>
-        <w:t xml:space="preserve">The file linking your name, code and region will be kept separately with restricted access.</w:t>
+        <w:t xml:space="preserve">Recordings are stored on an encrypted, access-restricted institutional drive.</w:t>
       </w:r>
     </w:p>
     <w:p>
@@ -1658,7 +1546,7 @@
           <w:szCs w:val="21"/>
           <w:rtl w:val="false"/>
         </w:rPr>
-        <w:t xml:space="preserve">Recordings, transcripts and notes will be stored on an encrypted, access-restricted institutional drive available only to the research team.</w:t>
+        <w:t xml:space="preserve">Identifying service and clinical details are removed or generalized. Facility names are not reported.</w:t>
       </w:r>
     </w:p>
     <w:p>
@@ -1683,7 +1571,7 @@
           <w:szCs w:val="21"/>
           <w:rtl w:val="false"/>
         </w:rPr>
-        <w:t xml:space="preserve">Names of facilities, units, places and other identifying details will be removed or made general.</w:t>
+        <w:t xml:space="preserve">Participant characteristics are reported only in aggregate.</w:t>
       </w:r>
     </w:p>
     <w:p>
@@ -1708,57 +1596,7 @@
           <w:szCs w:val="21"/>
           <w:rtl w:val="false"/>
         </w:rPr>
-        <w:t xml:space="preserve">Published reports will describe participants only in aggregate (for example, numbers by experience band), not as individual profiles.</w:t>
-      </w:r>
-    </w:p>
-    <w:p>
-      <w:pPr>
-        <w:pStyle w:val="ListParagraph"/>
-        <w:numPr>
-          <w:ilvl w:val="0"/>
-          <w:numId w:val="2"/>
-        </w:numPr>
-        <w:bidi w:val="false"/>
-        <w:spacing w:after="40" w:before="0" w:line="276"/>
-        <w:jc w:val="both"/>
-      </w:pPr>
-      <w:r>
-        <w:rPr>
-          <w:rFonts w:ascii="Arial" w:cs="Arial" w:eastAsia="Arial" w:hAnsi="Arial"/>
-          <w:b w:val="false"/>
-          <w:bCs w:val="false"/>
-          <w:i w:val="false"/>
-          <w:iCs w:val="false"/>
-          <w:sz w:val="21"/>
-          <w:szCs w:val="21"/>
-          <w:rtl w:val="false"/>
-        </w:rPr>
-        <w:t xml:space="preserve">Transcripts will not be made public. De-identified extracts may be shared with other researchers only on reasonable request and subject to ethics approval.</w:t>
-      </w:r>
-    </w:p>
-    <w:p>
-      <w:pPr>
-        <w:pStyle w:val="ListParagraph"/>
-        <w:numPr>
-          <w:ilvl w:val="0"/>
-          <w:numId w:val="2"/>
-        </w:numPr>
-        <w:bidi w:val="false"/>
-        <w:spacing w:after="40" w:before="0" w:line="276"/>
-        <w:jc w:val="both"/>
-      </w:pPr>
-      <w:r>
-        <w:rPr>
-          <w:rFonts w:ascii="Arial" w:cs="Arial" w:eastAsia="Arial" w:hAnsi="Arial"/>
-          <w:b w:val="false"/>
-          <w:bCs w:val="false"/>
-          <w:i w:val="false"/>
-          <w:iCs w:val="false"/>
-          <w:sz w:val="21"/>
-          <w:szCs w:val="21"/>
-          <w:rtl w:val="false"/>
-        </w:rPr>
-        <w:t xml:space="preserve">Data will be kept securely for the period required by the approving ethics committees and institutional policy, and then securely destroyed.</w:t>
+        <w:t xml:space="preserve">Transcripts are not made publicly available. De-identified excerpts are available from the corresponding author on reasonable request, subject to ethics approval.</w:t>
       </w:r>
     </w:p>
     <w:p>
@@ -1779,7 +1617,7 @@
           <w:szCs w:val="23"/>
           <w:rtl w:val="false"/>
         </w:rPr>
-        <w:t xml:space="preserve">9. What will happen to the results?</w:t>
+        <w:t xml:space="preserve">7. What will happen to the results?</w:t>
       </w:r>
     </w:p>
     <w:p>
@@ -1799,7 +1637,7 @@
           <w:szCs w:val="21"/>
           <w:rtl w:val="false"/>
         </w:rPr>
-        <w:t xml:space="preserve">The results will be published in scientific journals and presented at conferences. These may include short de-identified quotations of your words (translated into English if you spoke Arabic), labelled only with your code number. Quotations will not be used without your consent below.</w:t>
+        <w:t xml:space="preserve">The results will be published. Publications may include de-identified quotations from your interview (translated into English if you were interviewed in Arabic), labelled only by your code number.</w:t>
       </w:r>
     </w:p>
     <w:p>
@@ -1820,7 +1658,7 @@
           <w:szCs w:val="23"/>
           <w:rtl w:val="false"/>
         </w:rPr>
-        <w:t xml:space="preserve">10. Who can I contact?</w:t>
+        <w:t xml:space="preserve">8. Contacts</w:t>
       </w:r>
     </w:p>
     <w:p>
@@ -1840,7 +1678,7 @@
           <w:szCs w:val="21"/>
           <w:rtl w:val="false"/>
         </w:rPr>
-        <w:t xml:space="preserve">For questions about the study: Athar Odah Alshammari (principal investigator), Email: athar.alshammari@uoh.edu.sa; or Nada Alqarawi (corresponding researcher), Email: n.alqarawi@qu.edu.sa.</w:t>
+        <w:t xml:space="preserve">Principal investigator: Athar Odah Alshammari, athar.alshammari@uoh.edu.sa</w:t>
       </w:r>
     </w:p>
     <w:p>
@@ -1860,27 +1698,7 @@
           <w:szCs w:val="21"/>
           <w:rtl w:val="false"/>
         </w:rPr>
-        <w:t xml:space="preserve">For questions about your rights as a participant, or to raise a concern: the Institutional Review Board of Majmaah University, or the ethics committee of your health cluster listed above.</w:t>
-      </w:r>
-    </w:p>
-    <w:p>
-      <w:pPr>
-        <w:bidi w:val="false"/>
-        <w:spacing w:after="100" w:before="0" w:line="276"/>
-        <w:jc w:val="both"/>
-      </w:pPr>
-      <w:r>
-        <w:rPr>
-          <w:rFonts w:ascii="Arial" w:cs="Arial" w:eastAsia="Arial" w:hAnsi="Arial"/>
-          <w:b w:val="false"/>
-          <w:bCs w:val="false"/>
-          <w:i/>
-          <w:iCs/>
-          <w:sz w:val="21"/>
-          <w:szCs w:val="21"/>
-          <w:rtl w:val="false"/>
-        </w:rPr>
-        <w:t xml:space="preserve">Thank you for considering taking part in this study.</w:t>
+        <w:t xml:space="preserve">Corresponding researcher: Nada Alqarawi, n.alqarawi@qu.edu.sa</w:t>
       </w:r>
     </w:p>
     <w:p>
@@ -1931,7 +1749,7 @@
     <w:p>
       <w:pPr>
         <w:bidi w:val="false"/>
-        <w:spacing w:after="80" w:before="0" w:line="276"/>
+        <w:spacing w:after="120" w:before="0" w:line="276"/>
         <w:jc w:val="center"/>
       </w:pPr>
       <w:r>
@@ -1945,7 +1763,7 @@
           <w:szCs w:val="20"/>
           <w:rtl w:val="false"/>
         </w:rPr>
-        <w:t xml:space="preserve">Participant code (completed by research team): P____        Region code: ____</w:t>
+        <w:t xml:space="preserve">Participant code (completed by research team): P____</w:t>
       </w:r>
     </w:p>
     <w:p>
@@ -2141,8 +1959,8 @@
                 <w:bCs w:val="false"/>
                 <w:i w:val="false"/>
                 <w:iCs w:val="false"/>
-                <w:sz w:val="19"/>
-                <w:szCs w:val="19"/>
+                <w:sz w:val="20"/>
+                <w:szCs w:val="20"/>
                 <w:rtl w:val="false"/>
               </w:rPr>
               <w:t xml:space="preserve">1</w:t>
@@ -2178,11 +1996,11 @@
                 <w:bCs w:val="false"/>
                 <w:i w:val="false"/>
                 <w:iCs w:val="false"/>
-                <w:sz w:val="19"/>
-                <w:szCs w:val="19"/>
+                <w:sz w:val="20"/>
+                <w:szCs w:val="20"/>
                 <w:rtl w:val="false"/>
               </w:rPr>
-              <w:t xml:space="preserve">I have read (or have had read to me) the Participant Information Sheet (Part A) of this document. I received it at least 48 hours before the interview, I have had the opportunity to ask questions, and my questions have been answered satisfactorily.</w:t>
+              <w:t xml:space="preserve">I have received and read the Participant Information Sheet (Part A) at least 48 hours before the interview.</w:t>
             </w:r>
           </w:p>
         </w:tc>
@@ -2245,8 +2063,8 @@
                 <w:bCs w:val="false"/>
                 <w:i w:val="false"/>
                 <w:iCs w:val="false"/>
-                <w:sz w:val="19"/>
-                <w:szCs w:val="19"/>
+                <w:sz w:val="20"/>
+                <w:szCs w:val="20"/>
                 <w:rtl w:val="false"/>
               </w:rPr>
               <w:t xml:space="preserve">2</w:t>
@@ -2282,11 +2100,11 @@
                 <w:bCs w:val="false"/>
                 <w:i w:val="false"/>
                 <w:iCs w:val="false"/>
-                <w:sz w:val="19"/>
-                <w:szCs w:val="19"/>
+                <w:sz w:val="20"/>
+                <w:szCs w:val="20"/>
                 <w:rtl w:val="false"/>
               </w:rPr>
-              <w:t xml:space="preserve">I confirm that I am a registered midwife classified by the Saudi Commission for Health Specialties, with at least 12 months of direct maternity care in a participating service and at least one completed hot season in this region.</w:t>
+              <w:t xml:space="preserve">I confirm that I hold current Saudi Commission for Health Specialties classification and registration in midwifery, have at least 12 months of direct maternity care in a participating service, and have completed at least one hot season in the region.</w:t>
             </w:r>
           </w:p>
         </w:tc>
@@ -2349,8 +2167,8 @@
                 <w:bCs w:val="false"/>
                 <w:i w:val="false"/>
                 <w:iCs w:val="false"/>
-                <w:sz w:val="19"/>
-                <w:szCs w:val="19"/>
+                <w:sz w:val="20"/>
+                <w:szCs w:val="20"/>
                 <w:rtl w:val="false"/>
               </w:rPr>
               <w:t xml:space="preserve">3</w:t>
@@ -2386,11 +2204,11 @@
                 <w:bCs w:val="false"/>
                 <w:i w:val="false"/>
                 <w:iCs w:val="false"/>
-                <w:sz w:val="19"/>
-                <w:szCs w:val="19"/>
+                <w:sz w:val="20"/>
+                <w:szCs w:val="20"/>
                 <w:rtl w:val="false"/>
               </w:rPr>
-              <w:t xml:space="preserve">I understand that my participation is voluntary and unrelated to my employment, and that I am free to decline any question or withdraw at any time without giving a reason and without any effect on my work or legal rights.</w:t>
+              <w:t xml:space="preserve">I understand that my participation is voluntary and unrelated to my employment, and that managers will not learn whether I took part.</w:t>
             </w:r>
           </w:p>
         </w:tc>
@@ -2453,8 +2271,8 @@
                 <w:bCs w:val="false"/>
                 <w:i w:val="false"/>
                 <w:iCs w:val="false"/>
-                <w:sz w:val="19"/>
-                <w:szCs w:val="19"/>
+                <w:sz w:val="20"/>
+                <w:szCs w:val="20"/>
                 <w:rtl w:val="false"/>
               </w:rPr>
               <w:t xml:space="preserve">4</w:t>
@@ -2490,11 +2308,11 @@
                 <w:bCs w:val="false"/>
                 <w:i w:val="false"/>
                 <w:iCs w:val="false"/>
-                <w:sz w:val="19"/>
-                <w:szCs w:val="19"/>
+                <w:sz w:val="20"/>
+                <w:szCs w:val="20"/>
                 <w:rtl w:val="false"/>
               </w:rPr>
-              <w:t xml:space="preserve">I understand that my managers will not be told whether I took part.</w:t>
+              <w:t xml:space="preserve">I agree to take part in an individual interview for this study.</w:t>
             </w:r>
           </w:p>
         </w:tc>
@@ -2557,8 +2375,8 @@
                 <w:bCs w:val="false"/>
                 <w:i w:val="false"/>
                 <w:iCs w:val="false"/>
-                <w:sz w:val="19"/>
-                <w:szCs w:val="19"/>
+                <w:sz w:val="20"/>
+                <w:szCs w:val="20"/>
                 <w:rtl w:val="false"/>
               </w:rPr>
               <w:t xml:space="preserve">5</w:t>
@@ -2594,11 +2412,11 @@
                 <w:bCs w:val="false"/>
                 <w:i w:val="false"/>
                 <w:iCs w:val="false"/>
-                <w:sz w:val="19"/>
-                <w:szCs w:val="19"/>
+                <w:sz w:val="20"/>
+                <w:szCs w:val="20"/>
                 <w:rtl w:val="false"/>
               </w:rPr>
-              <w:t xml:space="preserve">I agree to take part in an individual interview for this study.</w:t>
+              <w:t xml:space="preserve">I agree to the interview being audio-recorded.</w:t>
             </w:r>
           </w:p>
         </w:tc>
@@ -2661,8 +2479,8 @@
                 <w:bCs w:val="false"/>
                 <w:i w:val="false"/>
                 <w:iCs w:val="false"/>
-                <w:sz w:val="19"/>
-                <w:szCs w:val="19"/>
+                <w:sz w:val="20"/>
+                <w:szCs w:val="20"/>
                 <w:rtl w:val="false"/>
               </w:rPr>
               <w:t xml:space="preserve">6</w:t>
@@ -2698,11 +2516,11 @@
                 <w:bCs w:val="false"/>
                 <w:i w:val="false"/>
                 <w:iCs w:val="false"/>
-                <w:sz w:val="19"/>
-                <w:szCs w:val="19"/>
+                <w:sz w:val="20"/>
+                <w:szCs w:val="20"/>
                 <w:rtl w:val="false"/>
               </w:rPr>
-              <w:t xml:space="preserve">I agree to the interview being audio-recorded and transcribed.</w:t>
+              <w:t xml:space="preserve">I agree to the publication of de-identified quotations from my interview.</w:t>
             </w:r>
           </w:p>
         </w:tc>
@@ -2765,8 +2583,8 @@
                 <w:bCs w:val="false"/>
                 <w:i w:val="false"/>
                 <w:iCs w:val="false"/>
-                <w:sz w:val="19"/>
-                <w:szCs w:val="19"/>
+                <w:sz w:val="20"/>
+                <w:szCs w:val="20"/>
                 <w:rtl w:val="false"/>
               </w:rPr>
               <w:t xml:space="preserve">7</w:t>
@@ -2802,115 +2620,11 @@
                 <w:bCs w:val="false"/>
                 <w:i w:val="false"/>
                 <w:iCs w:val="false"/>
-                <w:sz w:val="19"/>
-                <w:szCs w:val="19"/>
+                <w:sz w:val="20"/>
+                <w:szCs w:val="20"/>
                 <w:rtl w:val="false"/>
               </w:rPr>
-              <w:t xml:space="preserve">I agree that short de-identified quotations from my interview (translated into English where necessary) may be used in publications and presentations, identified only by a code number.</w:t>
-            </w:r>
-          </w:p>
-        </w:tc>
-        <w:tc>
-          <w:tcPr>
-            <w:tcW w:type="dxa" w:w="1300"/>
-            <w:tcBorders>
-              <w:top w:val="single" w:color="808080" w:sz="4"/>
-              <w:left w:val="single" w:color="808080" w:sz="4"/>
-              <w:bottom w:val="single" w:color="808080" w:sz="4"/>
-              <w:right w:val="single" w:color="808080" w:sz="4"/>
-            </w:tcBorders>
-            <w:tcMar>
-              <w:top w:type="dxa" w:w="30"/>
-              <w:left w:type="dxa" w:w="100"/>
-              <w:bottom w:type="dxa" w:w="30"/>
-              <w:right w:type="dxa" w:w="100"/>
-            </w:tcMar>
-          </w:tcPr>
-          <w:p>
-            <w:pPr>
-              <w:bidi w:val="false"/>
-              <w:spacing w:after="40" w:before="0" w:line="276"/>
-              <w:jc w:val="left"/>
-            </w:pPr>
-          </w:p>
-        </w:tc>
-      </w:tr>
-      <w:tr>
-        <w:trPr>
-          <w:cantSplit/>
-          <w:tblHeader w:val="false"/>
-        </w:trPr>
-        <w:tc>
-          <w:tcPr>
-            <w:tcW w:type="dxa" w:w="700"/>
-            <w:tcBorders>
-              <w:top w:val="single" w:color="808080" w:sz="4"/>
-              <w:left w:val="single" w:color="808080" w:sz="4"/>
-              <w:bottom w:val="single" w:color="808080" w:sz="4"/>
-              <w:right w:val="single" w:color="808080" w:sz="4"/>
-            </w:tcBorders>
-            <w:tcMar>
-              <w:top w:type="dxa" w:w="30"/>
-              <w:left w:type="dxa" w:w="100"/>
-              <w:bottom w:type="dxa" w:w="30"/>
-              <w:right w:type="dxa" w:w="100"/>
-            </w:tcMar>
-          </w:tcPr>
-          <w:p>
-            <w:pPr>
-              <w:bidi w:val="false"/>
-              <w:spacing w:after="40" w:before="0" w:line="276"/>
-              <w:jc w:val="left"/>
-            </w:pPr>
-            <w:r>
-              <w:rPr>
-                <w:rFonts w:ascii="Arial" w:cs="Arial" w:eastAsia="Arial" w:hAnsi="Arial"/>
-                <w:b w:val="false"/>
-                <w:bCs w:val="false"/>
-                <w:i w:val="false"/>
-                <w:iCs w:val="false"/>
-                <w:sz w:val="19"/>
-                <w:szCs w:val="19"/>
-                <w:rtl w:val="false"/>
-              </w:rPr>
-              <w:t xml:space="preserve">8</w:t>
-            </w:r>
-          </w:p>
-        </w:tc>
-        <w:tc>
-          <w:tcPr>
-            <w:tcW w:type="dxa" w:w="7638"/>
-            <w:tcBorders>
-              <w:top w:val="single" w:color="808080" w:sz="4"/>
-              <w:left w:val="single" w:color="808080" w:sz="4"/>
-              <w:bottom w:val="single" w:color="808080" w:sz="4"/>
-              <w:right w:val="single" w:color="808080" w:sz="4"/>
-            </w:tcBorders>
-            <w:tcMar>
-              <w:top w:type="dxa" w:w="30"/>
-              <w:left w:type="dxa" w:w="100"/>
-              <w:bottom w:type="dxa" w:w="30"/>
-              <w:right w:type="dxa" w:w="100"/>
-            </w:tcMar>
-          </w:tcPr>
-          <w:p>
-            <w:pPr>
-              <w:bidi w:val="false"/>
-              <w:spacing w:after="40" w:before="0" w:line="276"/>
-              <w:jc w:val="left"/>
-            </w:pPr>
-            <w:r>
-              <w:rPr>
-                <w:rFonts w:ascii="Arial" w:cs="Arial" w:eastAsia="Arial" w:hAnsi="Arial"/>
-                <w:b w:val="false"/>
-                <w:bCs w:val="false"/>
-                <w:i w:val="false"/>
-                <w:iCs w:val="false"/>
-                <w:sz w:val="19"/>
-                <w:szCs w:val="19"/>
-                <w:rtl w:val="false"/>
-              </w:rPr>
-              <w:t xml:space="preserve">I understand that my information will be stored securely and handled confidentially as described in the Information Sheet, and that de-identified extracts may be shared with other researchers only on request and with ethics approval.</w:t>
+              <w:t xml:space="preserve">I understand that my information will be stored and handled as described in the Participant Information Sheet.</w:t>
             </w:r>
           </w:p>
         </w:tc>
@@ -2942,7 +2656,7 @@
     </w:tbl>
     <w:p>
       <w:pPr>
-        <w:spacing w:after="60"/>
+        <w:spacing w:after="100"/>
       </w:pPr>
     </w:p>
     <w:p>
@@ -2963,7 +2677,7 @@
           <w:szCs w:val="21"/>
           <w:rtl w:val="false"/>
         </w:rPr>
-        <w:t xml:space="preserve">Optional items (please tick one box for each). Your answers do not affect your participation.</w:t>
+        <w:t xml:space="preserve">Please tick one box for each item.</w:t>
       </w:r>
     </w:p>
     <w:tbl>
@@ -3182,7 +2896,7 @@
                 <w:szCs w:val="20"/>
                 <w:rtl w:val="false"/>
               </w:rPr>
-              <w:t xml:space="preserve">9</w:t>
+              <w:t xml:space="preserve">8</w:t>
             </w:r>
           </w:p>
         </w:tc>
@@ -3219,161 +2933,7 @@
                 <w:szCs w:val="20"/>
                 <w:rtl w:val="false"/>
               </w:rPr>
-              <w:t xml:space="preserve">I agree to be contacted about a possible follow-up interview.</w:t>
-            </w:r>
-          </w:p>
-        </w:tc>
-        <w:tc>
-          <w:tcPr>
-            <w:tcW w:type="dxa" w:w="650"/>
-            <w:tcBorders>
-              <w:top w:val="single" w:color="808080" w:sz="4"/>
-              <w:left w:val="single" w:color="808080" w:sz="4"/>
-              <w:bottom w:val="single" w:color="808080" w:sz="4"/>
-              <w:right w:val="single" w:color="808080" w:sz="4"/>
-            </w:tcBorders>
-            <w:tcMar>
-              <w:top w:type="dxa" w:w="30"/>
-              <w:left w:type="dxa" w:w="100"/>
-              <w:bottom w:type="dxa" w:w="30"/>
-              <w:right w:type="dxa" w:w="100"/>
-            </w:tcMar>
-          </w:tcPr>
-          <w:p>
-            <w:pPr>
-              <w:bidi w:val="false"/>
-              <w:spacing w:after="40" w:before="0" w:line="276"/>
-              <w:jc w:val="left"/>
-            </w:pPr>
-            <w:r>
-              <w:rPr>
-                <w:rFonts w:ascii="Arial" w:cs="Arial" w:eastAsia="Arial" w:hAnsi="Arial"/>
-                <w:b w:val="false"/>
-                <w:bCs w:val="false"/>
-                <w:i w:val="false"/>
-                <w:iCs w:val="false"/>
-                <w:sz w:val="20"/>
-                <w:szCs w:val="20"/>
-                <w:rtl w:val="false"/>
-              </w:rPr>
-              <w:t xml:space="preserve">☐</w:t>
-            </w:r>
-          </w:p>
-        </w:tc>
-        <w:tc>
-          <w:tcPr>
-            <w:tcW w:type="dxa" w:w="650"/>
-            <w:tcBorders>
-              <w:top w:val="single" w:color="808080" w:sz="4"/>
-              <w:left w:val="single" w:color="808080" w:sz="4"/>
-              <w:bottom w:val="single" w:color="808080" w:sz="4"/>
-              <w:right w:val="single" w:color="808080" w:sz="4"/>
-            </w:tcBorders>
-            <w:tcMar>
-              <w:top w:type="dxa" w:w="30"/>
-              <w:left w:type="dxa" w:w="100"/>
-              <w:bottom w:type="dxa" w:w="30"/>
-              <w:right w:type="dxa" w:w="100"/>
-            </w:tcMar>
-          </w:tcPr>
-          <w:p>
-            <w:pPr>
-              <w:bidi w:val="false"/>
-              <w:spacing w:after="40" w:before="0" w:line="276"/>
-              <w:jc w:val="left"/>
-            </w:pPr>
-            <w:r>
-              <w:rPr>
-                <w:rFonts w:ascii="Arial" w:cs="Arial" w:eastAsia="Arial" w:hAnsi="Arial"/>
-                <w:b w:val="false"/>
-                <w:bCs w:val="false"/>
-                <w:i w:val="false"/>
-                <w:iCs w:val="false"/>
-                <w:sz w:val="20"/>
-                <w:szCs w:val="20"/>
-                <w:rtl w:val="false"/>
-              </w:rPr>
-              <w:t xml:space="preserve">☐</w:t>
-            </w:r>
-          </w:p>
-        </w:tc>
-      </w:tr>
-      <w:tr>
-        <w:trPr>
-          <w:cantSplit/>
-          <w:tblHeader w:val="false"/>
-        </w:trPr>
-        <w:tc>
-          <w:tcPr>
-            <w:tcW w:type="dxa" w:w="700"/>
-            <w:tcBorders>
-              <w:top w:val="single" w:color="808080" w:sz="4"/>
-              <w:left w:val="single" w:color="808080" w:sz="4"/>
-              <w:bottom w:val="single" w:color="808080" w:sz="4"/>
-              <w:right w:val="single" w:color="808080" w:sz="4"/>
-            </w:tcBorders>
-            <w:tcMar>
-              <w:top w:type="dxa" w:w="30"/>
-              <w:left w:type="dxa" w:w="100"/>
-              <w:bottom w:type="dxa" w:w="30"/>
-              <w:right w:type="dxa" w:w="100"/>
-            </w:tcMar>
-          </w:tcPr>
-          <w:p>
-            <w:pPr>
-              <w:bidi w:val="false"/>
-              <w:spacing w:after="40" w:before="0" w:line="276"/>
-              <w:jc w:val="left"/>
-            </w:pPr>
-            <w:r>
-              <w:rPr>
-                <w:rFonts w:ascii="Arial" w:cs="Arial" w:eastAsia="Arial" w:hAnsi="Arial"/>
-                <w:b w:val="false"/>
-                <w:bCs w:val="false"/>
-                <w:i w:val="false"/>
-                <w:iCs w:val="false"/>
-                <w:sz w:val="20"/>
-                <w:szCs w:val="20"/>
-                <w:rtl w:val="false"/>
-              </w:rPr>
-              <w:t xml:space="preserve">10</w:t>
-            </w:r>
-          </w:p>
-        </w:tc>
-        <w:tc>
-          <w:tcPr>
-            <w:tcW w:type="dxa" w:w="7638"/>
-            <w:tcBorders>
-              <w:top w:val="single" w:color="808080" w:sz="4"/>
-              <w:left w:val="single" w:color="808080" w:sz="4"/>
-              <w:bottom w:val="single" w:color="808080" w:sz="4"/>
-              <w:right w:val="single" w:color="808080" w:sz="4"/>
-            </w:tcBorders>
-            <w:tcMar>
-              <w:top w:type="dxa" w:w="30"/>
-              <w:left w:type="dxa" w:w="100"/>
-              <w:bottom w:type="dxa" w:w="30"/>
-              <w:right w:type="dxa" w:w="100"/>
-            </w:tcMar>
-          </w:tcPr>
-          <w:p>
-            <w:pPr>
-              <w:bidi w:val="false"/>
-              <w:spacing w:after="40" w:before="0" w:line="276"/>
-              <w:jc w:val="left"/>
-            </w:pPr>
-            <w:r>
-              <w:rPr>
-                <w:rFonts w:ascii="Arial" w:cs="Arial" w:eastAsia="Arial" w:hAnsi="Arial"/>
-                <w:b w:val="false"/>
-                <w:bCs w:val="false"/>
-                <w:i w:val="false"/>
-                <w:iCs w:val="false"/>
-                <w:sz w:val="20"/>
-                <w:szCs w:val="20"/>
-                <w:rtl w:val="false"/>
-              </w:rPr>
-              <w:t xml:space="preserve">I would like to receive a summary of the developing findings and to be invited to comment on it.</w:t>
+              <w:t xml:space="preserve">I agree to be contacted for a possible follow-up interview.</w:t>
             </w:r>
           </w:p>
         </w:tc>
@@ -3455,7 +3015,7 @@
     </w:tbl>
     <w:p>
       <w:pPr>
-        <w:spacing w:after="60"/>
+        <w:spacing w:after="100"/>
       </w:pPr>
     </w:p>
     <w:tbl>
@@ -3513,7 +3073,7 @@
                 <w:szCs w:val="20"/>
                 <w:rtl w:val="false"/>
               </w:rPr>
-              <w:t xml:space="preserve">Preferred interview language:</w:t>
+              <w:t xml:space="preserve">Interview language:</w:t>
             </w:r>
           </w:p>
         </w:tc>
@@ -3593,7 +3153,7 @@
                 <w:szCs w:val="20"/>
                 <w:rtl w:val="false"/>
               </w:rPr>
-              <w:t xml:space="preserve">Preferred interview mode:</w:t>
+              <w:t xml:space="preserve">Interview mode:</w:t>
             </w:r>
           </w:p>
         </w:tc>
@@ -3673,7 +3233,7 @@
                 <w:szCs w:val="20"/>
                 <w:rtl w:val="false"/>
               </w:rPr>
-              <w:t xml:space="preserve">Preferred contact (for follow-up/summary only):</w:t>
+              <w:t xml:space="preserve">Contact for follow-up and summary:</w:t>
             </w:r>
           </w:p>
         </w:tc>
@@ -3718,7 +3278,7 @@
     </w:tbl>
     <w:p>
       <w:pPr>
-        <w:spacing w:after="80"/>
+        <w:spacing w:after="140"/>
       </w:pPr>
     </w:p>
     <w:tbl>
@@ -3927,6 +3487,26 @@
               <w:t xml:space="preserve">Participant</w:t>
             </w:r>
           </w:p>
+          <w:p>
+            <w:pPr>
+              <w:bidi w:val="false"/>
+              <w:spacing w:after="40" w:before="0" w:line="276"/>
+              <w:jc w:val="left"/>
+            </w:pPr>
+            <w:r>
+              <w:rPr>
+                <w:rFonts w:ascii="Arial" w:cs="Arial" w:eastAsia="Arial" w:hAnsi="Arial"/>
+                <w:b w:val="false"/>
+                <w:bCs w:val="false"/>
+                <w:i w:val="false"/>
+                <w:iCs w:val="false"/>
+                <w:sz w:val="20"/>
+                <w:szCs w:val="20"/>
+                <w:rtl w:val="false"/>
+              </w:rPr>
+              <w:t xml:space="preserve"> </w:t>
+            </w:r>
+          </w:p>
         </w:tc>
         <w:tc>
           <w:tcPr>
@@ -4042,6 +3622,26 @@
               <w:t xml:space="preserve">Researcher obtaining consent</w:t>
             </w:r>
           </w:p>
+          <w:p>
+            <w:pPr>
+              <w:bidi w:val="false"/>
+              <w:spacing w:after="40" w:before="0" w:line="276"/>
+              <w:jc w:val="left"/>
+            </w:pPr>
+            <w:r>
+              <w:rPr>
+                <w:rFonts w:ascii="Arial" w:cs="Arial" w:eastAsia="Arial" w:hAnsi="Arial"/>
+                <w:b w:val="false"/>
+                <w:bCs w:val="false"/>
+                <w:i w:val="false"/>
+                <w:iCs w:val="false"/>
+                <w:sz w:val="20"/>
+                <w:szCs w:val="20"/>
+                <w:rtl w:val="false"/>
+              </w:rPr>
+              <w:t xml:space="preserve"> </w:t>
+            </w:r>
+          </w:p>
         </w:tc>
         <w:tc>
           <w:tcPr>
@@ -4117,31 +3717,6 @@
         </w:tc>
       </w:tr>
     </w:tbl>
-    <w:p>
-      <w:pPr>
-        <w:spacing w:after="80"/>
-      </w:pPr>
-    </w:p>
-    <w:p>
-      <w:pPr>
-        <w:bidi w:val="false"/>
-        <w:spacing w:after="100" w:before="0" w:line="276"/>
-        <w:jc w:val="both"/>
-      </w:pPr>
-      <w:r>
-        <w:rPr>
-          <w:rFonts w:ascii="Arial" w:cs="Arial" w:eastAsia="Arial" w:hAnsi="Arial"/>
-          <w:b w:val="false"/>
-          <w:bCs w:val="false"/>
-          <w:i/>
-          <w:iCs/>
-          <w:sz w:val="19"/>
-          <w:szCs w:val="19"/>
-          <w:rtl w:val="false"/>
-        </w:rPr>
-        <w:t xml:space="preserve">For videoconference interviews, the signed consent form is returned to the research team before the interview begins.</w:t>
-      </w:r>
-    </w:p>
     <w:p>
       <w:pPr>
         <w:sectPr>
@@ -4429,7 +4004,27 @@
                 <w:szCs w:val="20"/>
                 <w:rtl/>
               </w:rPr>
-              <w:t xml:space="preserve">Nada Alqarawi، قسم تمريض المجتمع والتمريض النفسي والصحة النفسية، كلية التمريض، جامعة القصيم، بريدة، المملكة العربية السعودية. البريد الإلكتروني: n.alqarawi@qu.edu.sa</w:t>
+              <w:t xml:space="preserve">Nada Alqarawi، قسم تمريض المجتمع والتمريض النفسي والصحة النفسية، كلية التمريض، جامعة القصيم، بريدة، المملكة العربية السعودية</w:t>
+            </w:r>
+          </w:p>
+          <w:p>
+            <w:pPr>
+              <w:bidi/>
+              <w:spacing w:after="40" w:before="0" w:line="276"/>
+              <w:jc w:val="right"/>
+            </w:pPr>
+            <w:r>
+              <w:rPr>
+                <w:rFonts w:ascii="Arial" w:cs="Arial" w:eastAsia="Arial" w:hAnsi="Arial"/>
+                <w:b w:val="false"/>
+                <w:bCs w:val="false"/>
+                <w:i w:val="false"/>
+                <w:iCs w:val="false"/>
+                <w:sz w:val="20"/>
+                <w:szCs w:val="20"/>
+                <w:rtl/>
+              </w:rPr>
+              <w:t xml:space="preserve">البريد الإلكتروني: n.alqarawi@qu.edu.sa</w:t>
             </w:r>
           </w:p>
         </w:tc>
@@ -4689,7 +4284,7 @@
                 <w:szCs w:val="20"/>
                 <w:rtl/>
               </w:rPr>
-              <w:t xml:space="preserve">عضوة في فريق البحث: ممرضة أكاديمية حاصلة على الدكتوراه ومدرَّبة على إجراء المقابلات النوعية. لا تعمل ضمن فريقك وليس لها أي دور إشرافي أو تقييمي عليك.</w:t>
+              <w:t xml:space="preserve">ممرضة أكاديمية حاصلة على الدكتوراه ومدرَّبة على إجراء المقابلات النوعية، من خارج الفرق المشاركة، وليس لها أي علاقة سابقة شخصية أو إشرافية أو تقييمية بالمشاركات.</w:t>
             </w:r>
           </w:p>
         </w:tc>
@@ -4741,7 +4336,7 @@
           <w:szCs w:val="21"/>
           <w:rtl/>
         </w:rPr>
-        <w:t xml:space="preserve">تمت مراجعة هذه الدراسة والموافقة عليها من اللجان التالية، وهي تلتزم بإعلان هلسنكي. كما تم الحصول على الإذن الإداري من خدمات الأمومة المشاركة.</w:t>
+        <w:t xml:space="preserve">حصلت هذه الدراسة على موافقة اللجان التالية، وهي تلتزم بإعلان هلسنكي. كما تم الحصول على الإذن الإداري من الخدمات المشاركة.</w:t>
       </w:r>
     </w:p>
     <w:tbl>
@@ -4759,9 +4354,8 @@
         <w:tblLayout w:type="fixed"/>
       </w:tblPr>
       <w:tblGrid>
-        <w:gridCol w:w="4200"/>
-        <w:gridCol w:w="3438"/>
-        <w:gridCol w:w="2000"/>
+        <w:gridCol w:w="3800"/>
+        <w:gridCol w:w="5838"/>
       </w:tblGrid>
       <w:tr>
         <w:trPr>
@@ -4770,7 +4364,7 @@
         </w:trPr>
         <w:tc>
           <w:tcPr>
-            <w:tcW w:type="dxa" w:w="4200"/>
+            <w:tcW w:type="dxa" w:w="3800"/>
             <w:tcBorders>
               <w:top w:val="single" w:color="808080" w:sz="4"/>
               <w:left w:val="single" w:color="808080" w:sz="4"/>
@@ -4808,7 +4402,7 @@
         </w:tc>
         <w:tc>
           <w:tcPr>
-            <w:tcW w:type="dxa" w:w="3438"/>
+            <w:tcW w:type="dxa" w:w="5838"/>
             <w:tcBorders>
               <w:top w:val="single" w:color="808080" w:sz="4"/>
               <w:left w:val="single" w:color="808080" w:sz="4"/>
@@ -4840,45 +4434,7 @@
                 <w:szCs w:val="20"/>
                 <w:rtl/>
               </w:rPr>
-              <w:t xml:space="preserve">المرجع</w:t>
-            </w:r>
-          </w:p>
-        </w:tc>
-        <w:tc>
-          <w:tcPr>
-            <w:tcW w:type="dxa" w:w="2000"/>
-            <w:tcBorders>
-              <w:top w:val="single" w:color="808080" w:sz="4"/>
-              <w:left w:val="single" w:color="808080" w:sz="4"/>
-              <w:bottom w:val="single" w:color="808080" w:sz="4"/>
-              <w:right w:val="single" w:color="808080" w:sz="4"/>
-            </w:tcBorders>
-            <w:shd w:fill="D9E2F3" w:color="auto" w:val="clear"/>
-            <w:tcMar>
-              <w:top w:type="dxa" w:w="30"/>
-              <w:left w:type="dxa" w:w="100"/>
-              <w:bottom w:type="dxa" w:w="30"/>
-              <w:right w:type="dxa" w:w="100"/>
-            </w:tcMar>
-          </w:tcPr>
-          <w:p>
-            <w:pPr>
-              <w:bidi/>
-              <w:spacing w:after="40" w:before="0" w:line="276"/>
-              <w:jc w:val="right"/>
-            </w:pPr>
-            <w:r>
-              <w:rPr>
-                <w:rFonts w:ascii="Arial" w:cs="Arial" w:eastAsia="Arial" w:hAnsi="Arial"/>
-                <w:b/>
-                <w:bCs/>
-                <w:i w:val="false"/>
-                <w:iCs w:val="false"/>
-                <w:sz w:val="20"/>
-                <w:szCs w:val="20"/>
-                <w:rtl/>
-              </w:rPr>
-              <w:t xml:space="preserve">تاريخ الموافقة</w:t>
+              <w:t xml:space="preserve">المرجع والموافقة</w:t>
             </w:r>
           </w:p>
         </w:tc>
@@ -4890,7 +4446,7 @@
         </w:trPr>
         <w:tc>
           <w:tcPr>
-            <w:tcW w:type="dxa" w:w="4200"/>
+            <w:tcW w:type="dxa" w:w="3800"/>
             <w:tcBorders>
               <w:top w:val="single" w:color="808080" w:sz="4"/>
               <w:left w:val="single" w:color="808080" w:sz="4"/>
@@ -4927,7 +4483,7 @@
         </w:tc>
         <w:tc>
           <w:tcPr>
-            <w:tcW w:type="dxa" w:w="3438"/>
+            <w:tcW w:type="dxa" w:w="5838"/>
             <w:tcBorders>
               <w:top w:val="single" w:color="808080" w:sz="4"/>
               <w:left w:val="single" w:color="808080" w:sz="4"/>
@@ -4958,44 +4514,7 @@
                 <w:szCs w:val="20"/>
                 <w:rtl/>
               </w:rPr>
-              <w:t xml:space="preserve">MUREC/COM-4 April 2025/305</w:t>
-            </w:r>
-          </w:p>
-        </w:tc>
-        <w:tc>
-          <w:tcPr>
-            <w:tcW w:type="dxa" w:w="2000"/>
-            <w:tcBorders>
-              <w:top w:val="single" w:color="808080" w:sz="4"/>
-              <w:left w:val="single" w:color="808080" w:sz="4"/>
-              <w:bottom w:val="single" w:color="808080" w:sz="4"/>
-              <w:right w:val="single" w:color="808080" w:sz="4"/>
-            </w:tcBorders>
-            <w:tcMar>
-              <w:top w:type="dxa" w:w="30"/>
-              <w:left w:type="dxa" w:w="100"/>
-              <w:bottom w:type="dxa" w:w="30"/>
-              <w:right w:type="dxa" w:w="100"/>
-            </w:tcMar>
-          </w:tcPr>
-          <w:p>
-            <w:pPr>
-              <w:bidi/>
-              <w:spacing w:after="40" w:before="0" w:line="276"/>
-              <w:jc w:val="right"/>
-            </w:pPr>
-            <w:r>
-              <w:rPr>
-                <w:rFonts w:ascii="Arial" w:cs="Arial" w:eastAsia="Arial" w:hAnsi="Arial"/>
-                <w:b w:val="false"/>
-                <w:bCs w:val="false"/>
-                <w:i w:val="false"/>
-                <w:iCs w:val="false"/>
-                <w:sz w:val="20"/>
-                <w:szCs w:val="20"/>
-                <w:rtl/>
-              </w:rPr>
-              <w:t xml:space="preserve">أبريل 2025</w:t>
+              <w:t xml:space="preserve">رمز البروتوكول MUREC/COM-4 April 2025/305</w:t>
             </w:r>
           </w:p>
         </w:tc>
@@ -5007,7 +4526,7 @@
         </w:trPr>
         <w:tc>
           <w:tcPr>
-            <w:tcW w:type="dxa" w:w="4200"/>
+            <w:tcW w:type="dxa" w:w="3800"/>
             <w:tcBorders>
               <w:top w:val="single" w:color="808080" w:sz="4"/>
               <w:left w:val="single" w:color="808080" w:sz="4"/>
@@ -5044,7 +4563,7 @@
         </w:tc>
         <w:tc>
           <w:tcPr>
-            <w:tcW w:type="dxa" w:w="3438"/>
+            <w:tcW w:type="dxa" w:w="5838"/>
             <w:tcBorders>
               <w:top w:val="single" w:color="808080" w:sz="4"/>
               <w:left w:val="single" w:color="808080" w:sz="4"/>
@@ -5075,44 +4594,7 @@
                 <w:szCs w:val="20"/>
                 <w:rtl/>
               </w:rPr>
-              <w:t xml:space="preserve">تسجيل اللجنة H-13-S-161؛ رقم الموافقة 5670</w:t>
-            </w:r>
-          </w:p>
-        </w:tc>
-        <w:tc>
-          <w:tcPr>
-            <w:tcW w:type="dxa" w:w="2000"/>
-            <w:tcBorders>
-              <w:top w:val="single" w:color="808080" w:sz="4"/>
-              <w:left w:val="single" w:color="808080" w:sz="4"/>
-              <w:bottom w:val="single" w:color="808080" w:sz="4"/>
-              <w:right w:val="single" w:color="808080" w:sz="4"/>
-            </w:tcBorders>
-            <w:tcMar>
-              <w:top w:type="dxa" w:w="30"/>
-              <w:left w:type="dxa" w:w="100"/>
-              <w:bottom w:type="dxa" w:w="30"/>
-              <w:right w:type="dxa" w:w="100"/>
-            </w:tcMar>
-          </w:tcPr>
-          <w:p>
-            <w:pPr>
-              <w:bidi/>
-              <w:spacing w:after="40" w:before="0" w:line="276"/>
-              <w:jc w:val="right"/>
-            </w:pPr>
-            <w:r>
-              <w:rPr>
-                <w:rFonts w:ascii="Arial" w:cs="Arial" w:eastAsia="Arial" w:hAnsi="Arial"/>
-                <w:b w:val="false"/>
-                <w:bCs w:val="false"/>
-                <w:i w:val="false"/>
-                <w:iCs w:val="false"/>
-                <w:sz w:val="20"/>
-                <w:szCs w:val="20"/>
-                <w:rtl/>
-              </w:rPr>
-              <w:t xml:space="preserve">9 مايو 2025</w:t>
+              <w:t xml:space="preserve">تسجيل اللجنة H-13-S-161؛ رقم الموافقة 5670؛ بتاريخ 9 مايو 2025</w:t>
             </w:r>
           </w:p>
         </w:tc>
@@ -5124,7 +4606,7 @@
         </w:trPr>
         <w:tc>
           <w:tcPr>
-            <w:tcW w:type="dxa" w:w="4200"/>
+            <w:tcW w:type="dxa" w:w="3800"/>
             <w:tcBorders>
               <w:top w:val="single" w:color="808080" w:sz="4"/>
               <w:left w:val="single" w:color="808080" w:sz="4"/>
@@ -5161,7 +4643,7 @@
         </w:tc>
         <w:tc>
           <w:tcPr>
-            <w:tcW w:type="dxa" w:w="3438"/>
+            <w:tcW w:type="dxa" w:w="5838"/>
             <w:tcBorders>
               <w:top w:val="single" w:color="808080" w:sz="4"/>
               <w:left w:val="single" w:color="808080" w:sz="4"/>
@@ -5192,44 +4674,7 @@
                 <w:szCs w:val="20"/>
                 <w:rtl/>
               </w:rPr>
-              <w:t xml:space="preserve">تسجيل KACST رقم H-11-08L-074؛ رقم السجل 2025-66</w:t>
-            </w:r>
-          </w:p>
-        </w:tc>
-        <w:tc>
-          <w:tcPr>
-            <w:tcW w:type="dxa" w:w="2000"/>
-            <w:tcBorders>
-              <w:top w:val="single" w:color="808080" w:sz="4"/>
-              <w:left w:val="single" w:color="808080" w:sz="4"/>
-              <w:bottom w:val="single" w:color="808080" w:sz="4"/>
-              <w:right w:val="single" w:color="808080" w:sz="4"/>
-            </w:tcBorders>
-            <w:tcMar>
-              <w:top w:type="dxa" w:w="30"/>
-              <w:left w:type="dxa" w:w="100"/>
-              <w:bottom w:type="dxa" w:w="30"/>
-              <w:right w:type="dxa" w:w="100"/>
-            </w:tcMar>
-          </w:tcPr>
-          <w:p>
-            <w:pPr>
-              <w:bidi/>
-              <w:spacing w:after="40" w:before="0" w:line="276"/>
-              <w:jc w:val="right"/>
-            </w:pPr>
-            <w:r>
-              <w:rPr>
-                <w:rFonts w:ascii="Arial" w:cs="Arial" w:eastAsia="Arial" w:hAnsi="Arial"/>
-                <w:b w:val="false"/>
-                <w:bCs w:val="false"/>
-                <w:i w:val="false"/>
-                <w:iCs w:val="false"/>
-                <w:sz w:val="20"/>
-                <w:szCs w:val="20"/>
-                <w:rtl/>
-              </w:rPr>
-              <w:t xml:space="preserve">1 يونيو 2025</w:t>
+              <w:t xml:space="preserve">تسجيل KACST رقم H-11-08L-074؛ رقم السجل 2025-66؛ بتاريخ 1 يونيو 2025</w:t>
             </w:r>
           </w:p>
         </w:tc>
@@ -5276,7 +4721,7 @@
           <w:szCs w:val="21"/>
           <w:rtl/>
         </w:rPr>
-        <w:t xml:space="preserve">أنتِ مدعوة للمشاركة في دراسة بحثية. يُرجى قراءة هذه المعلومات بعناية. سيكون لديكِ ما لا يقل عن 48 ساعة للتفكير فيها، ويمكنكِ مناقشتها مع من تشائين قبل اتخاذ قراركِ. لا تترددي في سؤال فريق البحث عن أي أمر غير واضح.</w:t>
+        <w:t xml:space="preserve">أنتِ مدعوة للمشاركة في دراسة بحثية. تُقدَّم هذه المعلومات باللغتين العربية والإنجليزية قبل المقابلة بما لا يقل عن 48 ساعة.</w:t>
       </w:r>
     </w:p>
     <w:p>
@@ -5297,7 +4742,7 @@
           <w:szCs w:val="23"/>
           <w:rtl/>
         </w:rPr>
-        <w:t xml:space="preserve">1. لماذا تُجرى هذه الدراسة؟</w:t>
+        <w:t xml:space="preserve">1. عمَّ تتحدث الدراسة؟</w:t>
       </w:r>
     </w:p>
     <w:p>
@@ -5317,7 +4762,7 @@
           <w:szCs w:val="21"/>
           <w:rtl/>
         </w:rPr>
-        <w:t xml:space="preserve">قد يؤثر الطقس الحار على صحة النساء الحوامل والنفاس. ولا يُعرف إلا القليل عن كيفية تفكير القابلات العاملات في وحدات الأمومة المكيَّفة في الظروف التي تمر بها المرأة خارج المنشأة، مثل التنقل والانتظار وظروف العمل أو المنزل، خلال الفترات التي يُشعر فيها بحرارة غير معتادة. تهدف هذه الدراسة إلى فهم كيف تتعرف القابلات على هذه الظروف ويستجبن لها قبل وصول المرأة، وأثناء وجودها في الوحدة، وبعد مغادرتها، وما الذي يساعد هذا العمل أو يعيقه. وقد تسهم النتائج في إعداد إرشادات مستقبلية ودعم العاملين.</w:t>
+        <w:t xml:space="preserve">ترتبط الحرارة بنتائج سلبية للحمل، إلا أن كيفية تعامل القابلات مع الظروف خارج البيئات السريرية المكيَّفة وربطها برعاية الأمومة لا تزال غير مفهومة بشكل كافٍ. تهدف هذه الدراسة إلى فهم كيف تتعرف القابلات المسجلات على السياق المرتبط بالحرارة ويستجبن له خلال الفترات التي يرينها حارة بشكل غير معتاد في المناطق الداخلية من المملكة العربية السعودية: قبل وصول المرأة، وداخل الخدمات المكيَّفة، وبعد مغادرتها، وكيف يؤثر عدم اليقين السريري وظروف المرأة وتنظيم الخدمة على هذه الاستجابات.</w:t>
       </w:r>
     </w:p>
     <w:p>
@@ -5338,7 +4783,7 @@
           <w:szCs w:val="23"/>
           <w:rtl/>
         </w:rPr>
-        <w:t xml:space="preserve">2. لماذا تمت دعوتي؟</w:t>
+        <w:t xml:space="preserve">2. من يمكنه المشاركة؟</w:t>
       </w:r>
     </w:p>
     <w:p>
@@ -5358,7 +4803,7 @@
           <w:szCs w:val="21"/>
           <w:rtl/>
         </w:rPr>
-        <w:t xml:space="preserve">تمت دعوتكِ لأنكِ قد تستوفين جميع المعايير التالية:</w:t>
+        <w:t xml:space="preserve">تشارك في الدراسة خدمات أمومة حكومية في ثلاث مناطق في شمال ووسط المملكة العربية السعودية. يمكنكِ المشاركة إذا كان لديكِ:</w:t>
       </w:r>
     </w:p>
     <w:p>
@@ -5383,7 +4828,7 @@
           <w:szCs w:val="21"/>
           <w:rtl/>
         </w:rPr>
-        <w:t xml:space="preserve">لديكِ تصنيف وتسجيل ساريان في القبالة من الهيئة السعودية للتخصصات الصحية (أخصائية قبالة أو فنية قبالة).</w:t>
+        <w:t xml:space="preserve">تصنيف وتسجيل ساريان في القبالة من الهيئة السعودية للتخصصات الصحية (أخصائية قبالة أو فنية قبالة)؛</w:t>
       </w:r>
     </w:p>
     <w:p>
@@ -5408,7 +4853,7 @@
           <w:szCs w:val="21"/>
           <w:rtl/>
         </w:rPr>
-        <w:t xml:space="preserve">لديكِ خبرة لا تقل عن 12 شهرًا في الرعاية المباشرة للأمومة في إحدى خدمات الأمومة الحكومية المشاركة.</w:t>
+        <w:t xml:space="preserve">خبرة لا تقل عن 12 شهرًا في الرعاية المباشرة للأمومة في خدمة مشاركة؛</w:t>
       </w:r>
     </w:p>
     <w:p>
@@ -5433,7 +4878,7 @@
           <w:szCs w:val="21"/>
           <w:rtl/>
         </w:rPr>
-        <w:t xml:space="preserve">عملتِ خلال موسم حار كامل واحد على الأقل في هذه المنطقة.</w:t>
+        <w:t xml:space="preserve">موسم حار مكتمل واحد على الأقل في المنطقة.</w:t>
       </w:r>
     </w:p>
     <w:p>
@@ -5453,7 +4898,7 @@
           <w:szCs w:val="21"/>
           <w:rtl/>
         </w:rPr>
-        <w:t xml:space="preserve">لا يمكن مشاركة ممرضات الأمومة غير الحاصلات على تصنيف القبالة، ولا القابلات اللواتي يتولين الإدارة المباشرة لمشاركات محتملات. ستُجرى مقابلات مع نحو 20–25 قابلة من ثلاث مناطق في شمال ووسط المملكة العربية السعودية.</w:t>
+        <w:t xml:space="preserve">لا يمكن مشاركة ممرضات الأمومة غير الحاصلات على هذا التصنيف، ولا القابلات اللواتي لديهن مسؤولية إدارية مباشرة على مشاركات محتملات.</w:t>
       </w:r>
     </w:p>
     <w:p>
@@ -5474,7 +4919,7 @@
           <w:szCs w:val="23"/>
           <w:rtl/>
         </w:rPr>
-        <w:t xml:space="preserve">3. هل يجب عليّ المشاركة؟</w:t>
+        <w:t xml:space="preserve">3. هل المشاركة تطوعية؟</w:t>
       </w:r>
     </w:p>
     <w:p>
@@ -5494,7 +4939,7 @@
           <w:szCs w:val="21"/>
           <w:rtl/>
         </w:rPr>
-        <w:t xml:space="preserve">لا. المشاركة تطوعية بالكامل ولا علاقة لها بوظيفتكِ أو تقييم أدائكِ أو عقدكِ أو ترخيصكِ المهني. لن يرشحكِ مديروكِ ولن يُبلَّغوا بمشاركتكِ من عدمها. يمكنكِ الامتناع عن الإجابة عن أي سؤال، أو إيقاف المقابلة مؤقتًا أو إنهاؤها في أي وقت، والانسحاب من الدراسة دون إبداء أسباب ودون أي عواقب. في حال انسحابكِ سيتم إتلاف التسجيل والنص المكتوب الخاص بكِ. وبعد إزالة المعلومات التعريفية من بياناتكِ ودمجها مع بيانات المشاركات الأخريات في التحليل، قد يتعذر حذفها.</w:t>
+        <w:t xml:space="preserve">نعم. المشاركة تطوعية ولا علاقة لها بوظيفتكِ. لا يرشح المديرون المشاركات ولن يعلموا من شارك.</w:t>
       </w:r>
     </w:p>
     <w:p>
@@ -5540,7 +4985,7 @@
           <w:szCs w:val="21"/>
           <w:rtl/>
         </w:rPr>
-        <w:t xml:space="preserve">ستشاركين في مقابلة فردية واحدة مع القائمة بالمقابلة المذكورة أعلاه، تستغرق نحو 60 دقيقة (وقد تقل أو تزيد بحسب ما ترغبين في مشاركته).</w:t>
+        <w:t xml:space="preserve">ستشاركين في مقابلة فردية باللغة العربية أو الإنجليزية.</w:t>
       </w:r>
     </w:p>
     <w:p>
@@ -5565,7 +5010,7 @@
           <w:szCs w:val="21"/>
           <w:rtl/>
         </w:rPr>
-        <w:t xml:space="preserve">يمكنكِ اختيار إجراء المقابلة باللغة العربية أو الإنجليزية.</w:t>
+        <w:t xml:space="preserve">تُجرى المقابلة خارج أوقات العمل السريري، في موعد متاح تختارينه، في غرفة خاصة أو عبر اتصال مرئي مشفَّر، دون حضور أي شخص آخر.</w:t>
       </w:r>
     </w:p>
     <w:p>
@@ -5590,7 +5035,7 @@
           <w:szCs w:val="21"/>
           <w:rtl/>
         </w:rPr>
-        <w:t xml:space="preserve">ستُجرى المقابلة خارج أوقات عملكِ السريري، في الوقت الذي تختارينه، إما في غرفة خاصة أو عبر اتصال مرئي مشفَّر، ولن يحضرها أي شخص آخر.</w:t>
+        <w:t xml:space="preserve">سيُطلب منكِ الحديث عن موقف أو فترة عمل حديثة: التعرف، وعدم اليقين، والتقييم، والنصح، والتوثيق، والنقل، والتبريد، وعبء العمل، بما في ذلك المواقف التي لم تكن فيها الحرارة مهمة.</w:t>
       </w:r>
     </w:p>
     <w:p>
@@ -5615,7 +5060,7 @@
           <w:szCs w:val="21"/>
           <w:rtl/>
         </w:rPr>
-        <w:t xml:space="preserve">سيُطلب منكِ الحديث عن مناوبة أو موقف حديث خلال فترة حارة: ما الذي لاحظتِه، وما الذي لم تكوني متأكدة منه، وكيف تعاملتِ مع التقييم والنصح والتوثيق والنقل والتبريد وعبء العمل. كما أن المواقف التي لم تبدُ فيها الحرارة مهمة مفيدة بالقدر نفسه.</w:t>
+        <w:t xml:space="preserve">قد تتم دعوتكِ إلى مقابلة متابعة واحدة باللغة نفسها لتوضيح ما ذكرتِه أو التوسع فيه.</w:t>
       </w:r>
     </w:p>
     <w:p>
@@ -5640,7 +5085,7 @@
           <w:szCs w:val="21"/>
           <w:rtl/>
         </w:rPr>
-        <w:t xml:space="preserve">يُرجى عدم ذكر أسماء النساء أو المواليد أو الزميلات أو أي تفاصيل تعريفية عنهم. وفي حال ذكرها ستُحذف من النص المكتوب.</w:t>
+        <w:t xml:space="preserve">ستتلقين ملخصًا للتفسير الأولي للنتائج ويمكنكِ إبداء ملاحظاتكِ عليه.</w:t>
       </w:r>
     </w:p>
     <w:p>
@@ -5665,7 +5110,69 @@
           <w:szCs w:val="21"/>
           <w:rtl/>
         </w:rPr>
-        <w:t xml:space="preserve">اختياري: قد تتم دعوتكِ إلى مقابلة متابعة واحدة أقصر، باللغة نفسها، لتوضيح ما ذكرتِه أو التوسع فيه.</w:t>
+        <w:t xml:space="preserve">لا يوجد أي تعويض مالي مقابل المشاركة.</w:t>
+      </w:r>
+    </w:p>
+    <w:p>
+      <w:pPr>
+        <w:keepNext/>
+        <w:bidi/>
+        <w:spacing w:after="80" w:before="200"/>
+        <w:jc w:val="right"/>
+      </w:pPr>
+      <w:r>
+        <w:rPr>
+          <w:rFonts w:ascii="Arial" w:cs="Arial" w:eastAsia="Arial" w:hAnsi="Arial"/>
+          <w:b/>
+          <w:bCs/>
+          <w:i w:val="false"/>
+          <w:iCs w:val="false"/>
+          <w:sz w:val="23"/>
+          <w:szCs w:val="23"/>
+          <w:rtl/>
+        </w:rPr>
+        <w:t xml:space="preserve">5. التسجيل الصوتي والتفريغ والترجمة</w:t>
+      </w:r>
+    </w:p>
+    <w:p>
+      <w:pPr>
+        <w:bidi/>
+        <w:spacing w:after="100" w:before="0" w:line="276"/>
+        <w:jc w:val="right"/>
+      </w:pPr>
+      <w:r>
+        <w:rPr>
+          <w:rFonts w:ascii="Arial" w:cs="Arial" w:eastAsia="Arial" w:hAnsi="Arial"/>
+          <w:b w:val="false"/>
+          <w:bCs w:val="false"/>
+          <w:i w:val="false"/>
+          <w:iCs w:val="false"/>
+          <w:sz w:val="21"/>
+          <w:szCs w:val="21"/>
+          <w:rtl/>
+        </w:rPr>
+        <w:t xml:space="preserve">سيتم تسجيل المقابلة صوتيًا. ستقوم إحدى عضوات الفريق بتفريغ التسجيل حرفيًا بلغته الأصلية، وستقوم أخرى بمراجعته مقابل التسجيل. تُترجم المقتطفات العربية المرشحة للنشر وتراجعها بشكل مستقل باحثة ثانية ثنائية اللغة. قد تُكتب ملاحظات ميدانية بعد المقابلة. لن تُعاد النصوص المكتوبة إلى المشاركات.</w:t>
+      </w:r>
+    </w:p>
+    <w:p>
+      <w:pPr>
+        <w:keepNext/>
+        <w:bidi/>
+        <w:spacing w:after="80" w:before="200"/>
+        <w:jc w:val="right"/>
+      </w:pPr>
+      <w:r>
+        <w:rPr>
+          <w:rFonts w:ascii="Arial" w:cs="Arial" w:eastAsia="Arial" w:hAnsi="Arial"/>
+          <w:b/>
+          <w:bCs/>
+          <w:i w:val="false"/>
+          <w:iCs w:val="false"/>
+          <w:sz w:val="23"/>
+          <w:szCs w:val="23"/>
+          <w:rtl/>
+        </w:rPr>
+        <w:t xml:space="preserve">6. كيف ستُحمى معلوماتي؟</w:t>
       </w:r>
     </w:p>
     <w:p>
@@ -5690,151 +5197,7 @@
           <w:szCs w:val="21"/>
           <w:rtl/>
         </w:rPr>
-        <w:t xml:space="preserve">اختياري: قد تتلقين ملخصًا مكتوبًا قصيرًا للنتائج الأولية وتُدعين لإبداء ملاحظاتكِ عليه.</w:t>
-      </w:r>
-    </w:p>
-    <w:p>
-      <w:pPr>
-        <w:keepNext/>
-        <w:bidi/>
-        <w:spacing w:after="80" w:before="200"/>
-        <w:jc w:val="right"/>
-      </w:pPr>
-      <w:r>
-        <w:rPr>
-          <w:rFonts w:ascii="Arial" w:cs="Arial" w:eastAsia="Arial" w:hAnsi="Arial"/>
-          <w:b/>
-          <w:bCs/>
-          <w:i w:val="false"/>
-          <w:iCs w:val="false"/>
-          <w:sz w:val="23"/>
-          <w:szCs w:val="23"/>
-          <w:rtl/>
-        </w:rPr>
-        <w:t xml:space="preserve">5. التسجيل الصوتي والتفريغ والترجمة</w:t>
-      </w:r>
-    </w:p>
-    <w:p>
-      <w:pPr>
-        <w:bidi/>
-        <w:spacing w:after="100" w:before="0" w:line="276"/>
-        <w:jc w:val="right"/>
-      </w:pPr>
-      <w:r>
-        <w:rPr>
-          <w:rFonts w:ascii="Arial" w:cs="Arial" w:eastAsia="Arial" w:hAnsi="Arial"/>
-          <w:b w:val="false"/>
-          <w:bCs w:val="false"/>
-          <w:i w:val="false"/>
-          <w:iCs w:val="false"/>
-          <w:sz w:val="21"/>
-          <w:szCs w:val="21"/>
-          <w:rtl/>
-        </w:rPr>
-        <w:t xml:space="preserve">سيتم تسجيل المقابلة صوتيًا، والتسجيل الصوتي شرط للمشاركة. ستقوم إحدى عضوات الفريق بتفريغ التسجيل حرفيًا باللغة التي جرت بها المقابلة، وستقوم أخرى بمراجعة النص مقابل التسجيل. قد تُترجم مقتطفات قصيرة من المقابلات العربية إلى الإنجليزية وتراجعها باحثة ثانية ثنائية اللغة. وقد تدوِّن القائمة بالمقابلة ملاحظات ميدانية موجزة. لن تُعاد النصوص المكتوبة إليكِ.</w:t>
-      </w:r>
-    </w:p>
-    <w:p>
-      <w:pPr>
-        <w:keepNext/>
-        <w:bidi/>
-        <w:spacing w:after="80" w:before="200"/>
-        <w:jc w:val="right"/>
-      </w:pPr>
-      <w:r>
-        <w:rPr>
-          <w:rFonts w:ascii="Arial" w:cs="Arial" w:eastAsia="Arial" w:hAnsi="Arial"/>
-          <w:b/>
-          <w:bCs/>
-          <w:i w:val="false"/>
-          <w:iCs w:val="false"/>
-          <w:sz w:val="23"/>
-          <w:szCs w:val="23"/>
-          <w:rtl/>
-        </w:rPr>
-        <w:t xml:space="preserve">6. هل توجد أي مخاطر أو سلبيات؟</w:t>
-      </w:r>
-    </w:p>
-    <w:p>
-      <w:pPr>
-        <w:bidi/>
-        <w:spacing w:after="100" w:before="0" w:line="276"/>
-        <w:jc w:val="right"/>
-      </w:pPr>
-      <w:r>
-        <w:rPr>
-          <w:rFonts w:ascii="Arial" w:cs="Arial" w:eastAsia="Arial" w:hAnsi="Arial"/>
-          <w:b w:val="false"/>
-          <w:bCs w:val="false"/>
-          <w:i w:val="false"/>
-          <w:iCs w:val="false"/>
-          <w:sz w:val="21"/>
-          <w:szCs w:val="21"/>
-          <w:rtl/>
-        </w:rPr>
-        <w:t xml:space="preserve">يُتوقع أن تكون المخاطر في حدها الأدنى. ستستغرق المقابلة جزءًا من وقتكِ. وقد يسبب الحديث عن القرارات السريرية أو ظروف العمل شعورًا بعدم الارتياح أو قلقًا بشأن كيفية النظر إلى ممارستكِ؛ ويمكنكِ تخطي أي سؤال أو التوقف في أي وقت. ونظرًا لقلة عدد المشاركات، هناك احتمال ضئيل أن يتعرف أحد عليكِ من تفاصيل السياق، والإجراءات الموضحة في البند 8 مصممة لتقليل هذا الاحتمال.</w:t>
-      </w:r>
-    </w:p>
-    <w:p>
-      <w:pPr>
-        <w:keepNext/>
-        <w:bidi/>
-        <w:spacing w:after="80" w:before="200"/>
-        <w:jc w:val="right"/>
-      </w:pPr>
-      <w:r>
-        <w:rPr>
-          <w:rFonts w:ascii="Arial" w:cs="Arial" w:eastAsia="Arial" w:hAnsi="Arial"/>
-          <w:b/>
-          <w:bCs/>
-          <w:i w:val="false"/>
-          <w:iCs w:val="false"/>
-          <w:sz w:val="23"/>
-          <w:szCs w:val="23"/>
-          <w:rtl/>
-        </w:rPr>
-        <w:t xml:space="preserve">7. هل توجد فوائد؟ وهل سأحصل على مقابل مادي؟</w:t>
-      </w:r>
-    </w:p>
-    <w:p>
-      <w:pPr>
-        <w:bidi/>
-        <w:spacing w:after="100" w:before="0" w:line="276"/>
-        <w:jc w:val="right"/>
-      </w:pPr>
-      <w:r>
-        <w:rPr>
-          <w:rFonts w:ascii="Arial" w:cs="Arial" w:eastAsia="Arial" w:hAnsi="Arial"/>
-          <w:b w:val="false"/>
-          <w:bCs w:val="false"/>
-          <w:i w:val="false"/>
-          <w:iCs w:val="false"/>
-          <w:sz w:val="21"/>
-          <w:szCs w:val="21"/>
-          <w:rtl/>
-        </w:rPr>
-        <w:t xml:space="preserve">لا توجد فائدة مباشرة لكِ. وقد تسهم تجربتكِ في تحسين الإرشادات والتوثيق ودعم العاملين في خدمات الأمومة خلال الفترات الحارة. لن تحصلي على أي مقابل مادي أو تعويض، ولن تتحملي أي تكلفة مقابل المشاركة.</w:t>
-      </w:r>
-    </w:p>
-    <w:p>
-      <w:pPr>
-        <w:keepNext/>
-        <w:bidi/>
-        <w:spacing w:after="80" w:before="200"/>
-        <w:jc w:val="right"/>
-      </w:pPr>
-      <w:r>
-        <w:rPr>
-          <w:rFonts w:ascii="Arial" w:cs="Arial" w:eastAsia="Arial" w:hAnsi="Arial"/>
-          <w:b/>
-          <w:bCs/>
-          <w:i w:val="false"/>
-          <w:iCs w:val="false"/>
-          <w:sz w:val="23"/>
-          <w:szCs w:val="23"/>
-          <w:rtl/>
-        </w:rPr>
-        <w:t xml:space="preserve">8. كيف ستُحفظ سرية معلوماتي؟</w:t>
+        <w:t xml:space="preserve">سيُشار إليكِ برمز رقمي (مثل P01) لا يتضمن أي إشارة إلى المنطقة.</w:t>
       </w:r>
     </w:p>
     <w:p>
@@ -5859,7 +5222,7 @@
           <w:szCs w:val="21"/>
           <w:rtl/>
         </w:rPr>
-        <w:t xml:space="preserve">سيُعطى لكِ رمز رقمي (مثل P07)، ولن يظهر اسمكِ على التسجيلات أو النصوص أو التقارير.</w:t>
+        <w:t xml:space="preserve">الملف الذي يربط الرموز بالمناطق مقيد الوصول.</w:t>
       </w:r>
     </w:p>
     <w:p>
@@ -5884,7 +5247,7 @@
           <w:szCs w:val="21"/>
           <w:rtl/>
         </w:rPr>
-        <w:t xml:space="preserve">يُحفظ الملف الذي يربط اسمكِ برمزكِ ومنطقتكِ بشكل منفصل وبصلاحيات وصول مقيدة.</w:t>
+        <w:t xml:space="preserve">تُحفظ التسجيلات على وحدة تخزين مؤسسية مشفَّرة ومقيدة الوصول.</w:t>
       </w:r>
     </w:p>
     <w:p>
@@ -5909,7 +5272,7 @@
           <w:szCs w:val="21"/>
           <w:rtl/>
         </w:rPr>
-        <w:t xml:space="preserve">تُحفظ التسجيلات والنصوص والملاحظات على وحدة تخزين مؤسسية مشفَّرة ومقيدة الوصول، متاحة لفريق البحث فقط.</w:t>
+        <w:t xml:space="preserve">تُحذف التفاصيل التعريفية المتعلقة بالخدمة أو الحالات السريرية أو تُعمَّم، ولا تُذكر أسماء المنشآت.</w:t>
       </w:r>
     </w:p>
     <w:p>
@@ -5934,7 +5297,7 @@
           <w:szCs w:val="21"/>
           <w:rtl/>
         </w:rPr>
-        <w:t xml:space="preserve">ستُحذف أسماء المنشآت والوحدات والأماكن وأي تفاصيل تعريفية أخرى أو تُعمَّم.</w:t>
+        <w:t xml:space="preserve">تُعرض خصائص المشاركات بصورة إجمالية فقط.</w:t>
       </w:r>
     </w:p>
     <w:p>
@@ -5959,57 +5322,7 @@
           <w:szCs w:val="21"/>
           <w:rtl/>
         </w:rPr>
-        <w:t xml:space="preserve">ستصف التقارير المنشورة المشاركات بصورة إجمالية فقط (مثل الأعداد حسب فئات الخبرة)، وليس بملفات فردية.</w:t>
-      </w:r>
-    </w:p>
-    <w:p>
-      <w:pPr>
-        <w:pStyle w:val="ListParagraph"/>
-        <w:numPr>
-          <w:ilvl w:val="0"/>
-          <w:numId w:val="3"/>
-        </w:numPr>
-        <w:bidi/>
-        <w:spacing w:after="40" w:before="0" w:line="276"/>
-        <w:jc w:val="right"/>
-      </w:pPr>
-      <w:r>
-        <w:rPr>
-          <w:rFonts w:ascii="Arial" w:cs="Arial" w:eastAsia="Arial" w:hAnsi="Arial"/>
-          <w:b w:val="false"/>
-          <w:bCs w:val="false"/>
-          <w:i w:val="false"/>
-          <w:iCs w:val="false"/>
-          <w:sz w:val="21"/>
-          <w:szCs w:val="21"/>
-          <w:rtl/>
-        </w:rPr>
-        <w:t xml:space="preserve">لن تُتاح النصوص للعامة. وقد تُشارَك مقتطفات خالية من المعلومات التعريفية مع باحثين آخرين فقط عند تقديم طلب معقول وبعد الحصول على موافقة أخلاقية.</w:t>
-      </w:r>
-    </w:p>
-    <w:p>
-      <w:pPr>
-        <w:pStyle w:val="ListParagraph"/>
-        <w:numPr>
-          <w:ilvl w:val="0"/>
-          <w:numId w:val="3"/>
-        </w:numPr>
-        <w:bidi/>
-        <w:spacing w:after="40" w:before="0" w:line="276"/>
-        <w:jc w:val="right"/>
-      </w:pPr>
-      <w:r>
-        <w:rPr>
-          <w:rFonts w:ascii="Arial" w:cs="Arial" w:eastAsia="Arial" w:hAnsi="Arial"/>
-          <w:b w:val="false"/>
-          <w:bCs w:val="false"/>
-          <w:i w:val="false"/>
-          <w:iCs w:val="false"/>
-          <w:sz w:val="21"/>
-          <w:szCs w:val="21"/>
-          <w:rtl/>
-        </w:rPr>
-        <w:t xml:space="preserve">ستُحفظ البيانات بشكل آمن للمدة التي تحددها لجان الأخلاقيات المعتمدة والسياسات المؤسسية، ثم تُتلف بشكل آمن.</w:t>
+        <w:t xml:space="preserve">لن تُتاح النصوص للعامة. ويمكن الحصول على مقتطفات خالية من المعلومات التعريفية من الباحثة المراسلة عند تقديم طلب معقول وبعد الحصول على موافقة أخلاقية.</w:t>
       </w:r>
     </w:p>
     <w:p>
@@ -6030,7 +5343,7 @@
           <w:szCs w:val="23"/>
           <w:rtl/>
         </w:rPr>
-        <w:t xml:space="preserve">9. ماذا سيحدث للنتائج؟</w:t>
+        <w:t xml:space="preserve">7. ماذا سيحدث للنتائج؟</w:t>
       </w:r>
     </w:p>
     <w:p>
@@ -6050,7 +5363,7 @@
           <w:szCs w:val="21"/>
           <w:rtl/>
         </w:rPr>
-        <w:t xml:space="preserve">ستُنشر النتائج في مجلات علمية وتُعرض في مؤتمرات، وقد تتضمن اقتباسات قصيرة من كلامكِ خالية من المعلومات التعريفية (مترجمة إلى الإنجليزية إذا كانت المقابلة بالعربية)، ولا يُشار إليها إلا برمزكِ الرقمي. لن تُستخدم الاقتباسات دون موافقتكِ أدناه.</w:t>
+        <w:t xml:space="preserve">ستُنشر النتائج، وقد تتضمن المنشورات اقتباسات من مقابلتكِ خالية من المعلومات التعريفية (مترجمة إلى الإنجليزية إذا كانت المقابلة بالعربية)، ولا يُشار إليها إلا برمزكِ الرقمي.</w:t>
       </w:r>
     </w:p>
     <w:p>
@@ -6071,7 +5384,7 @@
           <w:szCs w:val="23"/>
           <w:rtl/>
         </w:rPr>
-        <w:t xml:space="preserve">10. بمن يمكنني التواصل؟</w:t>
+        <w:t xml:space="preserve">8. للتواصل</w:t>
       </w:r>
     </w:p>
     <w:p>
@@ -6091,7 +5404,7 @@
           <w:szCs w:val="21"/>
           <w:rtl/>
         </w:rPr>
-        <w:t xml:space="preserve">للاستفسار عن الدراسة: Athar Odah Alshammari (الباحث الرئيس)، البريد الإلكتروني: athar.alshammari@uoh.edu.sa؛ أو Nada Alqarawi (الباحثة المراسلة)، البريد الإلكتروني: n.alqarawi@qu.edu.sa.</w:t>
+        <w:t xml:space="preserve">الباحث الرئيس: Athar Odah Alshammari، البريد الإلكتروني: athar.alshammari@uoh.edu.sa</w:t>
       </w:r>
     </w:p>
     <w:p>
@@ -6111,27 +5424,7 @@
           <w:szCs w:val="21"/>
           <w:rtl/>
         </w:rPr>
-        <w:t xml:space="preserve">للاستفسار عن حقوقكِ كمشاركة أو لتقديم شكوى: مجلس المراجعة المؤسسية بجامعة المجمعة، أو لجنة الأخلاقيات في التجمع الصحي التابعة له والمذكورة أعلاه.</w:t>
-      </w:r>
-    </w:p>
-    <w:p>
-      <w:pPr>
-        <w:bidi/>
-        <w:spacing w:after="100" w:before="0" w:line="276"/>
-        <w:jc w:val="right"/>
-      </w:pPr>
-      <w:r>
-        <w:rPr>
-          <w:rFonts w:ascii="Arial" w:cs="Arial" w:eastAsia="Arial" w:hAnsi="Arial"/>
-          <w:b w:val="false"/>
-          <w:bCs w:val="false"/>
-          <w:i/>
-          <w:iCs/>
-          <w:sz w:val="21"/>
-          <w:szCs w:val="21"/>
-          <w:rtl/>
-        </w:rPr>
-        <w:t xml:space="preserve">شكرًا لكِ على النظر في المشاركة في هذه الدراسة.</w:t>
+        <w:t xml:space="preserve">الباحثة المراسلة: Nada Alqarawi، البريد الإلكتروني: n.alqarawi@qu.edu.sa</w:t>
       </w:r>
     </w:p>
     <w:p>
@@ -6185,7 +5478,7 @@
     <w:p>
       <w:pPr>
         <w:bidi/>
-        <w:spacing w:after="140" w:before="0" w:line="276"/>
+        <w:spacing w:after="120" w:before="0" w:line="276"/>
         <w:jc w:val="center"/>
       </w:pPr>
       <w:r>
@@ -6199,7 +5492,7 @@
           <w:szCs w:val="20"/>
           <w:rtl/>
         </w:rPr>
-        <w:t xml:space="preserve">رمز المشاركة (يعبئه فريق البحث): P____        رمز المنطقة: ____</w:t>
+        <w:t xml:space="preserve">رمز المشاركة (يعبئه فريق البحث): P____</w:t>
       </w:r>
     </w:p>
     <w:p>
@@ -6436,7 +5729,7 @@
                 <w:szCs w:val="20"/>
                 <w:rtl/>
               </w:rPr>
-              <w:t xml:space="preserve">قرأتُ (أو قُرئت عليّ) ورقة معلومات المشاركة (الجزء أ) من هذه الوثيقة. وقد استلمتُها قبل المقابلة بما لا يقل عن 48 ساعة، وأُتيحت لي فرصة طرح الأسئلة، وتمت الإجابة عنها بشكل مُرضٍ.</w:t>
+              <w:t xml:space="preserve">استلمتُ ورقة معلومات المشاركة (الجزء أ) وقرأتُها قبل المقابلة بما لا يقل عن 48 ساعة.</w:t>
             </w:r>
           </w:p>
         </w:tc>
@@ -6540,7 +5833,7 @@
                 <w:szCs w:val="20"/>
                 <w:rtl/>
               </w:rPr>
-              <w:t xml:space="preserve">أؤكد أنني قابلة مسجلة ومصنفة لدى الهيئة السعودية للتخصصات الصحية، ولديّ خبرة لا تقل عن 12 شهرًا في الرعاية المباشرة للأمومة في خدمة مشاركة، وأكملتُ موسمًا حارًا واحدًا على الأقل في هذه المنطقة.</w:t>
+              <w:t xml:space="preserve">أؤكد أن لديّ تصنيفًا وتسجيلًا ساريين في القبالة من الهيئة السعودية للتخصصات الصحية، وخبرة لا تقل عن 12 شهرًا في الرعاية المباشرة للأمومة في خدمة مشاركة، وأنني أكملتُ موسمًا حارًا واحدًا على الأقل في المنطقة.</w:t>
             </w:r>
           </w:p>
         </w:tc>
@@ -6644,7 +5937,7 @@
                 <w:szCs w:val="20"/>
                 <w:rtl/>
               </w:rPr>
-              <w:t xml:space="preserve">أفهم أن مشاركتي تطوعية ولا علاقة لها بوظيفتي، وأن لي الحرية في الامتناع عن أي سؤال أو الانسحاب في أي وقت دون إبداء أسباب ودون أي أثر على عملي أو حقوقي النظامية.</w:t>
+              <w:t xml:space="preserve">أفهم أن مشاركتي تطوعية ولا علاقة لها بوظيفتي، وأن المديرين لن يعلموا بمشاركتي من عدمها.</w:t>
             </w:r>
           </w:p>
         </w:tc>
@@ -6748,7 +6041,7 @@
                 <w:szCs w:val="20"/>
                 <w:rtl/>
               </w:rPr>
-              <w:t xml:space="preserve">أفهم أن مديريّ لن يُبلَّغوا بمشاركتي من عدمها.</w:t>
+              <w:t xml:space="preserve">أوافق على المشاركة في مقابلة فردية لهذه الدراسة.</w:t>
             </w:r>
           </w:p>
         </w:tc>
@@ -6852,7 +6145,7 @@
                 <w:szCs w:val="20"/>
                 <w:rtl/>
               </w:rPr>
-              <w:t xml:space="preserve">أوافق على المشاركة في مقابلة فردية لهذه الدراسة.</w:t>
+              <w:t xml:space="preserve">أوافق على تسجيل المقابلة صوتيًا.</w:t>
             </w:r>
           </w:p>
         </w:tc>
@@ -6956,7 +6249,7 @@
                 <w:szCs w:val="20"/>
                 <w:rtl/>
               </w:rPr>
-              <w:t xml:space="preserve">أوافق على تسجيل المقابلة صوتيًا وتفريغها كتابيًا.</w:t>
+              <w:t xml:space="preserve">أوافق على نشر اقتباسات من مقابلتي خالية من المعلومات التعريفية.</w:t>
             </w:r>
           </w:p>
         </w:tc>
@@ -7060,111 +6353,7 @@
                 <w:szCs w:val="20"/>
                 <w:rtl/>
               </w:rPr>
-              <w:t xml:space="preserve">أوافق على استخدام اقتباسات قصيرة من مقابلتي خالية من المعلومات التعريفية (مترجمة إلى الإنجليزية عند الحاجة) في المنشورات والعروض العلمية، مع الإشارة إليها برمز رقمي فقط.</w:t>
-            </w:r>
-          </w:p>
-        </w:tc>
-        <w:tc>
-          <w:tcPr>
-            <w:tcW w:type="dxa" w:w="1300"/>
-            <w:tcBorders>
-              <w:top w:val="single" w:color="808080" w:sz="4"/>
-              <w:left w:val="single" w:color="808080" w:sz="4"/>
-              <w:bottom w:val="single" w:color="808080" w:sz="4"/>
-              <w:right w:val="single" w:color="808080" w:sz="4"/>
-            </w:tcBorders>
-            <w:tcMar>
-              <w:top w:type="dxa" w:w="30"/>
-              <w:left w:type="dxa" w:w="100"/>
-              <w:bottom w:type="dxa" w:w="30"/>
-              <w:right w:type="dxa" w:w="100"/>
-            </w:tcMar>
-          </w:tcPr>
-          <w:p>
-            <w:pPr>
-              <w:bidi/>
-              <w:spacing w:after="40" w:before="0" w:line="276"/>
-              <w:jc w:val="right"/>
-            </w:pPr>
-          </w:p>
-        </w:tc>
-      </w:tr>
-      <w:tr>
-        <w:trPr>
-          <w:cantSplit/>
-          <w:tblHeader w:val="false"/>
-        </w:trPr>
-        <w:tc>
-          <w:tcPr>
-            <w:tcW w:type="dxa" w:w="700"/>
-            <w:tcBorders>
-              <w:top w:val="single" w:color="808080" w:sz="4"/>
-              <w:left w:val="single" w:color="808080" w:sz="4"/>
-              <w:bottom w:val="single" w:color="808080" w:sz="4"/>
-              <w:right w:val="single" w:color="808080" w:sz="4"/>
-            </w:tcBorders>
-            <w:tcMar>
-              <w:top w:type="dxa" w:w="30"/>
-              <w:left w:type="dxa" w:w="100"/>
-              <w:bottom w:type="dxa" w:w="30"/>
-              <w:right w:type="dxa" w:w="100"/>
-            </w:tcMar>
-          </w:tcPr>
-          <w:p>
-            <w:pPr>
-              <w:bidi/>
-              <w:spacing w:after="40" w:before="0" w:line="276"/>
-              <w:jc w:val="right"/>
-            </w:pPr>
-            <w:r>
-              <w:rPr>
-                <w:rFonts w:ascii="Arial" w:cs="Arial" w:eastAsia="Arial" w:hAnsi="Arial"/>
-                <w:b w:val="false"/>
-                <w:bCs w:val="false"/>
-                <w:i w:val="false"/>
-                <w:iCs w:val="false"/>
-                <w:sz w:val="20"/>
-                <w:szCs w:val="20"/>
-                <w:rtl/>
-              </w:rPr>
-              <w:t xml:space="preserve">8</w:t>
-            </w:r>
-          </w:p>
-        </w:tc>
-        <w:tc>
-          <w:tcPr>
-            <w:tcW w:type="dxa" w:w="7638"/>
-            <w:tcBorders>
-              <w:top w:val="single" w:color="808080" w:sz="4"/>
-              <w:left w:val="single" w:color="808080" w:sz="4"/>
-              <w:bottom w:val="single" w:color="808080" w:sz="4"/>
-              <w:right w:val="single" w:color="808080" w:sz="4"/>
-            </w:tcBorders>
-            <w:tcMar>
-              <w:top w:type="dxa" w:w="30"/>
-              <w:left w:type="dxa" w:w="100"/>
-              <w:bottom w:type="dxa" w:w="30"/>
-              <w:right w:type="dxa" w:w="100"/>
-            </w:tcMar>
-          </w:tcPr>
-          <w:p>
-            <w:pPr>
-              <w:bidi/>
-              <w:spacing w:after="40" w:before="0" w:line="276"/>
-              <w:jc w:val="right"/>
-            </w:pPr>
-            <w:r>
-              <w:rPr>
-                <w:rFonts w:ascii="Arial" w:cs="Arial" w:eastAsia="Arial" w:hAnsi="Arial"/>
-                <w:b w:val="false"/>
-                <w:bCs w:val="false"/>
-                <w:i w:val="false"/>
-                <w:iCs w:val="false"/>
-                <w:sz w:val="20"/>
-                <w:szCs w:val="20"/>
-                <w:rtl/>
-              </w:rPr>
-              <w:t xml:space="preserve">أفهم أن معلوماتي ستُحفظ بشكل آمن وتُعامل بسرية كما هو موضح في ورقة المعلومات، وأن المقتطفات الخالية من المعلومات التعريفية قد تُشارَك مع باحثين آخرين فقط عند الطلب وبموافقة أخلاقية.</w:t>
+              <w:t xml:space="preserve">أفهم أن معلوماتي ستُحفظ وتُعالج كما هو موضح في ورقة معلومات المشاركة.</w:t>
             </w:r>
           </w:p>
         </w:tc>
@@ -7196,7 +6385,7 @@
     </w:tbl>
     <w:p>
       <w:pPr>
-        <w:spacing w:after="120"/>
+        <w:spacing w:after="100"/>
       </w:pPr>
     </w:p>
     <w:p>
@@ -7217,7 +6406,7 @@
           <w:szCs w:val="21"/>
           <w:rtl/>
         </w:rPr>
-        <w:t xml:space="preserve">بنود اختيارية (يُرجى وضع علامة في خانة واحدة لكل بند). لا تؤثر إجاباتكِ على مشاركتكِ.</w:t>
+        <w:t xml:space="preserve">يُرجى وضع علامة في خانة واحدة.</w:t>
       </w:r>
     </w:p>
     <w:tbl>
@@ -7436,7 +6625,7 @@
                 <w:szCs w:val="20"/>
                 <w:rtl/>
               </w:rPr>
-              <w:t xml:space="preserve">9</w:t>
+              <w:t xml:space="preserve">8</w:t>
             </w:r>
           </w:p>
         </w:tc>
@@ -7474,160 +6663,6 @@
                 <w:rtl/>
               </w:rPr>
               <w:t xml:space="preserve">أوافق على التواصل معي بشأن مقابلة متابعة محتملة.</w:t>
-            </w:r>
-          </w:p>
-        </w:tc>
-        <w:tc>
-          <w:tcPr>
-            <w:tcW w:type="dxa" w:w="650"/>
-            <w:tcBorders>
-              <w:top w:val="single" w:color="808080" w:sz="4"/>
-              <w:left w:val="single" w:color="808080" w:sz="4"/>
-              <w:bottom w:val="single" w:color="808080" w:sz="4"/>
-              <w:right w:val="single" w:color="808080" w:sz="4"/>
-            </w:tcBorders>
-            <w:tcMar>
-              <w:top w:type="dxa" w:w="30"/>
-              <w:left w:type="dxa" w:w="100"/>
-              <w:bottom w:type="dxa" w:w="30"/>
-              <w:right w:type="dxa" w:w="100"/>
-            </w:tcMar>
-          </w:tcPr>
-          <w:p>
-            <w:pPr>
-              <w:bidi/>
-              <w:spacing w:after="40" w:before="0" w:line="276"/>
-              <w:jc w:val="right"/>
-            </w:pPr>
-            <w:r>
-              <w:rPr>
-                <w:rFonts w:ascii="Arial" w:cs="Arial" w:eastAsia="Arial" w:hAnsi="Arial"/>
-                <w:b w:val="false"/>
-                <w:bCs w:val="false"/>
-                <w:i w:val="false"/>
-                <w:iCs w:val="false"/>
-                <w:sz w:val="20"/>
-                <w:szCs w:val="20"/>
-                <w:rtl/>
-              </w:rPr>
-              <w:t xml:space="preserve">☐</w:t>
-            </w:r>
-          </w:p>
-        </w:tc>
-        <w:tc>
-          <w:tcPr>
-            <w:tcW w:type="dxa" w:w="650"/>
-            <w:tcBorders>
-              <w:top w:val="single" w:color="808080" w:sz="4"/>
-              <w:left w:val="single" w:color="808080" w:sz="4"/>
-              <w:bottom w:val="single" w:color="808080" w:sz="4"/>
-              <w:right w:val="single" w:color="808080" w:sz="4"/>
-            </w:tcBorders>
-            <w:tcMar>
-              <w:top w:type="dxa" w:w="30"/>
-              <w:left w:type="dxa" w:w="100"/>
-              <w:bottom w:type="dxa" w:w="30"/>
-              <w:right w:type="dxa" w:w="100"/>
-            </w:tcMar>
-          </w:tcPr>
-          <w:p>
-            <w:pPr>
-              <w:bidi/>
-              <w:spacing w:after="40" w:before="0" w:line="276"/>
-              <w:jc w:val="right"/>
-            </w:pPr>
-            <w:r>
-              <w:rPr>
-                <w:rFonts w:ascii="Arial" w:cs="Arial" w:eastAsia="Arial" w:hAnsi="Arial"/>
-                <w:b w:val="false"/>
-                <w:bCs w:val="false"/>
-                <w:i w:val="false"/>
-                <w:iCs w:val="false"/>
-                <w:sz w:val="20"/>
-                <w:szCs w:val="20"/>
-                <w:rtl/>
-              </w:rPr>
-              <w:t xml:space="preserve">☐</w:t>
-            </w:r>
-          </w:p>
-        </w:tc>
-      </w:tr>
-      <w:tr>
-        <w:trPr>
-          <w:cantSplit/>
-          <w:tblHeader w:val="false"/>
-        </w:trPr>
-        <w:tc>
-          <w:tcPr>
-            <w:tcW w:type="dxa" w:w="700"/>
-            <w:tcBorders>
-              <w:top w:val="single" w:color="808080" w:sz="4"/>
-              <w:left w:val="single" w:color="808080" w:sz="4"/>
-              <w:bottom w:val="single" w:color="808080" w:sz="4"/>
-              <w:right w:val="single" w:color="808080" w:sz="4"/>
-            </w:tcBorders>
-            <w:tcMar>
-              <w:top w:type="dxa" w:w="30"/>
-              <w:left w:type="dxa" w:w="100"/>
-              <w:bottom w:type="dxa" w:w="30"/>
-              <w:right w:type="dxa" w:w="100"/>
-            </w:tcMar>
-          </w:tcPr>
-          <w:p>
-            <w:pPr>
-              <w:bidi/>
-              <w:spacing w:after="40" w:before="0" w:line="276"/>
-              <w:jc w:val="right"/>
-            </w:pPr>
-            <w:r>
-              <w:rPr>
-                <w:rFonts w:ascii="Arial" w:cs="Arial" w:eastAsia="Arial" w:hAnsi="Arial"/>
-                <w:b w:val="false"/>
-                <w:bCs w:val="false"/>
-                <w:i w:val="false"/>
-                <w:iCs w:val="false"/>
-                <w:sz w:val="20"/>
-                <w:szCs w:val="20"/>
-                <w:rtl/>
-              </w:rPr>
-              <w:t xml:space="preserve">10</w:t>
-            </w:r>
-          </w:p>
-        </w:tc>
-        <w:tc>
-          <w:tcPr>
-            <w:tcW w:type="dxa" w:w="7638"/>
-            <w:tcBorders>
-              <w:top w:val="single" w:color="808080" w:sz="4"/>
-              <w:left w:val="single" w:color="808080" w:sz="4"/>
-              <w:bottom w:val="single" w:color="808080" w:sz="4"/>
-              <w:right w:val="single" w:color="808080" w:sz="4"/>
-            </w:tcBorders>
-            <w:tcMar>
-              <w:top w:type="dxa" w:w="30"/>
-              <w:left w:type="dxa" w:w="100"/>
-              <w:bottom w:type="dxa" w:w="30"/>
-              <w:right w:type="dxa" w:w="100"/>
-            </w:tcMar>
-          </w:tcPr>
-          <w:p>
-            <w:pPr>
-              <w:bidi/>
-              <w:spacing w:after="40" w:before="0" w:line="276"/>
-              <w:jc w:val="right"/>
-            </w:pPr>
-            <w:r>
-              <w:rPr>
-                <w:rFonts w:ascii="Arial" w:cs="Arial" w:eastAsia="Arial" w:hAnsi="Arial"/>
-                <w:b w:val="false"/>
-                <w:bCs w:val="false"/>
-                <w:i w:val="false"/>
-                <w:iCs w:val="false"/>
-                <w:sz w:val="20"/>
-                <w:szCs w:val="20"/>
-                <w:rtl/>
-              </w:rPr>
-              <w:t xml:space="preserve">أرغب في تلقي ملخص للنتائج الأولية ودعوتي لإبداء ملاحظاتي عليه.</w:t>
             </w:r>
           </w:p>
         </w:tc>
@@ -7709,7 +6744,7 @@
     </w:tbl>
     <w:p>
       <w:pPr>
-        <w:spacing w:after="120"/>
+        <w:spacing w:after="100"/>
       </w:pPr>
     </w:p>
     <w:tbl>
@@ -7767,7 +6802,7 @@
                 <w:szCs w:val="20"/>
                 <w:rtl/>
               </w:rPr>
-              <w:t xml:space="preserve">لغة المقابلة المفضلة:</w:t>
+              <w:t xml:space="preserve">لغة المقابلة:</w:t>
             </w:r>
           </w:p>
         </w:tc>
@@ -7847,7 +6882,7 @@
                 <w:szCs w:val="20"/>
                 <w:rtl/>
               </w:rPr>
-              <w:t xml:space="preserve">طريقة المقابلة المفضلة:</w:t>
+              <w:t xml:space="preserve">طريقة المقابلة:</w:t>
             </w:r>
           </w:p>
         </w:tc>
@@ -7927,7 +6962,7 @@
                 <w:szCs w:val="20"/>
                 <w:rtl/>
               </w:rPr>
-              <w:t xml:space="preserve">وسيلة التواصل المفضلة (للمتابعة أو الملخص فقط):</w:t>
+              <w:t xml:space="preserve">وسيلة التواصل للمتابعة والملخص:</w:t>
             </w:r>
           </w:p>
         </w:tc>
@@ -7972,7 +7007,7 @@
     </w:tbl>
     <w:p>
       <w:pPr>
-        <w:spacing w:after="160"/>
+        <w:spacing w:after="140"/>
       </w:pPr>
     </w:p>
     <w:tbl>
@@ -8181,6 +7216,26 @@
               <w:t xml:space="preserve">المشاركة</w:t>
             </w:r>
           </w:p>
+          <w:p>
+            <w:pPr>
+              <w:bidi/>
+              <w:spacing w:after="40" w:before="0" w:line="276"/>
+              <w:jc w:val="right"/>
+            </w:pPr>
+            <w:r>
+              <w:rPr>
+                <w:rFonts w:ascii="Arial" w:cs="Arial" w:eastAsia="Arial" w:hAnsi="Arial"/>
+                <w:b w:val="false"/>
+                <w:bCs w:val="false"/>
+                <w:i w:val="false"/>
+                <w:iCs w:val="false"/>
+                <w:sz w:val="20"/>
+                <w:szCs w:val="20"/>
+                <w:rtl/>
+              </w:rPr>
+              <w:t xml:space="preserve"> </w:t>
+            </w:r>
+          </w:p>
         </w:tc>
         <w:tc>
           <w:tcPr>
@@ -8296,6 +7351,26 @@
               <w:t xml:space="preserve">الباحثة التي حصلت على الموافقة</w:t>
             </w:r>
           </w:p>
+          <w:p>
+            <w:pPr>
+              <w:bidi/>
+              <w:spacing w:after="40" w:before="0" w:line="276"/>
+              <w:jc w:val="right"/>
+            </w:pPr>
+            <w:r>
+              <w:rPr>
+                <w:rFonts w:ascii="Arial" w:cs="Arial" w:eastAsia="Arial" w:hAnsi="Arial"/>
+                <w:b w:val="false"/>
+                <w:bCs w:val="false"/>
+                <w:i w:val="false"/>
+                <w:iCs w:val="false"/>
+                <w:sz w:val="20"/>
+                <w:szCs w:val="20"/>
+                <w:rtl/>
+              </w:rPr>
+              <w:t xml:space="preserve"> </w:t>
+            </w:r>
+          </w:p>
         </w:tc>
         <w:tc>
           <w:tcPr>
@@ -8371,31 +7446,6 @@
         </w:tc>
       </w:tr>
     </w:tbl>
-    <w:p>
-      <w:pPr>
-        <w:spacing w:after="80"/>
-      </w:pPr>
-    </w:p>
-    <w:p>
-      <w:pPr>
-        <w:bidi/>
-        <w:spacing w:after="100" w:before="0" w:line="276"/>
-        <w:jc w:val="right"/>
-      </w:pPr>
-      <w:r>
-        <w:rPr>
-          <w:rFonts w:ascii="Arial" w:cs="Arial" w:eastAsia="Arial" w:hAnsi="Arial"/>
-          <w:b w:val="false"/>
-          <w:bCs w:val="false"/>
-          <w:i/>
-          <w:iCs/>
-          <w:sz w:val="19"/>
-          <w:szCs w:val="19"/>
-          <w:rtl/>
-        </w:rPr>
-        <w:t xml:space="preserve">للمقابلات عبر الاتصال المرئي: تُعاد نسخة نموذج الموافقة الموقَّع إلى فريق البحث قبل بدء المقابلة.</w:t>
-      </w:r>
-    </w:p>
     <w:sectPr>
       <w:footerReference w:type="default" r:id="rId8"/>
       <w:pgSz w:w="11906" w:h="16838" w:orient="portrait"/>

</xml_diff>